<commit_message>
Add diagrams and update SmartMed Report.docx with new visuals
- Introduced new PNG diagrams: Architecture, Use Case, ER, Class, and Sequence.
- Updated SmartMed Report.docx to include captions for the new diagrams, enhancing documentation clarity.
- Added a script to automate the export and insertion of diagrams into the report, streamlining the documentation process.
</commit_message>
<xml_diff>
--- a/Docs/Report/SmartMed Report.docx
+++ b/Docs/Report/SmartMed Report.docx
@@ -1491,6 +1491,58 @@
     </w:p>
     <w:p>
       <w:pPr>
+        <w:jc w:val="center"/>
+      </w:pPr>
+      <w:r>
+        <w:drawing>
+          <wp:inline xmlns:a="http://schemas.openxmlformats.org/drawingml/2006/main" xmlns:pic="http://schemas.openxmlformats.org/drawingml/2006/picture">
+            <wp:extent cx="5486400" cy="11484864"/>
+            <wp:docPr id="1768847204" name="Picture 1768847204"/>
+            <wp:cNvGraphicFramePr>
+              <a:graphicFrameLocks noChangeAspect="1"/>
+            </wp:cNvGraphicFramePr>
+            <a:graphic>
+              <a:graphicData uri="http://schemas.openxmlformats.org/drawingml/2006/picture">
+                <pic:pic>
+                  <pic:nvPicPr>
+                    <pic:cNvPr id="0" name="Architecture.png"/>
+                    <pic:cNvPicPr/>
+                  </pic:nvPicPr>
+                  <pic:blipFill>
+                    <a:blip r:embed="rId13"/>
+                    <a:stretch>
+                      <a:fillRect/>
+                    </a:stretch>
+                  </pic:blipFill>
+                  <pic:spPr>
+                    <a:xfrm>
+                      <a:off x="0" y="0"/>
+                      <a:ext cx="5486400" cy="11484864"/>
+                    </a:xfrm>
+                    <a:prstGeom prst="rect"/>
+                  </pic:spPr>
+                </pic:pic>
+              </a:graphicData>
+            </a:graphic>
+          </wp:inline>
+        </w:drawing>
+      </w:r>
+    </w:p>
+    <w:p>
+      <w:pPr>
+        <w:jc w:val="center"/>
+      </w:pPr>
+      <w:r>
+        <w:rPr>
+          <w:rFonts w:ascii="Times New Roman" w:hAnsi="Times New Roman"/>
+          <w:i/>
+          <w:sz w:val="20"/>
+        </w:rPr>
+        <w:t>Figure: Architecture Diagram</w:t>
+      </w:r>
+    </w:p>
+    <w:p>
+      <w:pPr>
         <w:pStyle w:val="BodyText"/>
         <w:spacing w:line="360" w:lineRule="auto"/>
       </w:pPr>
@@ -1577,6 +1629,58 @@
     </w:p>
     <w:p>
       <w:pPr>
+        <w:jc w:val="center"/>
+      </w:pPr>
+      <w:r>
+        <w:drawing>
+          <wp:inline xmlns:a="http://schemas.openxmlformats.org/drawingml/2006/main" xmlns:pic="http://schemas.openxmlformats.org/drawingml/2006/picture">
+            <wp:extent cx="5486400" cy="5132832"/>
+            <wp:docPr id="1768847205" name="Picture 1768847205"/>
+            <wp:cNvGraphicFramePr>
+              <a:graphicFrameLocks noChangeAspect="1"/>
+            </wp:cNvGraphicFramePr>
+            <a:graphic>
+              <a:graphicData uri="http://schemas.openxmlformats.org/drawingml/2006/picture">
+                <pic:pic>
+                  <pic:nvPicPr>
+                    <pic:cNvPr id="0" name="UseCase.png"/>
+                    <pic:cNvPicPr/>
+                  </pic:nvPicPr>
+                  <pic:blipFill>
+                    <a:blip r:embed="rId14"/>
+                    <a:stretch>
+                      <a:fillRect/>
+                    </a:stretch>
+                  </pic:blipFill>
+                  <pic:spPr>
+                    <a:xfrm>
+                      <a:off x="0" y="0"/>
+                      <a:ext cx="5486400" cy="5132832"/>
+                    </a:xfrm>
+                    <a:prstGeom prst="rect"/>
+                  </pic:spPr>
+                </pic:pic>
+              </a:graphicData>
+            </a:graphic>
+          </wp:inline>
+        </w:drawing>
+      </w:r>
+    </w:p>
+    <w:p>
+      <w:pPr>
+        <w:jc w:val="center"/>
+      </w:pPr>
+      <w:r>
+        <w:rPr>
+          <w:rFonts w:ascii="Times New Roman" w:hAnsi="Times New Roman"/>
+          <w:i/>
+          <w:sz w:val="20"/>
+        </w:rPr>
+        <w:t>Figure: Use Case Diagram</w:t>
+      </w:r>
+    </w:p>
+    <w:p>
+      <w:pPr>
         <w:pStyle w:val="BodyText"/>
         <w:spacing w:line="360" w:lineRule="auto"/>
       </w:pPr>
@@ -1637,6 +1741,58 @@
     </w:p>
     <w:p>
       <w:pPr>
+        <w:jc w:val="center"/>
+      </w:pPr>
+      <w:r>
+        <w:drawing>
+          <wp:inline xmlns:a="http://schemas.openxmlformats.org/drawingml/2006/main" xmlns:pic="http://schemas.openxmlformats.org/drawingml/2006/picture">
+            <wp:extent cx="5486400" cy="6565392"/>
+            <wp:docPr id="1768847206" name="Picture 1768847206"/>
+            <wp:cNvGraphicFramePr>
+              <a:graphicFrameLocks noChangeAspect="1"/>
+            </wp:cNvGraphicFramePr>
+            <a:graphic>
+              <a:graphicData uri="http://schemas.openxmlformats.org/drawingml/2006/picture">
+                <pic:pic>
+                  <pic:nvPicPr>
+                    <pic:cNvPr id="0" name="ER.png"/>
+                    <pic:cNvPicPr/>
+                  </pic:nvPicPr>
+                  <pic:blipFill>
+                    <a:blip r:embed="rId15"/>
+                    <a:stretch>
+                      <a:fillRect/>
+                    </a:stretch>
+                  </pic:blipFill>
+                  <pic:spPr>
+                    <a:xfrm>
+                      <a:off x="0" y="0"/>
+                      <a:ext cx="5486400" cy="6565392"/>
+                    </a:xfrm>
+                    <a:prstGeom prst="rect"/>
+                  </pic:spPr>
+                </pic:pic>
+              </a:graphicData>
+            </a:graphic>
+          </wp:inline>
+        </w:drawing>
+      </w:r>
+    </w:p>
+    <w:p>
+      <w:pPr>
+        <w:jc w:val="center"/>
+      </w:pPr>
+      <w:r>
+        <w:rPr>
+          <w:rFonts w:ascii="Times New Roman" w:hAnsi="Times New Roman"/>
+          <w:i/>
+          <w:sz w:val="20"/>
+        </w:rPr>
+        <w:t>Figure: ER Diagram</w:t>
+      </w:r>
+    </w:p>
+    <w:p>
+      <w:pPr>
         <w:pStyle w:val="BodyText"/>
         <w:spacing w:line="360" w:lineRule="auto"/>
       </w:pPr>
@@ -1671,6 +1827,58 @@
     </w:p>
     <w:p>
       <w:pPr>
+        <w:jc w:val="center"/>
+      </w:pPr>
+      <w:r>
+        <w:drawing>
+          <wp:inline xmlns:a="http://schemas.openxmlformats.org/drawingml/2006/main" xmlns:pic="http://schemas.openxmlformats.org/drawingml/2006/picture">
+            <wp:extent cx="5486400" cy="3846576"/>
+            <wp:docPr id="1768847207" name="Picture 1768847207"/>
+            <wp:cNvGraphicFramePr>
+              <a:graphicFrameLocks noChangeAspect="1"/>
+            </wp:cNvGraphicFramePr>
+            <a:graphic>
+              <a:graphicData uri="http://schemas.openxmlformats.org/drawingml/2006/picture">
+                <pic:pic>
+                  <pic:nvPicPr>
+                    <pic:cNvPr id="0" name="Class.png"/>
+                    <pic:cNvPicPr/>
+                  </pic:nvPicPr>
+                  <pic:blipFill>
+                    <a:blip r:embed="rId16"/>
+                    <a:stretch>
+                      <a:fillRect/>
+                    </a:stretch>
+                  </pic:blipFill>
+                  <pic:spPr>
+                    <a:xfrm>
+                      <a:off x="0" y="0"/>
+                      <a:ext cx="5486400" cy="3846576"/>
+                    </a:xfrm>
+                    <a:prstGeom prst="rect"/>
+                  </pic:spPr>
+                </pic:pic>
+              </a:graphicData>
+            </a:graphic>
+          </wp:inline>
+        </w:drawing>
+      </w:r>
+    </w:p>
+    <w:p>
+      <w:pPr>
+        <w:jc w:val="center"/>
+      </w:pPr>
+      <w:r>
+        <w:rPr>
+          <w:rFonts w:ascii="Times New Roman" w:hAnsi="Times New Roman"/>
+          <w:i/>
+          <w:sz w:val="20"/>
+        </w:rPr>
+        <w:t>Figure: Class Diagram</w:t>
+      </w:r>
+    </w:p>
+    <w:p>
+      <w:pPr>
         <w:pStyle w:val="BodyText"/>
         <w:spacing w:line="360" w:lineRule="auto"/>
       </w:pPr>
@@ -1705,14 +1913,66 @@
     </w:p>
     <w:p>
       <w:pPr>
-        <w:pStyle w:val="Heading2"/>
-      </w:pPr>
-      <w:r>
-        <w:t>Database Design</w:t>
+        <w:jc w:val="center"/>
+      </w:pPr>
+      <w:r>
+        <w:drawing>
+          <wp:inline xmlns:a="http://schemas.openxmlformats.org/drawingml/2006/main" xmlns:pic="http://schemas.openxmlformats.org/drawingml/2006/picture">
+            <wp:extent cx="5486400" cy="4248912"/>
+            <wp:docPr id="1768847208" name="Picture 1768847208"/>
+            <wp:cNvGraphicFramePr>
+              <a:graphicFrameLocks noChangeAspect="1"/>
+            </wp:cNvGraphicFramePr>
+            <a:graphic>
+              <a:graphicData uri="http://schemas.openxmlformats.org/drawingml/2006/picture">
+                <pic:pic>
+                  <pic:nvPicPr>
+                    <pic:cNvPr id="0" name="Sequence.png"/>
+                    <pic:cNvPicPr/>
+                  </pic:nvPicPr>
+                  <pic:blipFill>
+                    <a:blip r:embed="rId17"/>
+                    <a:stretch>
+                      <a:fillRect/>
+                    </a:stretch>
+                  </pic:blipFill>
+                  <pic:spPr>
+                    <a:xfrm>
+                      <a:off x="0" y="0"/>
+                      <a:ext cx="5486400" cy="4248912"/>
+                    </a:xfrm>
+                    <a:prstGeom prst="rect"/>
+                  </pic:spPr>
+                </pic:pic>
+              </a:graphicData>
+            </a:graphic>
+          </wp:inline>
+        </w:drawing>
       </w:r>
     </w:p>
     <w:p>
       <w:pPr>
+        <w:jc w:val="center"/>
+      </w:pPr>
+      <w:r>
+        <w:rPr>
+          <w:rFonts w:ascii="Times New Roman" w:hAnsi="Times New Roman"/>
+          <w:i/>
+          <w:sz w:val="20"/>
+        </w:rPr>
+        <w:t>Figure: Sequence Diagram</w:t>
+      </w:r>
+    </w:p>
+    <w:p>
+      <w:pPr>
+        <w:pStyle w:val="Heading2"/>
+      </w:pPr>
+      <w:r>
+        <w:t>Database Design</w:t>
+      </w:r>
+    </w:p>
+    <w:p>
+      <w:pPr>
         <w:pStyle w:val="BodyText"/>
         <w:spacing w:line="360" w:lineRule="auto"/>
       </w:pPr>
@@ -1722,6 +1982,58 @@
           <w:sz w:val="24"/>
         </w:rPr>
         <w:t>Database SmartMedDB contains tables Admin, Customer, Medicine, Order, OrderItem, and Prescription. Seed data includes a default admin (admin / admin123) and sample customers and medicines. Order.Status is limited to Pending, Ready for Pickup, or Delivered. OrderItem stores quantity, unit price, and subtotal at order time.</w:t>
+      </w:r>
+    </w:p>
+    <w:p>
+      <w:pPr>
+        <w:jc w:val="center"/>
+      </w:pPr>
+      <w:r>
+        <w:drawing>
+          <wp:inline xmlns:a="http://schemas.openxmlformats.org/drawingml/2006/main" xmlns:pic="http://schemas.openxmlformats.org/drawingml/2006/picture">
+            <wp:extent cx="5486400" cy="6565392"/>
+            <wp:docPr id="1768847209" name="Picture 1768847209"/>
+            <wp:cNvGraphicFramePr>
+              <a:graphicFrameLocks noChangeAspect="1"/>
+            </wp:cNvGraphicFramePr>
+            <a:graphic>
+              <a:graphicData uri="http://schemas.openxmlformats.org/drawingml/2006/picture">
+                <pic:pic>
+                  <pic:nvPicPr>
+                    <pic:cNvPr id="0" name="ER.png"/>
+                    <pic:cNvPicPr/>
+                  </pic:nvPicPr>
+                  <pic:blipFill>
+                    <a:blip r:embed="rId15"/>
+                    <a:stretch>
+                      <a:fillRect/>
+                    </a:stretch>
+                  </pic:blipFill>
+                  <pic:spPr>
+                    <a:xfrm>
+                      <a:off x="0" y="0"/>
+                      <a:ext cx="5486400" cy="6565392"/>
+                    </a:xfrm>
+                    <a:prstGeom prst="rect"/>
+                  </pic:spPr>
+                </pic:pic>
+              </a:graphicData>
+            </a:graphic>
+          </wp:inline>
+        </w:drawing>
+      </w:r>
+    </w:p>
+    <w:p>
+      <w:pPr>
+        <w:jc w:val="center"/>
+      </w:pPr>
+      <w:r>
+        <w:rPr>
+          <w:rFonts w:ascii="Times New Roman" w:hAnsi="Times New Roman"/>
+          <w:i/>
+          <w:sz w:val="20"/>
+        </w:rPr>
+        <w:t>Figure: Database Design</w:t>
       </w:r>
     </w:p>
     <w:p>
@@ -2130,93 +2442,314 @@
     </w:p>
     <w:p>
       <w:pPr>
-        <w:pStyle w:val="BodyText"/>
-        <w:spacing w:line="360" w:lineRule="auto"/>
+        <w:jc w:val="center"/>
       </w:pPr>
       <w:r>
         <w:rPr>
           <w:rFonts w:ascii="Times New Roman" w:hAnsi="Times New Roman"/>
-          <w:sz w:val="24"/>
-        </w:rPr>
-        <w:t>[Insert screenshot: Login form — role selection, username/email, password.]</w:t>
+          <w:b/>
+          <w:sz w:val="22"/>
+        </w:rPr>
+        <w:t>Login screen</w:t>
       </w:r>
     </w:p>
     <w:p>
       <w:pPr>
-        <w:pStyle w:val="BodyText"/>
-        <w:spacing w:line="360" w:lineRule="auto"/>
-      </w:pPr>
-      <w:r>
-        <w:rPr>
-          <w:rFonts w:ascii="Times New Roman" w:hAnsi="Times New Roman"/>
-          <w:sz w:val="24"/>
-        </w:rPr>
-        <w:t>[Insert screenshot: Admin Dashboard — statistics cards, recent activity, alerts.]</w:t>
+        <w:jc w:val="center"/>
+      </w:pPr>
+      <w:r>
+        <w:drawing>
+          <wp:inline xmlns:a="http://schemas.openxmlformats.org/drawingml/2006/main" xmlns:pic="http://schemas.openxmlformats.org/drawingml/2006/picture">
+            <wp:extent cx="5029200" cy="4037112"/>
+            <wp:docPr id="1768847210" name="Picture 1768847210"/>
+            <wp:cNvGraphicFramePr>
+              <a:graphicFrameLocks noChangeAspect="1"/>
+            </wp:cNvGraphicFramePr>
+            <a:graphic>
+              <a:graphicData uri="http://schemas.openxmlformats.org/drawingml/2006/picture">
+                <pic:pic>
+                  <pic:nvPicPr>
+                    <pic:cNvPr id="0" name="screen.png"/>
+                    <pic:cNvPicPr/>
+                  </pic:nvPicPr>
+                  <pic:blipFill>
+                    <a:blip r:embed="rId18"/>
+                    <a:stretch>
+                      <a:fillRect/>
+                    </a:stretch>
+                  </pic:blipFill>
+                  <pic:spPr>
+                    <a:xfrm>
+                      <a:off x="0" y="0"/>
+                      <a:ext cx="5029200" cy="4037112"/>
+                    </a:xfrm>
+                    <a:prstGeom prst="rect"/>
+                  </pic:spPr>
+                </pic:pic>
+              </a:graphicData>
+            </a:graphic>
+          </wp:inline>
+        </w:drawing>
       </w:r>
     </w:p>
     <w:p>
       <w:pPr>
-        <w:pStyle w:val="BodyText"/>
-        <w:spacing w:line="360" w:lineRule="auto"/>
+        <w:jc w:val="center"/>
       </w:pPr>
       <w:r>
         <w:rPr>
           <w:rFonts w:ascii="Times New Roman" w:hAnsi="Times New Roman"/>
-          <w:sz w:val="24"/>
-        </w:rPr>
-        <w:t>[Insert screenshot: Manage Medicines — grid, add/update/delete form, stat tiles.]</w:t>
+          <w:b/>
+          <w:sz w:val="22"/>
+        </w:rPr>
+        <w:t>Admin dashboard</w:t>
       </w:r>
     </w:p>
     <w:p>
       <w:pPr>
-        <w:pStyle w:val="BodyText"/>
-        <w:spacing w:line="360" w:lineRule="auto"/>
-      </w:pPr>
-      <w:r>
-        <w:rPr>
-          <w:rFonts w:ascii="Times New Roman" w:hAnsi="Times New Roman"/>
-          <w:sz w:val="24"/>
-        </w:rPr>
-        <w:t>[Insert screenshot: Manage Customers — customer grid and edit panel.]</w:t>
+        <w:jc w:val="center"/>
+      </w:pPr>
+      <w:r>
+        <w:drawing>
+          <wp:inline xmlns:a="http://schemas.openxmlformats.org/drawingml/2006/main" xmlns:pic="http://schemas.openxmlformats.org/drawingml/2006/picture">
+            <wp:extent cx="5029200" cy="4027289"/>
+            <wp:docPr id="1768847211" name="Picture 1768847211"/>
+            <wp:cNvGraphicFramePr>
+              <a:graphicFrameLocks noChangeAspect="1"/>
+            </wp:cNvGraphicFramePr>
+            <a:graphic>
+              <a:graphicData uri="http://schemas.openxmlformats.org/drawingml/2006/picture">
+                <pic:pic>
+                  <pic:nvPicPr>
+                    <pic:cNvPr id="0" name="screen.png"/>
+                    <pic:cNvPicPr/>
+                  </pic:nvPicPr>
+                  <pic:blipFill>
+                    <a:blip r:embed="rId19"/>
+                    <a:stretch>
+                      <a:fillRect/>
+                    </a:stretch>
+                  </pic:blipFill>
+                  <pic:spPr>
+                    <a:xfrm>
+                      <a:off x="0" y="0"/>
+                      <a:ext cx="5029200" cy="4027289"/>
+                    </a:xfrm>
+                    <a:prstGeom prst="rect"/>
+                  </pic:spPr>
+                </pic:pic>
+              </a:graphicData>
+            </a:graphic>
+          </wp:inline>
+        </w:drawing>
       </w:r>
     </w:p>
     <w:p>
       <w:pPr>
-        <w:pStyle w:val="BodyText"/>
-        <w:spacing w:line="360" w:lineRule="auto"/>
+        <w:jc w:val="center"/>
       </w:pPr>
       <w:r>
         <w:rPr>
           <w:rFonts w:ascii="Times New Roman" w:hAnsi="Times New Roman"/>
-          <w:sz w:val="24"/>
-        </w:rPr>
-        <w:t>[Insert screenshot: Manage Orders — order list and status update.]</w:t>
+          <w:b/>
+          <w:sz w:val="22"/>
+        </w:rPr>
+        <w:t>Manage medicines</w:t>
       </w:r>
     </w:p>
     <w:p>
       <w:pPr>
-        <w:pStyle w:val="BodyText"/>
-        <w:spacing w:line="360" w:lineRule="auto"/>
-      </w:pPr>
-      <w:r>
-        <w:rPr>
-          <w:rFonts w:ascii="Times New Roman" w:hAnsi="Times New Roman"/>
-          <w:sz w:val="24"/>
-        </w:rPr>
-        <w:t>[Insert screenshot: Generate Reports — sales/stock/history tabs.]</w:t>
+        <w:jc w:val="center"/>
+      </w:pPr>
+      <w:r>
+        <w:drawing>
+          <wp:inline xmlns:a="http://schemas.openxmlformats.org/drawingml/2006/main" xmlns:pic="http://schemas.openxmlformats.org/drawingml/2006/picture">
+            <wp:extent cx="5029200" cy="4027289"/>
+            <wp:docPr id="1768847212" name="Picture 1768847212"/>
+            <wp:cNvGraphicFramePr>
+              <a:graphicFrameLocks noChangeAspect="1"/>
+            </wp:cNvGraphicFramePr>
+            <a:graphic>
+              <a:graphicData uri="http://schemas.openxmlformats.org/drawingml/2006/picture">
+                <pic:pic>
+                  <pic:nvPicPr>
+                    <pic:cNvPr id="0" name="screen.png"/>
+                    <pic:cNvPicPr/>
+                  </pic:nvPicPr>
+                  <pic:blipFill>
+                    <a:blip r:embed="rId20"/>
+                    <a:stretch>
+                      <a:fillRect/>
+                    </a:stretch>
+                  </pic:blipFill>
+                  <pic:spPr>
+                    <a:xfrm>
+                      <a:off x="0" y="0"/>
+                      <a:ext cx="5029200" cy="4027289"/>
+                    </a:xfrm>
+                    <a:prstGeom prst="rect"/>
+                  </pic:spPr>
+                </pic:pic>
+              </a:graphicData>
+            </a:graphic>
+          </wp:inline>
+        </w:drawing>
       </w:r>
     </w:p>
     <w:p>
       <w:pPr>
-        <w:pStyle w:val="BodyText"/>
-        <w:spacing w:line="360" w:lineRule="auto"/>
+        <w:jc w:val="center"/>
       </w:pPr>
       <w:r>
         <w:rPr>
           <w:rFonts w:ascii="Times New Roman" w:hAnsi="Times New Roman"/>
-          <w:sz w:val="24"/>
-        </w:rPr>
-        <w:t>Design mock PNG files are available under Docs/DesignMocks/ for reference when capturing screenshots.</w:t>
+          <w:b/>
+          <w:sz w:val="22"/>
+        </w:rPr>
+        <w:t>Manage customers</w:t>
+      </w:r>
+    </w:p>
+    <w:p>
+      <w:pPr>
+        <w:jc w:val="center"/>
+      </w:pPr>
+      <w:r>
+        <w:drawing>
+          <wp:inline xmlns:a="http://schemas.openxmlformats.org/drawingml/2006/main" xmlns:pic="http://schemas.openxmlformats.org/drawingml/2006/picture">
+            <wp:extent cx="5029200" cy="4027289"/>
+            <wp:docPr id="1768847213" name="Picture 1768847213"/>
+            <wp:cNvGraphicFramePr>
+              <a:graphicFrameLocks noChangeAspect="1"/>
+            </wp:cNvGraphicFramePr>
+            <a:graphic>
+              <a:graphicData uri="http://schemas.openxmlformats.org/drawingml/2006/picture">
+                <pic:pic>
+                  <pic:nvPicPr>
+                    <pic:cNvPr id="0" name="screen.png"/>
+                    <pic:cNvPicPr/>
+                  </pic:nvPicPr>
+                  <pic:blipFill>
+                    <a:blip r:embed="rId21"/>
+                    <a:stretch>
+                      <a:fillRect/>
+                    </a:stretch>
+                  </pic:blipFill>
+                  <pic:spPr>
+                    <a:xfrm>
+                      <a:off x="0" y="0"/>
+                      <a:ext cx="5029200" cy="4027289"/>
+                    </a:xfrm>
+                    <a:prstGeom prst="rect"/>
+                  </pic:spPr>
+                </pic:pic>
+              </a:graphicData>
+            </a:graphic>
+          </wp:inline>
+        </w:drawing>
+      </w:r>
+    </w:p>
+    <w:p>
+      <w:pPr>
+        <w:jc w:val="center"/>
+      </w:pPr>
+      <w:r>
+        <w:rPr>
+          <w:rFonts w:ascii="Times New Roman" w:hAnsi="Times New Roman"/>
+          <w:b/>
+          <w:sz w:val="22"/>
+        </w:rPr>
+        <w:t>Manage orders</w:t>
+      </w:r>
+    </w:p>
+    <w:p>
+      <w:pPr>
+        <w:jc w:val="center"/>
+      </w:pPr>
+      <w:r>
+        <w:drawing>
+          <wp:inline xmlns:a="http://schemas.openxmlformats.org/drawingml/2006/main" xmlns:pic="http://schemas.openxmlformats.org/drawingml/2006/picture">
+            <wp:extent cx="5029200" cy="4243388"/>
+            <wp:docPr id="1768847214" name="Picture 1768847214"/>
+            <wp:cNvGraphicFramePr>
+              <a:graphicFrameLocks noChangeAspect="1"/>
+            </wp:cNvGraphicFramePr>
+            <a:graphic>
+              <a:graphicData uri="http://schemas.openxmlformats.org/drawingml/2006/picture">
+                <pic:pic>
+                  <pic:nvPicPr>
+                    <pic:cNvPr id="0" name="screen.png"/>
+                    <pic:cNvPicPr/>
+                  </pic:nvPicPr>
+                  <pic:blipFill>
+                    <a:blip r:embed="rId22"/>
+                    <a:stretch>
+                      <a:fillRect/>
+                    </a:stretch>
+                  </pic:blipFill>
+                  <pic:spPr>
+                    <a:xfrm>
+                      <a:off x="0" y="0"/>
+                      <a:ext cx="5029200" cy="4243388"/>
+                    </a:xfrm>
+                    <a:prstGeom prst="rect"/>
+                  </pic:spPr>
+                </pic:pic>
+              </a:graphicData>
+            </a:graphic>
+          </wp:inline>
+        </w:drawing>
+      </w:r>
+    </w:p>
+    <w:p>
+      <w:pPr>
+        <w:jc w:val="center"/>
+      </w:pPr>
+      <w:r>
+        <w:rPr>
+          <w:rFonts w:ascii="Times New Roman" w:hAnsi="Times New Roman"/>
+          <w:b/>
+          <w:sz w:val="22"/>
+        </w:rPr>
+        <w:t>Generate reports</w:t>
+      </w:r>
+    </w:p>
+    <w:p>
+      <w:pPr>
+        <w:jc w:val="center"/>
+      </w:pPr>
+      <w:r>
+        <w:drawing>
+          <wp:inline xmlns:a="http://schemas.openxmlformats.org/drawingml/2006/main" xmlns:pic="http://schemas.openxmlformats.org/drawingml/2006/picture">
+            <wp:extent cx="5029200" cy="4027289"/>
+            <wp:docPr id="1768847215" name="Picture 1768847215"/>
+            <wp:cNvGraphicFramePr>
+              <a:graphicFrameLocks noChangeAspect="1"/>
+            </wp:cNvGraphicFramePr>
+            <a:graphic>
+              <a:graphicData uri="http://schemas.openxmlformats.org/drawingml/2006/picture">
+                <pic:pic>
+                  <pic:nvPicPr>
+                    <pic:cNvPr id="0" name="screen.png"/>
+                    <pic:cNvPicPr/>
+                  </pic:nvPicPr>
+                  <pic:blipFill>
+                    <a:blip r:embed="rId23"/>
+                    <a:stretch>
+                      <a:fillRect/>
+                    </a:stretch>
+                  </pic:blipFill>
+                  <pic:spPr>
+                    <a:xfrm>
+                      <a:off x="0" y="0"/>
+                      <a:ext cx="5029200" cy="4027289"/>
+                    </a:xfrm>
+                    <a:prstGeom prst="rect"/>
+                  </pic:spPr>
+                </pic:pic>
+              </a:graphicData>
+            </a:graphic>
+          </wp:inline>
+        </w:drawing>
       </w:r>
     </w:p>
     <w:p>

</xml_diff>

<commit_message>
Update SmartMed Report.docx and scripts to enhance functional requirements section
- Revised the functional requirements in SmartMed Report.docx for clarity and organization, separating admin and customer features, and adding additional functionalities.
- Implemented a new script to automate the update of the functional requirements section in the report, ensuring consistency and ease of maintenance.
</commit_message>
<xml_diff>
--- a/Docs/Report/SmartMed Report.docx
+++ b/Docs/Report/SmartMed Report.docx
@@ -1314,19 +1314,19 @@
           <w:rFonts w:ascii="Times New Roman" w:hAnsi="Times New Roman"/>
           <w:sz w:val="24"/>
         </w:rPr>
-        <w:t>Admin features implemented:</w:t>
+        <w:t>Admin Features</w:t>
         <w:br/>
-        <w:t>• Secure admin login (username and password validated against the Admin table).</w:t>
+        <w:t>• Login – Secure login for admins.</w:t>
         <w:br/>
-        <w:t>• Manage medicines — add, update, delete, and list medicine details (name, category, dosage, price, stock, supplier, expiry date, prescription flag).</w:t>
+        <w:t>• Manage Medicine Details – Add, update, delete medicine details (name, category, dosage, price, stock, supplier).</w:t>
         <w:br/>
-        <w:t>• Manage customers — view registered customers and update contact details.</w:t>
+        <w:t>• Manage Customer Details – View and update customer information.</w:t>
         <w:br/>
-        <w:t>• Manage orders — view all orders and update status (Pending, Ready for Pickup, Delivered).</w:t>
+        <w:t>• Manage Orders – View all orders, update order status (Pending, Ready for Pickup, Delivered).</w:t>
         <w:br/>
-        <w:t>• Generate reports — sales, stock, and customer order history summaries.</w:t>
+        <w:t>• Generate Reports – Sales reports, stock reports, and customer order history.</w:t>
         <w:br/>
-        <w:t>• Dashboard — overview of medicines in stock, active orders, and total sales.</w:t>
+        <w:t>• Dashboard – Overview of total sales, medicines in stock, and active orders.</w:t>
       </w:r>
     </w:p>
     <w:p>
@@ -1339,13 +1339,38 @@
           <w:rFonts w:ascii="Times New Roman" w:hAnsi="Times New Roman"/>
           <w:sz w:val="24"/>
         </w:rPr>
-        <w:t>Customer features implemented or prepared:</w:t>
+        <w:t>Customer Features</w:t>
         <w:br/>
-        <w:t>• Registration and login through RegistrationForm and LoginForm.</w:t>
+        <w:t>• Register/Login – New user registration and login.</w:t>
         <w:br/>
-        <w:t>• Search medicines by name, category, and price range using SearchService (linear search and filtering).</w:t>
+        <w:t>• Search Medicines – Search by name, category, or price range.</w:t>
         <w:br/>
-        <w:t>• Place orders, track orders, and profile management are specified in the brief; the customer portal after login is reserved for a future release while admin modules are fully operational.</w:t>
+        <w:t>• Place Orders – Add medicines to cart and place orders.</w:t>
+        <w:br/>
+        <w:t>• Track Orders – View status of orders.</w:t>
+        <w:br/>
+        <w:t>• Profile Management – Update personal details and contact information.</w:t>
+      </w:r>
+    </w:p>
+    <w:p>
+      <w:pPr>
+        <w:pStyle w:val="BodyText"/>
+        <w:spacing w:line="360" w:lineRule="auto"/>
+      </w:pPr>
+      <w:r>
+        <w:rPr>
+          <w:rFonts w:ascii="Times New Roman" w:hAnsi="Times New Roman"/>
+          <w:sz w:val="24"/>
+        </w:rPr>
+        <w:t>Additional Features</w:t>
+        <w:br/>
+        <w:t>• Apply discounts or promotions on medicines.</w:t>
+        <w:br/>
+        <w:t>• Include medicine expiry tracking notifications.</w:t>
+        <w:br/>
+        <w:t>• Include prescription upload functionality for certain medicines.</w:t>
+        <w:br/>
+        <w:t>• Export order history to PDF or Excel.</w:t>
       </w:r>
     </w:p>
     <w:p>

</xml_diff>

<commit_message>
Update architecture and ER diagrams, enhance SmartMed Report, and refine fill_report.py for clarity
- Revised the Architecture diagram to reflect a three-layer structure, detailing the roles of Presentation, Application, and Data layers.
- Updated the ER diagram dimensions for improved layout and readability.
- Enhanced the SmartMed Report.docx by refining the non-functional requirements and updating the descriptions of design diagrams for better clarity.
- Modified fill_report.py to align with the updated architecture and improve the accuracy of the report generation process.
</commit_message>
<xml_diff>
--- a/Docs/Report/SmartMed Report.docx
+++ b/Docs/Report/SmartMed Report.docx
@@ -1259,6 +1259,7 @@
         <w:pStyle w:val="Heading1"/>
       </w:pPr>
       <w:r>
+        <w:lastRenderedPageBreak/>
         <w:t>Introduction</w:t>
       </w:r>
     </w:p>
@@ -1315,16 +1316,52 @@
           <w:sz w:val="24"/>
         </w:rPr>
         <w:t>Admin Features</w:t>
+      </w:r>
+      <w:r>
+        <w:rPr>
+          <w:rFonts w:ascii="Times New Roman" w:hAnsi="Times New Roman"/>
+          <w:sz w:val="24"/>
+        </w:rPr>
         <w:br/>
         <w:t>• Login – Secure login for admins.</w:t>
+      </w:r>
+      <w:r>
+        <w:rPr>
+          <w:rFonts w:ascii="Times New Roman" w:hAnsi="Times New Roman"/>
+          <w:sz w:val="24"/>
+        </w:rPr>
         <w:br/>
         <w:t>• Manage Medicine Details – Add, update, delete medicine details (name, category, dosage, price, stock, supplier).</w:t>
+      </w:r>
+      <w:r>
+        <w:rPr>
+          <w:rFonts w:ascii="Times New Roman" w:hAnsi="Times New Roman"/>
+          <w:sz w:val="24"/>
+        </w:rPr>
         <w:br/>
         <w:t>• Manage Customer Details – View and update customer information.</w:t>
+      </w:r>
+      <w:r>
+        <w:rPr>
+          <w:rFonts w:ascii="Times New Roman" w:hAnsi="Times New Roman"/>
+          <w:sz w:val="24"/>
+        </w:rPr>
         <w:br/>
         <w:t>• Manage Orders – View all orders, update order status (Pending, Ready for Pickup, Delivered).</w:t>
+      </w:r>
+      <w:r>
+        <w:rPr>
+          <w:rFonts w:ascii="Times New Roman" w:hAnsi="Times New Roman"/>
+          <w:sz w:val="24"/>
+        </w:rPr>
         <w:br/>
         <w:t>• Generate Reports – Sales reports, stock reports, and customer order history.</w:t>
+      </w:r>
+      <w:r>
+        <w:rPr>
+          <w:rFonts w:ascii="Times New Roman" w:hAnsi="Times New Roman"/>
+          <w:sz w:val="24"/>
+        </w:rPr>
         <w:br/>
         <w:t>• Dashboard – Overview of total sales, medicines in stock, and active orders.</w:t>
       </w:r>
@@ -1340,14 +1377,44 @@
           <w:sz w:val="24"/>
         </w:rPr>
         <w:t>Customer Features</w:t>
+      </w:r>
+      <w:r>
+        <w:rPr>
+          <w:rFonts w:ascii="Times New Roman" w:hAnsi="Times New Roman"/>
+          <w:sz w:val="24"/>
+        </w:rPr>
         <w:br/>
         <w:t>• Register/Login – New user registration and login.</w:t>
+      </w:r>
+      <w:r>
+        <w:rPr>
+          <w:rFonts w:ascii="Times New Roman" w:hAnsi="Times New Roman"/>
+          <w:sz w:val="24"/>
+        </w:rPr>
         <w:br/>
         <w:t>• Search Medicines – Search by name, category, or price range.</w:t>
+      </w:r>
+      <w:r>
+        <w:rPr>
+          <w:rFonts w:ascii="Times New Roman" w:hAnsi="Times New Roman"/>
+          <w:sz w:val="24"/>
+        </w:rPr>
         <w:br/>
         <w:t>• Place Orders – Add medicines to cart and place orders.</w:t>
+      </w:r>
+      <w:r>
+        <w:rPr>
+          <w:rFonts w:ascii="Times New Roman" w:hAnsi="Times New Roman"/>
+          <w:sz w:val="24"/>
+        </w:rPr>
         <w:br/>
         <w:t>• Track Orders – View status of orders.</w:t>
+      </w:r>
+      <w:r>
+        <w:rPr>
+          <w:rFonts w:ascii="Times New Roman" w:hAnsi="Times New Roman"/>
+          <w:sz w:val="24"/>
+        </w:rPr>
         <w:br/>
         <w:t>• Profile Management – Update personal details and contact information.</w:t>
       </w:r>
@@ -1363,12 +1430,43 @@
           <w:sz w:val="24"/>
         </w:rPr>
         <w:t>Additional Features</w:t>
+      </w:r>
+      <w:r>
+        <w:rPr>
+          <w:rFonts w:ascii="Times New Roman" w:hAnsi="Times New Roman"/>
+          <w:sz w:val="24"/>
+        </w:rPr>
         <w:br/>
         <w:t>• Apply discounts or promotions on medicines.</w:t>
+      </w:r>
+      <w:r>
+        <w:rPr>
+          <w:rFonts w:ascii="Times New Roman" w:hAnsi="Times New Roman"/>
+          <w:sz w:val="24"/>
+        </w:rPr>
         <w:br/>
+      </w:r>
+      <w:r>
+        <w:rPr>
+          <w:rFonts w:ascii="Times New Roman" w:hAnsi="Times New Roman"/>
+          <w:sz w:val="24"/>
+        </w:rPr>
+        <w:lastRenderedPageBreak/>
         <w:t>• Include medicine expiry tracking notifications.</w:t>
+      </w:r>
+      <w:r>
+        <w:rPr>
+          <w:rFonts w:ascii="Times New Roman" w:hAnsi="Times New Roman"/>
+          <w:sz w:val="24"/>
+        </w:rPr>
         <w:br/>
         <w:t>• Include prescription upload functionality for certain medicines.</w:t>
+      </w:r>
+      <w:r>
+        <w:rPr>
+          <w:rFonts w:ascii="Times New Roman" w:hAnsi="Times New Roman"/>
+          <w:sz w:val="24"/>
+        </w:rPr>
         <w:br/>
         <w:t>• Export order history to PDF or Excel.</w:t>
       </w:r>
@@ -1391,15 +1489,109 @@
           <w:rFonts w:ascii="Times New Roman" w:hAnsi="Times New Roman"/>
           <w:sz w:val="24"/>
         </w:rPr>
-        <w:t>• Usability — role-based navigation via AdminShellForm sidebar; standard WinForms controls for data entry and grids.</w:t>
+        <w:t xml:space="preserve">• Usability </w:t>
+      </w:r>
+      <w:r>
+        <w:rPr>
+          <w:rFonts w:ascii="Times New Roman" w:hAnsi="Times New Roman"/>
+          <w:sz w:val="24"/>
+        </w:rPr>
+        <w:t>-</w:t>
+      </w:r>
+      <w:r>
+        <w:rPr>
+          <w:rFonts w:ascii="Times New Roman" w:hAnsi="Times New Roman"/>
+          <w:sz w:val="24"/>
+        </w:rPr>
+        <w:t xml:space="preserve"> role-based navigation via AdminShellForm sidebar; standard WinForms controls for data entry and grids.</w:t>
+      </w:r>
+      <w:r>
+        <w:rPr>
+          <w:rFonts w:ascii="Times New Roman" w:hAnsi="Times New Roman"/>
+          <w:sz w:val="24"/>
+        </w:rPr>
         <w:br/>
-        <w:t>• Reliability — parameterized SQL queries prevent injection; validation runs before database access.</w:t>
+        <w:t xml:space="preserve">• Reliability </w:t>
+      </w:r>
+      <w:r>
+        <w:rPr>
+          <w:rFonts w:ascii="Times New Roman" w:hAnsi="Times New Roman"/>
+          <w:sz w:val="24"/>
+        </w:rPr>
+        <w:t>-</w:t>
+      </w:r>
+      <w:r>
+        <w:rPr>
+          <w:rFonts w:ascii="Times New Roman" w:hAnsi="Times New Roman"/>
+          <w:sz w:val="24"/>
+        </w:rPr>
+        <w:t xml:space="preserve"> parameterized SQL queries prevent injection; validation runs before database access.</w:t>
+      </w:r>
+      <w:r>
+        <w:rPr>
+          <w:rFonts w:ascii="Times New Roman" w:hAnsi="Times New Roman"/>
+          <w:sz w:val="24"/>
+        </w:rPr>
         <w:br/>
-        <w:t>• Maintainability — separation of UI, services, and data access into distinct folders and namespaces.</w:t>
+        <w:t xml:space="preserve">• Maintainability </w:t>
+      </w:r>
+      <w:r>
+        <w:rPr>
+          <w:rFonts w:ascii="Times New Roman" w:hAnsi="Times New Roman"/>
+          <w:sz w:val="24"/>
+        </w:rPr>
+        <w:t>-</w:t>
+      </w:r>
+      <w:r>
+        <w:rPr>
+          <w:rFonts w:ascii="Times New Roman" w:hAnsi="Times New Roman"/>
+          <w:sz w:val="24"/>
+        </w:rPr>
+        <w:t xml:space="preserve"> separation of UI, services, and data access into distinct folders and namespaces.</w:t>
+      </w:r>
+      <w:r>
+        <w:rPr>
+          <w:rFonts w:ascii="Times New Roman" w:hAnsi="Times New Roman"/>
+          <w:sz w:val="24"/>
+        </w:rPr>
         <w:br/>
-        <w:t>• Performance — linear search is acceptable for typical pharmacy catalogue sizes.</w:t>
+        <w:t xml:space="preserve">• Performance </w:t>
+      </w:r>
+      <w:r>
+        <w:rPr>
+          <w:rFonts w:ascii="Times New Roman" w:hAnsi="Times New Roman"/>
+          <w:sz w:val="24"/>
+        </w:rPr>
+        <w:t>-</w:t>
+      </w:r>
+      <w:r>
+        <w:rPr>
+          <w:rFonts w:ascii="Times New Roman" w:hAnsi="Times New Roman"/>
+          <w:sz w:val="24"/>
+        </w:rPr>
+        <w:t xml:space="preserve"> linear search is acceptable for typical pharmacy catalogue sizes.</w:t>
+      </w:r>
+      <w:r>
+        <w:rPr>
+          <w:rFonts w:ascii="Times New Roman" w:hAnsi="Times New Roman"/>
+          <w:sz w:val="24"/>
+        </w:rPr>
         <w:br/>
-        <w:t>• Security — passwords validated at login; session state held in Session service; admin and customer roles separated.</w:t>
+        <w:t xml:space="preserve">• Security </w:t>
+      </w:r>
+      <w:r>
+        <w:rPr>
+          <w:rFonts w:ascii="Times New Roman" w:hAnsi="Times New Roman"/>
+          <w:sz w:val="24"/>
+        </w:rPr>
+        <w:t>-</w:t>
+      </w:r>
+      <w:r>
+        <w:rPr>
+          <w:rFonts w:ascii="Times New Roman" w:hAnsi="Times New Roman"/>
+          <w:sz w:val="24"/>
+        </w:rPr>
+        <w:t xml:space="preserve"> passwords validated at login; session state held in Session service; admin and customer roles separated.</w:t>
       </w:r>
     </w:p>
     <w:p>
@@ -1421,8 +1613,34 @@
           <w:sz w:val="24"/>
         </w:rPr>
         <w:t>• PC or laptop running Windows 10 or later.</w:t>
+      </w:r>
+      <w:r>
+        <w:rPr>
+          <w:rFonts w:ascii="Times New Roman" w:hAnsi="Times New Roman"/>
+          <w:sz w:val="24"/>
+        </w:rPr>
         <w:br/>
-        <w:t>• Minimum 4 GB RAM recommended for Visual Studio and SQL Server Express/LocalDB.</w:t>
+        <w:t xml:space="preserve">• Minimum </w:t>
+      </w:r>
+      <w:r>
+        <w:rPr>
+          <w:rFonts w:ascii="Times New Roman" w:hAnsi="Times New Roman"/>
+          <w:sz w:val="24"/>
+        </w:rPr>
+        <w:t>8</w:t>
+      </w:r>
+      <w:r>
+        <w:rPr>
+          <w:rFonts w:ascii="Times New Roman" w:hAnsi="Times New Roman"/>
+          <w:sz w:val="24"/>
+        </w:rPr>
+        <w:t xml:space="preserve"> GB RAM recommended for Visual Studio and SQL Server Express/LocalDB.</w:t>
+      </w:r>
+      <w:r>
+        <w:rPr>
+          <w:rFonts w:ascii="Times New Roman" w:hAnsi="Times New Roman"/>
+          <w:sz w:val="24"/>
+        </w:rPr>
         <w:br/>
         <w:t>• Display resolution 1280×720 or higher for admin dashboard layout.</w:t>
       </w:r>
@@ -1445,13 +1663,23 @@
           <w:rFonts w:ascii="Times New Roman" w:hAnsi="Times New Roman"/>
           <w:sz w:val="24"/>
         </w:rPr>
-        <w:t>• Microsoft Windows 10 or later.</w:t>
+        <w:t>• .NET Framework 4.8.</w:t>
+      </w:r>
+      <w:r>
+        <w:rPr>
+          <w:rFonts w:ascii="Times New Roman" w:hAnsi="Times New Roman"/>
+          <w:sz w:val="24"/>
+        </w:rPr>
         <w:br/>
-        <w:t>• .NET Framework 4.8.</w:t>
+        <w:t xml:space="preserve">• Microsoft SQL Server </w:t>
+      </w:r>
+      <w:r>
+        <w:rPr>
+          <w:rFonts w:ascii="Times New Roman" w:hAnsi="Times New Roman"/>
+          <w:sz w:val="24"/>
+        </w:rPr>
         <w:br/>
-        <w:t>• Microsoft SQL Server (Express, LocalDB, or full edition) with Windows Authentication.</w:t>
-        <w:br/>
-        <w:t>• Visual Studio 2019 or later with .NET desktop development workload (for building from source).</w:t>
+        <w:t xml:space="preserve">• Visual Studio 2019 or later with .NET desktop development workload </w:t>
       </w:r>
     </w:p>
     <w:p>
@@ -1473,16 +1701,80 @@
           <w:sz w:val="24"/>
         </w:rPr>
         <w:t>• Language: C#</w:t>
+      </w:r>
+      <w:r>
+        <w:rPr>
+          <w:rFonts w:ascii="Times New Roman" w:hAnsi="Times New Roman"/>
+          <w:sz w:val="24"/>
+        </w:rPr>
         <w:br/>
-        <w:t>• UI: Windows Forms (System.Windows.Forms)</w:t>
+        <w:t>• UI: Windows Forms (</w:t>
+      </w:r>
+      <w:proofErr w:type="gramStart"/>
+      <w:r>
+        <w:rPr>
+          <w:rFonts w:ascii="Times New Roman" w:hAnsi="Times New Roman"/>
+          <w:sz w:val="24"/>
+        </w:rPr>
+        <w:t>System.Windows.Forms</w:t>
+      </w:r>
+      <w:proofErr w:type="gramEnd"/>
+      <w:r>
+        <w:rPr>
+          <w:rFonts w:ascii="Times New Roman" w:hAnsi="Times New Roman"/>
+          <w:sz w:val="24"/>
+        </w:rPr>
+        <w:t>)</w:t>
+      </w:r>
+      <w:r>
+        <w:rPr>
+          <w:rFonts w:ascii="Times New Roman" w:hAnsi="Times New Roman"/>
+          <w:sz w:val="24"/>
+        </w:rPr>
         <w:br/>
-        <w:t>• Data access: ADO.NET (System.Data.SqlClient), parameterized commands via DatabaseHelper</w:t>
+        <w:t>• Data access: ADO.NET (</w:t>
+      </w:r>
+      <w:proofErr w:type="spellStart"/>
+      <w:proofErr w:type="gramStart"/>
+      <w:r>
+        <w:rPr>
+          <w:rFonts w:ascii="Times New Roman" w:hAnsi="Times New Roman"/>
+          <w:sz w:val="24"/>
+        </w:rPr>
+        <w:t>System.Data.SqlClient</w:t>
+      </w:r>
+      <w:proofErr w:type="spellEnd"/>
+      <w:proofErr w:type="gramEnd"/>
+      <w:r>
+        <w:rPr>
+          <w:rFonts w:ascii="Times New Roman" w:hAnsi="Times New Roman"/>
+          <w:sz w:val="24"/>
+        </w:rPr>
+        <w:t>)</w:t>
+      </w:r>
+      <w:r>
+        <w:rPr>
+          <w:rFonts w:ascii="Times New Roman" w:hAnsi="Times New Roman"/>
+          <w:sz w:val="24"/>
+        </w:rPr>
         <w:br/>
-        <w:t>• Database: Microsoft SQL Server — script Database/SmartMedDB.sql</w:t>
+        <w:t xml:space="preserve">• Database: Microsoft SQL Server </w:t>
+      </w:r>
+      <w:r>
+        <w:rPr>
+          <w:rFonts w:ascii="Times New Roman" w:hAnsi="Times New Roman"/>
+          <w:sz w:val="24"/>
+        </w:rPr>
         <w:br/>
-        <w:t>• IDE: Visual Studio 2022; builds also supported via dotnet CLI</w:t>
+        <w:t>• IDE: Visual Studio 2022</w:t>
+      </w:r>
+      <w:r>
+        <w:rPr>
+          <w:rFonts w:ascii="Times New Roman" w:hAnsi="Times New Roman"/>
+          <w:sz w:val="24"/>
+        </w:rPr>
         <w:br/>
-        <w:t>• Diagrams: draw.io files in Docs/Diagrams/ (Architecture, Use Case, ER, Class, Sequence)</w:t>
+        <w:t xml:space="preserve">• Diagrams: draw.io </w:t>
       </w:r>
     </w:p>
     <w:p>
@@ -1490,6 +1782,7 @@
         <w:pStyle w:val="Heading1"/>
       </w:pPr>
       <w:r>
+        <w:lastRenderedPageBreak/>
         <w:t>Design Diagrams</w:t>
       </w:r>
     </w:p>
@@ -1503,48 +1796,77 @@
     </w:p>
     <w:p>
       <w:pPr>
-        <w:pStyle w:val="BodyText"/>
-        <w:spacing w:line="360" w:lineRule="auto"/>
-      </w:pPr>
-      <w:r>
-        <w:rPr>
-          <w:rFonts w:ascii="Times New Roman" w:hAnsi="Times New Roman"/>
-          <w:sz w:val="24"/>
-        </w:rPr>
-        <w:t>The application follows a layered architecture documented in Docs/Diagrams/Architecture.drawio:</w:t>
-      </w:r>
+        <w:jc w:val="center"/>
+      </w:pPr>
     </w:p>
     <w:p>
       <w:pPr>
         <w:jc w:val="center"/>
       </w:pPr>
       <w:r>
+        <w:rPr>
+          <w:rFonts w:ascii="Times New Roman" w:hAnsi="Times New Roman"/>
+          <w:i/>
+          <w:sz w:val="20"/>
+        </w:rPr>
+        <w:t>Figure: Architecture Diagram</w:t>
+      </w:r>
+    </w:p>
+    <w:p>
+      <w:pPr>
+        <w:pStyle w:val="Heading2"/>
+      </w:pPr>
+      <w:r>
+        <w:t>Use Case Diagram</w:t>
+      </w:r>
+    </w:p>
+    <w:p>
+      <w:r>
+        <w:rPr>
+          <w:noProof/>
+        </w:rPr>
         <w:drawing>
-          <wp:inline xmlns:a="http://schemas.openxmlformats.org/drawingml/2006/main" xmlns:pic="http://schemas.openxmlformats.org/drawingml/2006/picture">
-            <wp:extent cx="5486400" cy="11484864"/>
-            <wp:docPr id="1768847204" name="Picture 1768847204"/>
+          <wp:inline distT="0" distB="0" distL="0" distR="0" wp14:anchorId="39929C56" wp14:editId="2CF07B85">
+            <wp:extent cx="5932805" cy="5546090"/>
+            <wp:effectExtent l="0" t="0" r="0" b="0"/>
+            <wp:docPr id="1659303593" name="Picture 2"/>
             <wp:cNvGraphicFramePr>
-              <a:graphicFrameLocks noChangeAspect="1"/>
+              <a:graphicFrameLocks xmlns:a="http://schemas.openxmlformats.org/drawingml/2006/main" noChangeAspect="1"/>
             </wp:cNvGraphicFramePr>
-            <a:graphic>
+            <a:graphic xmlns:a="http://schemas.openxmlformats.org/drawingml/2006/main">
               <a:graphicData uri="http://schemas.openxmlformats.org/drawingml/2006/picture">
-                <pic:pic>
+                <pic:pic xmlns:pic="http://schemas.openxmlformats.org/drawingml/2006/picture">
                   <pic:nvPicPr>
-                    <pic:cNvPr id="0" name="Architecture.png"/>
-                    <pic:cNvPicPr/>
+                    <pic:cNvPr id="0" name="Picture 1"/>
+                    <pic:cNvPicPr>
+                      <a:picLocks noChangeAspect="1" noChangeArrowheads="1"/>
+                    </pic:cNvPicPr>
                   </pic:nvPicPr>
                   <pic:blipFill>
-                    <a:blip r:embed="rId13"/>
+                    <a:blip r:embed="rId11">
+                      <a:extLst>
+                        <a:ext uri="{28A0092B-C50C-407E-A947-70E740481C1C}">
+                          <a14:useLocalDpi xmlns:a14="http://schemas.microsoft.com/office/drawing/2010/main" val="0"/>
+                        </a:ext>
+                      </a:extLst>
+                    </a:blip>
+                    <a:srcRect/>
                     <a:stretch>
                       <a:fillRect/>
                     </a:stretch>
                   </pic:blipFill>
-                  <pic:spPr>
+                  <pic:spPr bwMode="auto">
                     <a:xfrm>
                       <a:off x="0" y="0"/>
-                      <a:ext cx="5486400" cy="11484864"/>
+                      <a:ext cx="5932805" cy="5546090"/>
                     </a:xfrm>
-                    <a:prstGeom prst="rect"/>
+                    <a:prstGeom prst="rect">
+                      <a:avLst/>
+                    </a:prstGeom>
+                    <a:noFill/>
+                    <a:ln>
+                      <a:noFill/>
+                    </a:ln>
                   </pic:spPr>
                 </pic:pic>
               </a:graphicData>
@@ -1563,126 +1885,68 @@
           <w:i/>
           <w:sz w:val="20"/>
         </w:rPr>
-        <w:t>Figure: Architecture Diagram</w:t>
+        <w:t>Figure: Use Case Diagram</w:t>
       </w:r>
     </w:p>
     <w:p>
       <w:pPr>
-        <w:pStyle w:val="BodyText"/>
-        <w:spacing w:line="360" w:lineRule="auto"/>
-      </w:pPr>
-      <w:r>
-        <w:rPr>
-          <w:rFonts w:ascii="Times New Roman" w:hAnsi="Times New Roman"/>
-          <w:sz w:val="24"/>
-        </w:rPr>
-        <w:t>Presentation layer (SmartMed.UI — Forms/): LoginForm, RegistrationForm, AdminShellForm, AdminDashboardForm, ManageMedicinesForm, ManageCustomersForm, ManageOrdersForm, ReportsForm.</w:t>
+        <w:pStyle w:val="Heading2"/>
+      </w:pPr>
+      <w:r>
+        <w:lastRenderedPageBreak/>
+        <w:t>ER Diagram</w:t>
       </w:r>
     </w:p>
     <w:p>
       <w:pPr>
-        <w:pStyle w:val="BodyText"/>
-        <w:spacing w:line="360" w:lineRule="auto"/>
-      </w:pPr>
-      <w:r>
-        <w:rPr>
-          <w:rFonts w:ascii="Times New Roman" w:hAnsi="Times New Roman"/>
-          <w:sz w:val="24"/>
-        </w:rPr>
-        <w:t>Service layer (SmartMed.Services): AuthService, ValidationService, SearchService, ReportService, Session.</w:t>
-      </w:r>
-    </w:p>
-    <w:p>
-      <w:pPr>
-        <w:pStyle w:val="BodyText"/>
-        <w:spacing w:line="360" w:lineRule="auto"/>
-      </w:pPr>
-      <w:r>
-        <w:rPr>
-          <w:rFonts w:ascii="Times New Roman" w:hAnsi="Times New Roman"/>
-          <w:sz w:val="24"/>
-        </w:rPr>
-        <w:t>Data layer (SmartMed.Data): DatabaseHelper, AdminRepository, CustomerRepository, MedicineRepository, OrderRepository.</w:t>
-      </w:r>
-    </w:p>
-    <w:p>
-      <w:pPr>
-        <w:pStyle w:val="BodyText"/>
-        <w:spacing w:line="360" w:lineRule="auto"/>
-      </w:pPr>
-      <w:r>
-        <w:rPr>
-          <w:rFonts w:ascii="Times New Roman" w:hAnsi="Times New Roman"/>
-          <w:sz w:val="24"/>
-        </w:rPr>
-        <w:t>Database layer: SQL Server database SmartMedDB.</w:t>
-      </w:r>
-    </w:p>
-    <w:p>
-      <w:pPr>
-        <w:pStyle w:val="BodyText"/>
-        <w:spacing w:line="360" w:lineRule="auto"/>
-      </w:pPr>
-      <w:r>
-        <w:rPr>
-          <w:rFonts w:ascii="Times New Roman" w:hAnsi="Times New Roman"/>
-          <w:sz w:val="24"/>
-        </w:rPr>
-        <w:t>Forms call Services or Data repositories; repositories use DatabaseHelper for all SQL. Session stores the logged-in Admin or Customer after authentication.</w:t>
-      </w:r>
-    </w:p>
-    <w:p>
-      <w:pPr>
-        <w:pStyle w:val="Heading2"/>
-      </w:pPr>
-      <w:r>
-        <w:t>Use Case Diagram</w:t>
-      </w:r>
-    </w:p>
-    <w:p>
-      <w:pPr>
-        <w:pStyle w:val="BodyText"/>
-        <w:spacing w:line="360" w:lineRule="auto"/>
-      </w:pPr>
-      <w:r>
-        <w:rPr>
-          <w:rFonts w:ascii="Times New Roman" w:hAnsi="Times New Roman"/>
-          <w:sz w:val="24"/>
-        </w:rPr>
-        <w:t>Docs/Diagrams/Usecase.drawio defines actors Admin and Customer.</w:t>
-      </w:r>
-    </w:p>
-    <w:p>
-      <w:pPr>
         <w:jc w:val="center"/>
       </w:pPr>
       <w:r>
+        <w:rPr>
+          <w:noProof/>
+        </w:rPr>
         <w:drawing>
-          <wp:inline xmlns:a="http://schemas.openxmlformats.org/drawingml/2006/main" xmlns:pic="http://schemas.openxmlformats.org/drawingml/2006/picture">
-            <wp:extent cx="5486400" cy="5132832"/>
-            <wp:docPr id="1768847205" name="Picture 1768847205"/>
+          <wp:inline distT="0" distB="0" distL="0" distR="0" wp14:anchorId="093587F6" wp14:editId="314393D7">
+            <wp:extent cx="5937885" cy="4479290"/>
+            <wp:effectExtent l="0" t="0" r="5715" b="0"/>
+            <wp:docPr id="2028614983" name="Picture 3"/>
             <wp:cNvGraphicFramePr>
-              <a:graphicFrameLocks noChangeAspect="1"/>
+              <a:graphicFrameLocks xmlns:a="http://schemas.openxmlformats.org/drawingml/2006/main" noChangeAspect="1"/>
             </wp:cNvGraphicFramePr>
-            <a:graphic>
+            <a:graphic xmlns:a="http://schemas.openxmlformats.org/drawingml/2006/main">
               <a:graphicData uri="http://schemas.openxmlformats.org/drawingml/2006/picture">
-                <pic:pic>
+                <pic:pic xmlns:pic="http://schemas.openxmlformats.org/drawingml/2006/picture">
                   <pic:nvPicPr>
-                    <pic:cNvPr id="0" name="UseCase.png"/>
-                    <pic:cNvPicPr/>
+                    <pic:cNvPr id="0" name="Picture 2"/>
+                    <pic:cNvPicPr>
+                      <a:picLocks noChangeAspect="1" noChangeArrowheads="1"/>
+                    </pic:cNvPicPr>
                   </pic:nvPicPr>
                   <pic:blipFill>
-                    <a:blip r:embed="rId14"/>
+                    <a:blip r:embed="rId12">
+                      <a:extLst>
+                        <a:ext uri="{28A0092B-C50C-407E-A947-70E740481C1C}">
+                          <a14:useLocalDpi xmlns:a14="http://schemas.microsoft.com/office/drawing/2010/main" val="0"/>
+                        </a:ext>
+                      </a:extLst>
+                    </a:blip>
+                    <a:srcRect/>
                     <a:stretch>
                       <a:fillRect/>
                     </a:stretch>
                   </pic:blipFill>
-                  <pic:spPr>
+                  <pic:spPr bwMode="auto">
                     <a:xfrm>
                       <a:off x="0" y="0"/>
-                      <a:ext cx="5486400" cy="5132832"/>
+                      <a:ext cx="5937885" cy="4479290"/>
                     </a:xfrm>
-                    <a:prstGeom prst="rect"/>
+                    <a:prstGeom prst="rect">
+                      <a:avLst/>
+                    </a:prstGeom>
+                    <a:noFill/>
+                    <a:ln>
+                      <a:noFill/>
+                    </a:ln>
                   </pic:spPr>
                 </pic:pic>
               </a:graphicData>
@@ -1701,100 +1965,68 @@
           <w:i/>
           <w:sz w:val="20"/>
         </w:rPr>
-        <w:t>Figure: Use Case Diagram</w:t>
+        <w:t>Figure: ER Diagram</w:t>
       </w:r>
     </w:p>
     <w:p>
       <w:pPr>
-        <w:pStyle w:val="BodyText"/>
-        <w:spacing w:line="360" w:lineRule="auto"/>
-      </w:pPr>
-      <w:r>
-        <w:rPr>
-          <w:rFonts w:ascii="Times New Roman" w:hAnsi="Times New Roman"/>
-          <w:sz w:val="24"/>
-        </w:rPr>
-        <w:t>Admin use cases: login, dashboard overview, manage medicines, manage customers, manage orders, generate reports.</w:t>
+        <w:pStyle w:val="Heading2"/>
+      </w:pPr>
+      <w:r>
+        <w:lastRenderedPageBreak/>
+        <w:t>Class Diagram</w:t>
       </w:r>
     </w:p>
     <w:p>
       <w:pPr>
-        <w:pStyle w:val="BodyText"/>
-        <w:spacing w:line="360" w:lineRule="auto"/>
-      </w:pPr>
-      <w:r>
-        <w:rPr>
-          <w:rFonts w:ascii="Times New Roman" w:hAnsi="Times New Roman"/>
-          <w:sz w:val="24"/>
-        </w:rPr>
-        <w:t>Customer use cases: register, login, search medicines, place order, track order, manage profile.</w:t>
-      </w:r>
-    </w:p>
-    <w:p>
-      <w:pPr>
-        <w:pStyle w:val="BodyText"/>
-        <w:spacing w:line="360" w:lineRule="auto"/>
-      </w:pPr>
-      <w:r>
-        <w:rPr>
-          <w:rFonts w:ascii="Times New Roman" w:hAnsi="Times New Roman"/>
-          <w:sz w:val="24"/>
-        </w:rPr>
-        <w:t>Include relationships show that placing an order includes searching medicines. Implemented WinForms map directly to these use cases.</w:t>
-      </w:r>
-    </w:p>
-    <w:p>
-      <w:pPr>
-        <w:pStyle w:val="Heading2"/>
-      </w:pPr>
-      <w:r>
-        <w:t>ER Diagram</w:t>
-      </w:r>
-    </w:p>
-    <w:p>
-      <w:pPr>
-        <w:pStyle w:val="BodyText"/>
-        <w:spacing w:line="360" w:lineRule="auto"/>
-      </w:pPr>
-      <w:r>
-        <w:rPr>
-          <w:rFonts w:ascii="Times New Roman" w:hAnsi="Times New Roman"/>
-          <w:sz w:val="24"/>
-        </w:rPr>
-        <w:t>Docs/Diagrams/ER.drawio models six entities: Admin, Customer, Medicine, Order, OrderItem, and Prescription.</w:t>
-      </w:r>
-    </w:p>
-    <w:p>
-      <w:pPr>
         <w:jc w:val="center"/>
       </w:pPr>
       <w:r>
+        <w:rPr>
+          <w:noProof/>
+        </w:rPr>
         <w:drawing>
-          <wp:inline xmlns:a="http://schemas.openxmlformats.org/drawingml/2006/main" xmlns:pic="http://schemas.openxmlformats.org/drawingml/2006/picture">
-            <wp:extent cx="5486400" cy="6565392"/>
-            <wp:docPr id="1768847206" name="Picture 1768847206"/>
+          <wp:inline distT="0" distB="0" distL="0" distR="0" wp14:anchorId="44B61F7A" wp14:editId="3D179D8B">
+            <wp:extent cx="5937885" cy="4201795"/>
+            <wp:effectExtent l="0" t="0" r="5715" b="8255"/>
+            <wp:docPr id="721075322" name="Picture 5"/>
             <wp:cNvGraphicFramePr>
-              <a:graphicFrameLocks noChangeAspect="1"/>
+              <a:graphicFrameLocks xmlns:a="http://schemas.openxmlformats.org/drawingml/2006/main" noChangeAspect="1"/>
             </wp:cNvGraphicFramePr>
-            <a:graphic>
+            <a:graphic xmlns:a="http://schemas.openxmlformats.org/drawingml/2006/main">
               <a:graphicData uri="http://schemas.openxmlformats.org/drawingml/2006/picture">
-                <pic:pic>
+                <pic:pic xmlns:pic="http://schemas.openxmlformats.org/drawingml/2006/picture">
                   <pic:nvPicPr>
-                    <pic:cNvPr id="0" name="ER.png"/>
-                    <pic:cNvPicPr/>
+                    <pic:cNvPr id="0" name="Picture 4"/>
+                    <pic:cNvPicPr>
+                      <a:picLocks noChangeAspect="1" noChangeArrowheads="1"/>
+                    </pic:cNvPicPr>
                   </pic:nvPicPr>
                   <pic:blipFill>
-                    <a:blip r:embed="rId15"/>
+                    <a:blip r:embed="rId13">
+                      <a:extLst>
+                        <a:ext uri="{28A0092B-C50C-407E-A947-70E740481C1C}">
+                          <a14:useLocalDpi xmlns:a14="http://schemas.microsoft.com/office/drawing/2010/main" val="0"/>
+                        </a:ext>
+                      </a:extLst>
+                    </a:blip>
+                    <a:srcRect/>
                     <a:stretch>
                       <a:fillRect/>
                     </a:stretch>
                   </pic:blipFill>
-                  <pic:spPr>
+                  <pic:spPr bwMode="auto">
                     <a:xfrm>
                       <a:off x="0" y="0"/>
-                      <a:ext cx="5486400" cy="6565392"/>
+                      <a:ext cx="5937885" cy="4201795"/>
                     </a:xfrm>
-                    <a:prstGeom prst="rect"/>
+                    <a:prstGeom prst="rect">
+                      <a:avLst/>
+                    </a:prstGeom>
+                    <a:noFill/>
+                    <a:ln>
+                      <a:noFill/>
+                    </a:ln>
                   </pic:spPr>
                 </pic:pic>
               </a:graphicData>
@@ -1813,74 +2045,68 @@
           <w:i/>
           <w:sz w:val="20"/>
         </w:rPr>
-        <w:t>Figure: ER Diagram</w:t>
+        <w:t>Figure: Class Diagram</w:t>
       </w:r>
     </w:p>
     <w:p>
       <w:pPr>
-        <w:pStyle w:val="BodyText"/>
-        <w:spacing w:line="360" w:lineRule="auto"/>
-      </w:pPr>
-      <w:r>
-        <w:rPr>
-          <w:rFonts w:ascii="Times New Roman" w:hAnsi="Times New Roman"/>
-          <w:sz w:val="24"/>
-        </w:rPr>
-        <w:t>Customer places Orders (one-to-many). Order contains OrderItems (one-to-many). Medicine appears in OrderItems. Customer may upload Prescriptions (one-to-many). Primary keys are identity integers. Database/SmartMedDB.sql implements this schema with foreign keys and a CHECK constraint on Order.Status.</w:t>
+        <w:pStyle w:val="Heading2"/>
+      </w:pPr>
+      <w:r>
+        <w:lastRenderedPageBreak/>
+        <w:t>Sequence Diagram</w:t>
       </w:r>
     </w:p>
     <w:p>
       <w:pPr>
-        <w:pStyle w:val="Heading2"/>
-      </w:pPr>
-      <w:r>
-        <w:t>Class Diagram</w:t>
-      </w:r>
-    </w:p>
-    <w:p>
-      <w:pPr>
-        <w:pStyle w:val="BodyText"/>
-        <w:spacing w:line="360" w:lineRule="auto"/>
-      </w:pPr>
-      <w:r>
-        <w:rPr>
-          <w:rFonts w:ascii="Times New Roman" w:hAnsi="Times New Roman"/>
-          <w:sz w:val="24"/>
-        </w:rPr>
-        <w:t>Docs/Diagrams/Class.drawio shows Person as the base class with Name, Email, Phone, Password. Customer and Admin inherit Person. Customer adds CustomerID and Address; Admin adds AdminID and Username.</w:t>
-      </w:r>
-    </w:p>
-    <w:p>
-      <w:pPr>
         <w:jc w:val="center"/>
       </w:pPr>
       <w:r>
+        <w:rPr>
+          <w:noProof/>
+        </w:rPr>
         <w:drawing>
-          <wp:inline xmlns:a="http://schemas.openxmlformats.org/drawingml/2006/main" xmlns:pic="http://schemas.openxmlformats.org/drawingml/2006/picture">
-            <wp:extent cx="5486400" cy="3846576"/>
-            <wp:docPr id="1768847207" name="Picture 1768847207"/>
+          <wp:inline distT="0" distB="0" distL="0" distR="0" wp14:anchorId="265EF689" wp14:editId="4E201405">
+            <wp:extent cx="5791200" cy="3291032"/>
+            <wp:effectExtent l="0" t="0" r="0" b="5080"/>
+            <wp:docPr id="414156896" name="Picture 6"/>
             <wp:cNvGraphicFramePr>
-              <a:graphicFrameLocks noChangeAspect="1"/>
+              <a:graphicFrameLocks xmlns:a="http://schemas.openxmlformats.org/drawingml/2006/main" noChangeAspect="1"/>
             </wp:cNvGraphicFramePr>
-            <a:graphic>
+            <a:graphic xmlns:a="http://schemas.openxmlformats.org/drawingml/2006/main">
               <a:graphicData uri="http://schemas.openxmlformats.org/drawingml/2006/picture">
-                <pic:pic>
+                <pic:pic xmlns:pic="http://schemas.openxmlformats.org/drawingml/2006/picture">
                   <pic:nvPicPr>
-                    <pic:cNvPr id="0" name="Class.png"/>
-                    <pic:cNvPicPr/>
+                    <pic:cNvPr id="0" name="Picture 5"/>
+                    <pic:cNvPicPr>
+                      <a:picLocks noChangeAspect="1" noChangeArrowheads="1"/>
+                    </pic:cNvPicPr>
                   </pic:nvPicPr>
                   <pic:blipFill>
-                    <a:blip r:embed="rId16"/>
+                    <a:blip r:embed="rId14">
+                      <a:extLst>
+                        <a:ext uri="{28A0092B-C50C-407E-A947-70E740481C1C}">
+                          <a14:useLocalDpi xmlns:a14="http://schemas.microsoft.com/office/drawing/2010/main" val="0"/>
+                        </a:ext>
+                      </a:extLst>
+                    </a:blip>
+                    <a:srcRect/>
                     <a:stretch>
                       <a:fillRect/>
                     </a:stretch>
                   </pic:blipFill>
-                  <pic:spPr>
+                  <pic:spPr bwMode="auto">
                     <a:xfrm>
                       <a:off x="0" y="0"/>
-                      <a:ext cx="5486400" cy="3846576"/>
+                      <a:ext cx="5792525" cy="3291785"/>
                     </a:xfrm>
-                    <a:prstGeom prst="rect"/>
+                    <a:prstGeom prst="rect">
+                      <a:avLst/>
+                    </a:prstGeom>
+                    <a:noFill/>
+                    <a:ln>
+                      <a:noFill/>
+                    </a:ln>
                   </pic:spPr>
                 </pic:pic>
               </a:graphicData>
@@ -1892,81 +2118,87 @@
     <w:p>
       <w:pPr>
         <w:jc w:val="center"/>
-      </w:pPr>
-      <w:r>
         <w:rPr>
           <w:rFonts w:ascii="Times New Roman" w:hAnsi="Times New Roman"/>
           <w:i/>
           <w:sz w:val="20"/>
         </w:rPr>
-        <w:t>Figure: Class Diagram</w:t>
+      </w:pPr>
+      <w:r>
+        <w:rPr>
+          <w:rFonts w:ascii="Times New Roman" w:hAnsi="Times New Roman"/>
+          <w:i/>
+          <w:sz w:val="20"/>
+        </w:rPr>
+        <w:t>Figure: Sequence Diagram</w:t>
+      </w:r>
+      <w:r>
+        <w:rPr>
+          <w:rFonts w:ascii="Times New Roman" w:hAnsi="Times New Roman"/>
+          <w:i/>
+          <w:sz w:val="20"/>
+        </w:rPr>
+        <w:t>1</w:t>
       </w:r>
     </w:p>
     <w:p>
       <w:pPr>
-        <w:pStyle w:val="BodyText"/>
-        <w:spacing w:line="360" w:lineRule="auto"/>
-      </w:pPr>
-      <w:r>
+        <w:jc w:val="center"/>
         <w:rPr>
           <w:rFonts w:ascii="Times New Roman" w:hAnsi="Times New Roman"/>
-          <w:sz w:val="24"/>
-        </w:rPr>
-        <w:t>Entity classes Medicine, Order, OrderItem, and Prescription model pharmacy domain objects. Services coordinate validation and repository calls; repositories map rows to Models.</w:t>
-      </w:r>
-    </w:p>
-    <w:p>
-      <w:pPr>
-        <w:pStyle w:val="Heading2"/>
-      </w:pPr>
-      <w:r>
-        <w:t>Sequence Diagram</w:t>
-      </w:r>
-    </w:p>
-    <w:p>
-      <w:pPr>
-        <w:pStyle w:val="BodyText"/>
-        <w:spacing w:line="360" w:lineRule="auto"/>
+          <w:i/>
+          <w:sz w:val="20"/>
+        </w:rPr>
       </w:pPr>
       <w:r>
         <w:rPr>
           <w:rFonts w:ascii="Times New Roman" w:hAnsi="Times New Roman"/>
-          <w:sz w:val="24"/>
-        </w:rPr>
-        <w:t>Docs/Diagrams/Sequence.drawio illustrates key interactions such as admin login and medicine CRUD: the user interacts with a Form, which calls AuthService or a Repository, which uses DatabaseHelper to execute SQL against SmartMedDB, then results flow back to update the UI (DataGridView or labels).</w:t>
-      </w:r>
-    </w:p>
-    <w:p>
-      <w:pPr>
-        <w:jc w:val="center"/>
-      </w:pPr>
-      <w:r>
+          <w:i/>
+          <w:noProof/>
+          <w:sz w:val="20"/>
+        </w:rPr>
         <w:drawing>
-          <wp:inline xmlns:a="http://schemas.openxmlformats.org/drawingml/2006/main" xmlns:pic="http://schemas.openxmlformats.org/drawingml/2006/picture">
-            <wp:extent cx="5486400" cy="4248912"/>
-            <wp:docPr id="1768847208" name="Picture 1768847208"/>
+          <wp:inline distT="0" distB="0" distL="0" distR="0" wp14:anchorId="5041C743" wp14:editId="49EA9843">
+            <wp:extent cx="4903825" cy="3947160"/>
+            <wp:effectExtent l="0" t="0" r="0" b="0"/>
+            <wp:docPr id="1540573818" name="Picture 7"/>
             <wp:cNvGraphicFramePr>
-              <a:graphicFrameLocks noChangeAspect="1"/>
+              <a:graphicFrameLocks xmlns:a="http://schemas.openxmlformats.org/drawingml/2006/main" noChangeAspect="1"/>
             </wp:cNvGraphicFramePr>
-            <a:graphic>
+            <a:graphic xmlns:a="http://schemas.openxmlformats.org/drawingml/2006/main">
               <a:graphicData uri="http://schemas.openxmlformats.org/drawingml/2006/picture">
-                <pic:pic>
+                <pic:pic xmlns:pic="http://schemas.openxmlformats.org/drawingml/2006/picture">
                   <pic:nvPicPr>
-                    <pic:cNvPr id="0" name="Sequence.png"/>
-                    <pic:cNvPicPr/>
+                    <pic:cNvPr id="0" name="Picture 6"/>
+                    <pic:cNvPicPr>
+                      <a:picLocks noChangeAspect="1" noChangeArrowheads="1"/>
+                    </pic:cNvPicPr>
                   </pic:nvPicPr>
                   <pic:blipFill>
-                    <a:blip r:embed="rId17"/>
+                    <a:blip r:embed="rId15">
+                      <a:extLst>
+                        <a:ext uri="{28A0092B-C50C-407E-A947-70E740481C1C}">
+                          <a14:useLocalDpi xmlns:a14="http://schemas.microsoft.com/office/drawing/2010/main" val="0"/>
+                        </a:ext>
+                      </a:extLst>
+                    </a:blip>
+                    <a:srcRect/>
                     <a:stretch>
                       <a:fillRect/>
                     </a:stretch>
                   </pic:blipFill>
-                  <pic:spPr>
+                  <pic:spPr bwMode="auto">
                     <a:xfrm>
                       <a:off x="0" y="0"/>
-                      <a:ext cx="5486400" cy="4248912"/>
+                      <a:ext cx="4908121" cy="3950618"/>
                     </a:xfrm>
-                    <a:prstGeom prst="rect"/>
+                    <a:prstGeom prst="rect">
+                      <a:avLst/>
+                    </a:prstGeom>
+                    <a:noFill/>
+                    <a:ln>
+                      <a:noFill/>
+                    </a:ln>
                   </pic:spPr>
                 </pic:pic>
               </a:graphicData>
@@ -1987,90 +2219,195 @@
         </w:rPr>
         <w:t>Figure: Sequence Diagram</w:t>
       </w:r>
-    </w:p>
-    <w:p>
-      <w:pPr>
-        <w:pStyle w:val="Heading2"/>
-      </w:pPr>
-      <w:r>
-        <w:t>Database Design</w:t>
-      </w:r>
-    </w:p>
-    <w:p>
-      <w:pPr>
-        <w:pStyle w:val="BodyText"/>
-        <w:spacing w:line="360" w:lineRule="auto"/>
-      </w:pPr>
-      <w:r>
-        <w:rPr>
-          <w:rFonts w:ascii="Times New Roman" w:hAnsi="Times New Roman"/>
-          <w:sz w:val="24"/>
-        </w:rPr>
-        <w:t>Database SmartMedDB contains tables Admin, Customer, Medicine, Order, OrderItem, and Prescription. Seed data includes a default admin (admin / admin123) and sample customers and medicines. Order.Status is limited to Pending, Ready for Pickup, or Delivered. OrderItem stores quantity, unit price, and subtotal at order time.</w:t>
-      </w:r>
-    </w:p>
-    <w:p>
-      <w:pPr>
-        <w:jc w:val="center"/>
-      </w:pPr>
-      <w:r>
-        <w:drawing>
-          <wp:inline xmlns:a="http://schemas.openxmlformats.org/drawingml/2006/main" xmlns:pic="http://schemas.openxmlformats.org/drawingml/2006/picture">
-            <wp:extent cx="5486400" cy="6565392"/>
-            <wp:docPr id="1768847209" name="Picture 1768847209"/>
-            <wp:cNvGraphicFramePr>
-              <a:graphicFrameLocks noChangeAspect="1"/>
-            </wp:cNvGraphicFramePr>
-            <a:graphic>
-              <a:graphicData uri="http://schemas.openxmlformats.org/drawingml/2006/picture">
-                <pic:pic>
-                  <pic:nvPicPr>
-                    <pic:cNvPr id="0" name="ER.png"/>
-                    <pic:cNvPicPr/>
-                  </pic:nvPicPr>
-                  <pic:blipFill>
-                    <a:blip r:embed="rId15"/>
-                    <a:stretch>
-                      <a:fillRect/>
-                    </a:stretch>
-                  </pic:blipFill>
-                  <pic:spPr>
-                    <a:xfrm>
-                      <a:off x="0" y="0"/>
-                      <a:ext cx="5486400" cy="6565392"/>
-                    </a:xfrm>
-                    <a:prstGeom prst="rect"/>
-                  </pic:spPr>
-                </pic:pic>
-              </a:graphicData>
-            </a:graphic>
-          </wp:inline>
-        </w:drawing>
-      </w:r>
-    </w:p>
-    <w:p>
-      <w:pPr>
-        <w:jc w:val="center"/>
-      </w:pPr>
       <w:r>
         <w:rPr>
           <w:rFonts w:ascii="Times New Roman" w:hAnsi="Times New Roman"/>
           <w:i/>
           <w:sz w:val="20"/>
         </w:rPr>
-        <w:t>Figure: Database Design</w:t>
+        <w:t>2</w:t>
       </w:r>
     </w:p>
     <w:p>
       <w:pPr>
-        <w:pStyle w:val="Heading1"/>
-      </w:pPr>
-      <w:r>
-        <w:t>Description of Classes, Properties and Methods</w:t>
-      </w:r>
+        <w:jc w:val="center"/>
+      </w:pPr>
     </w:p>
     <w:p>
       <w:pPr>
+        <w:pStyle w:val="Heading2"/>
+      </w:pPr>
+      <w:r>
+        <w:t>Database Design</w:t>
+      </w:r>
+    </w:p>
+    <w:p>
+      <w:pPr>
+        <w:jc w:val="center"/>
+      </w:pPr>
+    </w:p>
+    <w:p>
+      <w:pPr>
+        <w:jc w:val="center"/>
+      </w:pPr>
+      <w:r>
+        <w:rPr>
+          <w:rFonts w:ascii="Times New Roman" w:hAnsi="Times New Roman"/>
+          <w:i/>
+          <w:sz w:val="20"/>
+        </w:rPr>
+        <w:t>Figure: Database Design</w:t>
+      </w:r>
+    </w:p>
+    <w:p>
+      <w:pPr>
+        <w:pStyle w:val="Heading1"/>
+      </w:pPr>
+      <w:r>
+        <w:t>Description of Classes, Properties and Methods</w:t>
+      </w:r>
+    </w:p>
+    <w:p>
+      <w:pPr>
+        <w:pStyle w:val="Heading1"/>
+      </w:pPr>
+      <w:r>
+        <w:t>Implementation</w:t>
+      </w:r>
+    </w:p>
+    <w:p>
+      <w:pPr>
+        <w:pStyle w:val="Heading2"/>
+      </w:pPr>
+      <w:r>
+        <w:t>Brief Description of Functions</w:t>
+      </w:r>
+    </w:p>
+    <w:p>
+      <w:pPr>
+        <w:pStyle w:val="Heading2"/>
+      </w:pPr>
+      <w:r>
+        <w:t>Code Snippets</w:t>
+      </w:r>
+    </w:p>
+    <w:p>
+      <w:pPr>
+        <w:pStyle w:val="Heading2"/>
+      </w:pPr>
+      <w:r>
+        <w:t>Output Screens</w:t>
+      </w:r>
+    </w:p>
+    <w:p>
+      <w:pPr>
+        <w:rPr>
+          <w:bCs/>
+        </w:rPr>
+      </w:pPr>
+      <w:r>
+        <w:rPr>
+          <w:rFonts w:ascii="Times New Roman" w:hAnsi="Times New Roman"/>
+          <w:bCs/>
+        </w:rPr>
+        <w:t>Login screen</w:t>
+      </w:r>
+    </w:p>
+    <w:p>
+      <w:pPr>
+        <w:rPr>
+          <w:bCs/>
+        </w:rPr>
+      </w:pPr>
+      <w:r>
+        <w:rPr>
+          <w:rFonts w:ascii="Times New Roman" w:hAnsi="Times New Roman"/>
+          <w:bCs/>
+        </w:rPr>
+        <w:t>Admin dashboard</w:t>
+      </w:r>
+    </w:p>
+    <w:p>
+      <w:pPr>
+        <w:rPr>
+          <w:bCs/>
+        </w:rPr>
+      </w:pPr>
+    </w:p>
+    <w:p>
+      <w:pPr>
+        <w:rPr>
+          <w:bCs/>
+        </w:rPr>
+      </w:pPr>
+      <w:r>
+        <w:rPr>
+          <w:rFonts w:ascii="Times New Roman" w:hAnsi="Times New Roman"/>
+          <w:bCs/>
+        </w:rPr>
+        <w:t>Manage medicines</w:t>
+      </w:r>
+    </w:p>
+    <w:p>
+      <w:pPr>
+        <w:rPr>
+          <w:bCs/>
+        </w:rPr>
+      </w:pPr>
+      <w:r>
+        <w:rPr>
+          <w:rFonts w:ascii="Times New Roman" w:hAnsi="Times New Roman"/>
+          <w:bCs/>
+        </w:rPr>
+        <w:t>Manage customers</w:t>
+      </w:r>
+    </w:p>
+    <w:p>
+      <w:pPr>
+        <w:rPr>
+          <w:bCs/>
+        </w:rPr>
+      </w:pPr>
+      <w:r>
+        <w:rPr>
+          <w:rFonts w:ascii="Times New Roman" w:hAnsi="Times New Roman"/>
+          <w:bCs/>
+        </w:rPr>
+        <w:t>Manage orders</w:t>
+      </w:r>
+    </w:p>
+    <w:p>
+      <w:pPr>
+        <w:rPr>
+          <w:bCs/>
+        </w:rPr>
+      </w:pPr>
+      <w:r>
+        <w:rPr>
+          <w:rFonts w:ascii="Times New Roman" w:hAnsi="Times New Roman"/>
+          <w:bCs/>
+        </w:rPr>
+        <w:t>Generate reports</w:t>
+      </w:r>
+    </w:p>
+    <w:p>
+      <w:pPr>
+        <w:pStyle w:val="Heading1"/>
+      </w:pPr>
+      <w:r>
+        <w:t>User Manual</w:t>
+      </w:r>
+    </w:p>
+    <w:p>
+      <w:pPr>
+        <w:pStyle w:val="Heading2"/>
+      </w:pPr>
+      <w:r>
+        <w:t>Installation Guide</w:t>
+      </w:r>
+    </w:p>
+    <w:p>
+      <w:pPr>
         <w:pStyle w:val="BodyText"/>
         <w:spacing w:line="360" w:lineRule="auto"/>
       </w:pPr>
@@ -2079,7 +2416,7 @@
           <w:rFonts w:ascii="Times New Roman" w:hAnsi="Times New Roman"/>
           <w:sz w:val="24"/>
         </w:rPr>
-        <w:t>The Models folder contains entity classes aligned with the class diagram.</w:t>
+        <w:t>Prerequisites: Windows 10+, .NET Framework 4.8, SQL Server, Visual Studio 2019+ (optional for running the built executable).</w:t>
       </w:r>
     </w:p>
     <w:p>
@@ -2092,7 +2429,31 @@
           <w:rFonts w:ascii="Times New Roman" w:hAnsi="Times New Roman"/>
           <w:sz w:val="24"/>
         </w:rPr>
-        <w:t>Person — base class: Name, Email, Phone, Password.</w:t>
+        <w:t>Database setup:</w:t>
+      </w:r>
+      <w:r>
+        <w:rPr>
+          <w:rFonts w:ascii="Times New Roman" w:hAnsi="Times New Roman"/>
+          <w:sz w:val="24"/>
+        </w:rPr>
+        <w:br/>
+        <w:t>1. Open SQL Server Management Studio.</w:t>
+      </w:r>
+      <w:r>
+        <w:rPr>
+          <w:rFonts w:ascii="Times New Roman" w:hAnsi="Times New Roman"/>
+          <w:sz w:val="24"/>
+        </w:rPr>
+        <w:br/>
+        <w:t>2. Execute Database/SmartMedDB.sql from the project folder.</w:t>
+      </w:r>
+      <w:r>
+        <w:rPr>
+          <w:rFonts w:ascii="Times New Roman" w:hAnsi="Times New Roman"/>
+          <w:sz w:val="24"/>
+        </w:rPr>
+        <w:br/>
+        <w:t>3. Confirm database SmartMedDB is created with seed data.</w:t>
       </w:r>
     </w:p>
     <w:p>
@@ -2105,7 +2466,24 @@
           <w:rFonts w:ascii="Times New Roman" w:hAnsi="Times New Roman"/>
           <w:sz w:val="24"/>
         </w:rPr>
-        <w:t>Customer : Person — CustomerID, Address; methods Register(), Login(), SearchMedicine(), PlaceOrder(), TrackOrder(), UpdateProfile() document intended behaviour; AuthService and forms implement the workflows.</w:t>
+        <w:lastRenderedPageBreak/>
+        <w:t>Connection string:</w:t>
+      </w:r>
+      <w:r>
+        <w:rPr>
+          <w:rFonts w:ascii="Times New Roman" w:hAnsi="Times New Roman"/>
+          <w:sz w:val="24"/>
+        </w:rPr>
+        <w:br/>
+        <w:t>1. Open SmartMed/App.config.</w:t>
+      </w:r>
+      <w:r>
+        <w:rPr>
+          <w:rFonts w:ascii="Times New Roman" w:hAnsi="Times New Roman"/>
+          <w:sz w:val="24"/>
+        </w:rPr>
+        <w:br/>
+        <w:t>2. Set the SmartMedDB connection string to match your SQL Server instance (e.g. local instance or LocalDB).</w:t>
       </w:r>
     </w:p>
     <w:p>
@@ -2118,11 +2496,67 @@
           <w:rFonts w:ascii="Times New Roman" w:hAnsi="Times New Roman"/>
           <w:sz w:val="24"/>
         </w:rPr>
-        <w:t>Admin : Person — AdminID, Username; Login() via AuthService.AdminLogin.</w:t>
+        <w:t>Build and run:</w:t>
+      </w:r>
+      <w:r>
+        <w:rPr>
+          <w:rFonts w:ascii="Times New Roman" w:hAnsi="Times New Roman"/>
+          <w:sz w:val="24"/>
+        </w:rPr>
+        <w:br/>
+        <w:t>1. Open SmartMed.sln in Visual Studio.</w:t>
+      </w:r>
+      <w:r>
+        <w:rPr>
+          <w:rFonts w:ascii="Times New Roman" w:hAnsi="Times New Roman"/>
+          <w:sz w:val="24"/>
+        </w:rPr>
+        <w:br/>
+        <w:t>2. Set SmartMed as the startup project.</w:t>
+      </w:r>
+      <w:r>
+        <w:rPr>
+          <w:rFonts w:ascii="Times New Roman" w:hAnsi="Times New Roman"/>
+          <w:sz w:val="24"/>
+        </w:rPr>
+        <w:br/>
+        <w:t>3. Build the solution (Ctrl+Shift+B) or run: dotnet build SmartMed.sln</w:t>
+      </w:r>
+      <w:r>
+        <w:rPr>
+          <w:rFonts w:ascii="Times New Roman" w:hAnsi="Times New Roman"/>
+          <w:sz w:val="24"/>
+        </w:rPr>
+        <w:br/>
+        <w:t>4. Press F5. The Login form appears.</w:t>
+      </w:r>
+      <w:r>
+        <w:rPr>
+          <w:rFonts w:ascii="Times New Roman" w:hAnsi="Times New Roman"/>
+          <w:sz w:val="24"/>
+        </w:rPr>
+        <w:br/>
+        <w:t>5. Admin login: username admin, password admin123.</w:t>
+      </w:r>
+      <w:r>
+        <w:rPr>
+          <w:rFonts w:ascii="Times New Roman" w:hAnsi="Times New Roman"/>
+          <w:sz w:val="24"/>
+        </w:rPr>
+        <w:br/>
+        <w:t>6. Customer: register via Register button or use sample credentials from the SQL seed script.</w:t>
       </w:r>
     </w:p>
     <w:p>
       <w:pPr>
+        <w:pStyle w:val="Heading2"/>
+      </w:pPr>
+      <w:r>
+        <w:t>Using the Application</w:t>
+      </w:r>
+    </w:p>
+    <w:p>
+      <w:pPr>
         <w:pStyle w:val="BodyText"/>
         <w:spacing w:line="360" w:lineRule="auto"/>
       </w:pPr>
@@ -2131,7 +2565,21 @@
           <w:rFonts w:ascii="Times New Roman" w:hAnsi="Times New Roman"/>
           <w:sz w:val="24"/>
         </w:rPr>
-        <w:t>Medicine — MedicineID, MedicineName, Category, Dosage, Price, StockQuantity, Supplier, ExpiryDate, RequiresPrescription; CRUD methods AddMedicine(), UpdateMedicine(), DeleteMedicine(), CheckExpiry().</w:t>
+        <w:t xml:space="preserve">Login </w:t>
+      </w:r>
+      <w:r>
+        <w:rPr>
+          <w:rFonts w:ascii="Times New Roman" w:hAnsi="Times New Roman"/>
+          <w:sz w:val="24"/>
+        </w:rPr>
+        <w:t>-</w:t>
+      </w:r>
+      <w:r>
+        <w:rPr>
+          <w:rFonts w:ascii="Times New Roman" w:hAnsi="Times New Roman"/>
+          <w:sz w:val="24"/>
+        </w:rPr>
+        <w:t xml:space="preserve"> select Admin or Customer role, enter credentials, click Login.</w:t>
       </w:r>
     </w:p>
     <w:p>
@@ -2144,7 +2592,21 @@
           <w:rFonts w:ascii="Times New Roman" w:hAnsi="Times New Roman"/>
           <w:sz w:val="24"/>
         </w:rPr>
-        <w:t>Order — OrderID, CustomerID, OrderDate, Status, TotalAmount.</w:t>
+        <w:t xml:space="preserve">Admin navigation </w:t>
+      </w:r>
+      <w:r>
+        <w:rPr>
+          <w:rFonts w:ascii="Times New Roman" w:hAnsi="Times New Roman"/>
+          <w:sz w:val="24"/>
+        </w:rPr>
+        <w:t>-</w:t>
+      </w:r>
+      <w:r>
+        <w:rPr>
+          <w:rFonts w:ascii="Times New Roman" w:hAnsi="Times New Roman"/>
+          <w:sz w:val="24"/>
+        </w:rPr>
+        <w:t xml:space="preserve"> use the sidebar: Dashboard Overview, Manage Medicines, Manage Customers, Manage Orders, Generate Reports, Logout.</w:t>
       </w:r>
     </w:p>
     <w:p>
@@ -2157,7 +2619,37 @@
           <w:rFonts w:ascii="Times New Roman" w:hAnsi="Times New Roman"/>
           <w:sz w:val="24"/>
         </w:rPr>
-        <w:t>OrderItem — links Order and Medicine with Quantity, UnitPrice, Subtotal.</w:t>
+        <w:t xml:space="preserve">Manage Medicines </w:t>
+      </w:r>
+      <w:r>
+        <w:rPr>
+          <w:rFonts w:ascii="Times New Roman" w:hAnsi="Times New Roman"/>
+          <w:sz w:val="24"/>
+        </w:rPr>
+        <w:t>-</w:t>
+      </w:r>
+      <w:r>
+        <w:rPr>
+          <w:rFonts w:ascii="Times New Roman" w:hAnsi="Times New Roman"/>
+          <w:sz w:val="24"/>
+        </w:rPr>
+        <w:t xml:space="preserve"> select a row in the grid to edit fields; use Add, Update, </w:t>
+      </w:r>
+      <w:proofErr w:type="gramStart"/>
+      <w:r>
+        <w:rPr>
+          <w:rFonts w:ascii="Times New Roman" w:hAnsi="Times New Roman"/>
+          <w:sz w:val="24"/>
+        </w:rPr>
+        <w:t>Delete</w:t>
+      </w:r>
+      <w:proofErr w:type="gramEnd"/>
+      <w:r>
+        <w:rPr>
+          <w:rFonts w:ascii="Times New Roman" w:hAnsi="Times New Roman"/>
+          <w:sz w:val="24"/>
+        </w:rPr>
+        <w:t xml:space="preserve"> buttons; view stock statistics at the top.</w:t>
       </w:r>
     </w:p>
     <w:p>
@@ -2170,7 +2662,37 @@
           <w:rFonts w:ascii="Times New Roman" w:hAnsi="Times New Roman"/>
           <w:sz w:val="24"/>
         </w:rPr>
-        <w:t>Prescription — PrescriptionID, CustomerID, PrescriptionFile, UploadDate, Status (table created; upload UI planned).</w:t>
+        <w:t xml:space="preserve">Manage Customers </w:t>
+      </w:r>
+      <w:r>
+        <w:rPr>
+          <w:rFonts w:ascii="Times New Roman" w:hAnsi="Times New Roman"/>
+          <w:sz w:val="24"/>
+        </w:rPr>
+        <w:t>-</w:t>
+      </w:r>
+      <w:r>
+        <w:rPr>
+          <w:rFonts w:ascii="Times New Roman" w:hAnsi="Times New Roman"/>
+          <w:sz w:val="24"/>
+        </w:rPr>
+        <w:t xml:space="preserve"> select a customer to edit name, email, phone, address; save or </w:t>
+      </w:r>
+      <w:proofErr w:type="gramStart"/>
+      <w:r>
+        <w:rPr>
+          <w:rFonts w:ascii="Times New Roman" w:hAnsi="Times New Roman"/>
+          <w:sz w:val="24"/>
+        </w:rPr>
+        <w:t>delete</w:t>
+      </w:r>
+      <w:proofErr w:type="gramEnd"/>
+      <w:r>
+        <w:rPr>
+          <w:rFonts w:ascii="Times New Roman" w:hAnsi="Times New Roman"/>
+          <w:sz w:val="24"/>
+        </w:rPr>
+        <w:t xml:space="preserve"> as needed.</w:t>
       </w:r>
     </w:p>
     <w:p>
@@ -2183,7 +2705,21 @@
           <w:rFonts w:ascii="Times New Roman" w:hAnsi="Times New Roman"/>
           <w:sz w:val="24"/>
         </w:rPr>
-        <w:t>Services: AuthService (AdminLogin, CustomerLogin, RegisterCustomer), ValidationService (input rules), SearchService (linear search and filters), ReportService (dashboard and report statistics), Session (CurrentAdmin, CurrentCustomer, Clear).</w:t>
+        <w:t xml:space="preserve">Manage Orders </w:t>
+      </w:r>
+      <w:r>
+        <w:rPr>
+          <w:rFonts w:ascii="Times New Roman" w:hAnsi="Times New Roman"/>
+          <w:sz w:val="24"/>
+        </w:rPr>
+        <w:t>-</w:t>
+      </w:r>
+      <w:r>
+        <w:rPr>
+          <w:rFonts w:ascii="Times New Roman" w:hAnsi="Times New Roman"/>
+          <w:sz w:val="24"/>
+        </w:rPr>
+        <w:t xml:space="preserve"> select an order, choose a new status from the dropdown, click Update Status.</w:t>
       </w:r>
     </w:p>
     <w:p>
@@ -2196,7 +2732,21 @@
           <w:rFonts w:ascii="Times New Roman" w:hAnsi="Times New Roman"/>
           <w:sz w:val="24"/>
         </w:rPr>
-        <w:t>Data repositories expose GetAll, GetById, Insert, Update, Delete, and query methods using parameterized SQL.</w:t>
+        <w:t xml:space="preserve">Reports </w:t>
+      </w:r>
+      <w:r>
+        <w:rPr>
+          <w:rFonts w:ascii="Times New Roman" w:hAnsi="Times New Roman"/>
+          <w:sz w:val="24"/>
+        </w:rPr>
+        <w:t>-</w:t>
+      </w:r>
+      <w:r>
+        <w:rPr>
+          <w:rFonts w:ascii="Times New Roman" w:hAnsi="Times New Roman"/>
+          <w:sz w:val="24"/>
+        </w:rPr>
+        <w:t xml:space="preserve"> switch tabs for Sales, Stock, and Customer Order History; summary tiles show key figures.</w:t>
       </w:r>
     </w:p>
     <w:p>
@@ -2209,7 +2759,21 @@
           <w:rFonts w:ascii="Times New Roman" w:hAnsi="Times New Roman"/>
           <w:sz w:val="24"/>
         </w:rPr>
-        <w:t>[Insert screenshot: Person, Customer, and Admin classes in Visual Studio Class View or Solution Explorer with properties visible.]</w:t>
+        <w:t xml:space="preserve">Registration </w:t>
+      </w:r>
+      <w:r>
+        <w:rPr>
+          <w:rFonts w:ascii="Times New Roman" w:hAnsi="Times New Roman"/>
+          <w:sz w:val="24"/>
+        </w:rPr>
+        <w:t>-</w:t>
+      </w:r>
+      <w:r>
+        <w:rPr>
+          <w:rFonts w:ascii="Times New Roman" w:hAnsi="Times New Roman"/>
+          <w:sz w:val="24"/>
+        </w:rPr>
+        <w:t xml:space="preserve"> customers complete the registration form with password confirmation; return to login after success.</w:t>
       </w:r>
     </w:p>
     <w:p>
@@ -2222,11 +2786,43 @@
           <w:rFonts w:ascii="Times New Roman" w:hAnsi="Times New Roman"/>
           <w:sz w:val="24"/>
         </w:rPr>
-        <w:t>[Insert screenshot: Medicine and Order classes showing properties and methods.]</w:t>
+        <w:t xml:space="preserve">Logout </w:t>
+      </w:r>
+      <w:proofErr w:type="gramStart"/>
+      <w:r>
+        <w:rPr>
+          <w:rFonts w:ascii="Times New Roman" w:hAnsi="Times New Roman"/>
+          <w:sz w:val="24"/>
+        </w:rPr>
+        <w:t xml:space="preserve">- </w:t>
+      </w:r>
+      <w:r>
+        <w:rPr>
+          <w:rFonts w:ascii="Times New Roman" w:hAnsi="Times New Roman"/>
+          <w:sz w:val="24"/>
+        </w:rPr>
+        <w:t xml:space="preserve"> use</w:t>
+      </w:r>
+      <w:proofErr w:type="gramEnd"/>
+      <w:r>
+        <w:rPr>
+          <w:rFonts w:ascii="Times New Roman" w:hAnsi="Times New Roman"/>
+          <w:sz w:val="24"/>
+        </w:rPr>
+        <w:t xml:space="preserve"> Logout in the sidebar or close (X) on the top bar to return to the login screen.</w:t>
       </w:r>
     </w:p>
     <w:p>
       <w:pPr>
+        <w:pStyle w:val="Heading1"/>
+      </w:pPr>
+      <w:r>
+        <w:lastRenderedPageBreak/>
+        <w:t>Reflection</w:t>
+      </w:r>
+    </w:p>
+    <w:p>
+      <w:pPr>
         <w:pStyle w:val="BodyText"/>
         <w:spacing w:line="360" w:lineRule="auto"/>
       </w:pPr>
@@ -2235,23 +2831,33 @@
           <w:rFonts w:ascii="Times New Roman" w:hAnsi="Times New Roman"/>
           <w:sz w:val="24"/>
         </w:rPr>
-        <w:t>[Insert screenshot: AuthService and MedicineRepository class structure.]</w:t>
+        <w:t>Developing SmartMed improved my understanding of C# object-oriented programming and event-driven Windows Forms applications. Moving from console programs to a multi-form desktop app required thinking about navigation (AdminShellForm), session state (Session service), and keeping SQL out of the UI layer.</w:t>
       </w:r>
     </w:p>
     <w:p>
       <w:pPr>
-        <w:pStyle w:val="Heading1"/>
-      </w:pPr>
-      <w:r>
-        <w:t>Implementation</w:t>
+        <w:pStyle w:val="BodyText"/>
+        <w:spacing w:line="360" w:lineRule="auto"/>
+      </w:pPr>
+      <w:r>
+        <w:rPr>
+          <w:rFonts w:ascii="Times New Roman" w:hAnsi="Times New Roman"/>
+          <w:sz w:val="24"/>
+        </w:rPr>
+        <w:t>I valued the folder structure (Forms, Models, Data, Services) because changes to MedicineRepository automatically benefited every form that loads medicines. Debugging login across LoginForm, AuthService, and AdminRepository with breakpoints showed how requests flow through layers.</w:t>
       </w:r>
     </w:p>
     <w:p>
       <w:pPr>
-        <w:pStyle w:val="Heading2"/>
-      </w:pPr>
-      <w:r>
-        <w:t>Brief Description of Functions</w:t>
+        <w:pStyle w:val="BodyText"/>
+        <w:spacing w:line="360" w:lineRule="auto"/>
+      </w:pPr>
+      <w:r>
+        <w:rPr>
+          <w:rFonts w:ascii="Times New Roman" w:hAnsi="Times New Roman"/>
+          <w:sz w:val="24"/>
+        </w:rPr>
+        <w:t>Challenges included configuring App.config so DatabaseHelper reads the connection string at runtime, and keeping WinForms layout manageable when building page content in code. Using DataGridView for CRUD screens and ValidationService for shared rules reduced duplication.</w:t>
       </w:r>
     </w:p>
     <w:p>
@@ -2264,7 +2870,7 @@
           <w:rFonts w:ascii="Times New Roman" w:hAnsi="Times New Roman"/>
           <w:sz w:val="24"/>
         </w:rPr>
-        <w:t>Program.Main — starts the application and opens LoginForm.</w:t>
+        <w:t>SearchService linear search was straightforward to implement and document, matching the coursework requirement. Future work includes completing the customer portal (cart, order tracking, profile), prescription upload, and PDF export for reports.</w:t>
       </w:r>
     </w:p>
     <w:p>
@@ -2277,11 +2883,19 @@
           <w:rFonts w:ascii="Times New Roman" w:hAnsi="Times New Roman"/>
           <w:sz w:val="24"/>
         </w:rPr>
-        <w:t>AuthService.AdminLogin / CustomerLogin — validate credentials through AdminRepository or CustomerRepository after ValidationService checks.</w:t>
+        <w:t>Working in Visual Studio 2022 and building with dotnet CLI gave flexibility. Overall the project strengthened skills in ADO.NET, layered design, and technical documentation aligned with UML diagrams in Docs/Diagrams/.</w:t>
       </w:r>
     </w:p>
     <w:p>
       <w:pPr>
+        <w:pStyle w:val="Heading1"/>
+      </w:pPr>
+      <w:r>
+        <w:t>Conclusion</w:t>
+      </w:r>
+    </w:p>
+    <w:p>
+      <w:pPr>
         <w:pStyle w:val="BodyText"/>
         <w:spacing w:line="360" w:lineRule="auto"/>
       </w:pPr>
@@ -2290,7 +2904,7 @@
           <w:rFonts w:ascii="Times New Roman" w:hAnsi="Times New Roman"/>
           <w:sz w:val="24"/>
         </w:rPr>
-        <w:t>AuthService.RegisterCustomer — validate customer fields and insert via CustomerRepository.</w:t>
+        <w:t>SmartMed Pharmacy Management System delivers a working admin desktop application for pharmacy inventory, customers, orders, dashboards, and reports. The implementation uses C# WinForms, SQL Server, and a clear layered architecture documented with architecture, use case, ER, class, and sequence diagrams.</w:t>
       </w:r>
     </w:p>
     <w:p>
@@ -2303,7 +2917,7 @@
           <w:rFonts w:ascii="Times New Roman" w:hAnsi="Times New Roman"/>
           <w:sz w:val="24"/>
         </w:rPr>
-        <w:t>SearchService.SearchByName — linear O(n) scan comparing MedicineName to keyword (case-insensitive Contains).</w:t>
+        <w:t>Mandatory admin requirements are met: login, medicine CRUD, customer management, order status updates, reports, and dashboard metrics. Customer registration and login are implemented; extended customer features are planned. Linear search and filtering satisfy the search-algorithm requirement.</w:t>
       </w:r>
     </w:p>
     <w:p>
@@ -2316,786 +2930,7 @@
           <w:rFonts w:ascii="Times New Roman" w:hAnsi="Times New Roman"/>
           <w:sz w:val="24"/>
         </w:rPr>
-        <w:t>SearchService.FilterByCategory / FilterByPriceRange — additional linear passes for filtering.</w:t>
-      </w:r>
-    </w:p>
-    <w:p>
-      <w:pPr>
-        <w:pStyle w:val="BodyText"/>
-        <w:spacing w:line="360" w:lineRule="auto"/>
-      </w:pPr>
-      <w:r>
-        <w:rPr>
-          <w:rFonts w:ascii="Times New Roman" w:hAnsi="Times New Roman"/>
-          <w:sz w:val="24"/>
-        </w:rPr>
-        <w:t>MedicineRepository.GetAll / Insert / Update / Delete — CRUD for medicine inventory.</w:t>
-      </w:r>
-    </w:p>
-    <w:p>
-      <w:pPr>
-        <w:pStyle w:val="BodyText"/>
-        <w:spacing w:line="360" w:lineRule="auto"/>
-      </w:pPr>
-      <w:r>
-        <w:rPr>
-          <w:rFonts w:ascii="Times New Roman" w:hAnsi="Times New Roman"/>
-          <w:sz w:val="24"/>
-        </w:rPr>
-        <w:t>OrderRepository — list orders, update status, and transactional order placement with stock updates.</w:t>
-      </w:r>
-    </w:p>
-    <w:p>
-      <w:pPr>
-        <w:pStyle w:val="BodyText"/>
-        <w:spacing w:line="360" w:lineRule="auto"/>
-      </w:pPr>
-      <w:r>
-        <w:rPr>
-          <w:rFonts w:ascii="Times New Roman" w:hAnsi="Times New Roman"/>
-          <w:sz w:val="24"/>
-        </w:rPr>
-        <w:t>ReportService — aggregate totals for dashboard and ReportsForm.</w:t>
-      </w:r>
-    </w:p>
-    <w:p>
-      <w:pPr>
-        <w:pStyle w:val="BodyText"/>
-        <w:spacing w:line="360" w:lineRule="auto"/>
-      </w:pPr>
-      <w:r>
-        <w:rPr>
-          <w:rFonts w:ascii="Times New Roman" w:hAnsi="Times New Roman"/>
-          <w:sz w:val="24"/>
-        </w:rPr>
-        <w:t>Admin forms — LoadMedicines, LoadCustomers, grid selection handlers, and Save/Delete button handlers bind UI to repositories.</w:t>
-      </w:r>
-    </w:p>
-    <w:p>
-      <w:pPr>
-        <w:pStyle w:val="Heading2"/>
-      </w:pPr>
-      <w:r>
-        <w:t>Code Snippets</w:t>
-      </w:r>
-    </w:p>
-    <w:p>
-      <w:pPr>
-        <w:pStyle w:val="BodyText"/>
-        <w:spacing w:line="360" w:lineRule="auto"/>
-      </w:pPr>
-      <w:r>
-        <w:rPr>
-          <w:rFonts w:ascii="Times New Roman" w:hAnsi="Times New Roman"/>
-          <w:sz w:val="24"/>
-        </w:rPr>
-        <w:t>Application entry point (Program.cs):</w:t>
-        <w:br/>
-        <w:t>Application.EnableVisualStyles();</w:t>
-        <w:br/>
-        <w:t>Application.Run(new LoginForm());</w:t>
-      </w:r>
-    </w:p>
-    <w:p>
-      <w:pPr>
-        <w:pStyle w:val="BodyText"/>
-        <w:spacing w:line="360" w:lineRule="auto"/>
-      </w:pPr>
-      <w:r>
-        <w:rPr>
-          <w:rFonts w:ascii="Times New Roman" w:hAnsi="Times New Roman"/>
-          <w:sz w:val="24"/>
-        </w:rPr>
-        <w:t>Linear search by medicine name (SearchService.cs):</w:t>
-        <w:br/>
-        <w:t>foreach (var medicine in medicines)</w:t>
-        <w:br/>
-        <w:t>{</w:t>
-        <w:br/>
-        <w:t xml:space="preserve">    if (medicine.MedicineName.ToLower().Contains(key))</w:t>
-        <w:br/>
-        <w:t xml:space="preserve">        results.Add(medicine);</w:t>
-        <w:br/>
-        <w:t>}</w:t>
-      </w:r>
-    </w:p>
-    <w:p>
-      <w:pPr>
-        <w:pStyle w:val="BodyText"/>
-        <w:spacing w:line="360" w:lineRule="auto"/>
-      </w:pPr>
-      <w:r>
-        <w:rPr>
-          <w:rFonts w:ascii="Times New Roman" w:hAnsi="Times New Roman"/>
-          <w:sz w:val="24"/>
-        </w:rPr>
-        <w:t>Admin login validation (AuthService.cs):</w:t>
-        <w:br/>
-        <w:t>if (ValidationService.IsNullOrWhiteSpace(username) || ValidationService.IsNullOrWhiteSpace(password))</w:t>
-        <w:br/>
-        <w:t xml:space="preserve">    throw new ArgumentException("Username and password are required.");</w:t>
-        <w:br/>
-        <w:t>return _adminRepo.GetByCredentials(username.Trim(), password);</w:t>
-      </w:r>
-    </w:p>
-    <w:p>
-      <w:pPr>
-        <w:pStyle w:val="BodyText"/>
-        <w:spacing w:line="360" w:lineRule="auto"/>
-      </w:pPr>
-      <w:r>
-        <w:rPr>
-          <w:rFonts w:ascii="Times New Roman" w:hAnsi="Times New Roman"/>
-          <w:sz w:val="24"/>
-        </w:rPr>
-        <w:t>Parameterized insert (MedicineRepository.cs):</w:t>
-        <w:br/>
-        <w:t>DatabaseHelper.ExecuteNonQuery(</w:t>
-        <w:br/>
-        <w:t xml:space="preserve">    "INSERT INTO Medicine (MedicineName, Category, ...) VALUES (@n, @c, ...)",</w:t>
-        <w:br/>
-        <w:t xml:space="preserve">    new SqlParameter("@n", item.MedicineName), ...);</w:t>
-      </w:r>
-    </w:p>
-    <w:p>
-      <w:pPr>
-        <w:pStyle w:val="Heading2"/>
-      </w:pPr>
-      <w:r>
-        <w:t>Output Screens</w:t>
-      </w:r>
-    </w:p>
-    <w:p>
-      <w:pPr>
-        <w:jc w:val="center"/>
-      </w:pPr>
-      <w:r>
-        <w:rPr>
-          <w:rFonts w:ascii="Times New Roman" w:hAnsi="Times New Roman"/>
-          <w:b/>
-          <w:sz w:val="22"/>
-        </w:rPr>
-        <w:t>Login screen</w:t>
-      </w:r>
-    </w:p>
-    <w:p>
-      <w:pPr>
-        <w:jc w:val="center"/>
-      </w:pPr>
-      <w:r>
-        <w:drawing>
-          <wp:inline xmlns:a="http://schemas.openxmlformats.org/drawingml/2006/main" xmlns:pic="http://schemas.openxmlformats.org/drawingml/2006/picture">
-            <wp:extent cx="5029200" cy="4037112"/>
-            <wp:docPr id="1768847210" name="Picture 1768847210"/>
-            <wp:cNvGraphicFramePr>
-              <a:graphicFrameLocks noChangeAspect="1"/>
-            </wp:cNvGraphicFramePr>
-            <a:graphic>
-              <a:graphicData uri="http://schemas.openxmlformats.org/drawingml/2006/picture">
-                <pic:pic>
-                  <pic:nvPicPr>
-                    <pic:cNvPr id="0" name="screen.png"/>
-                    <pic:cNvPicPr/>
-                  </pic:nvPicPr>
-                  <pic:blipFill>
-                    <a:blip r:embed="rId18"/>
-                    <a:stretch>
-                      <a:fillRect/>
-                    </a:stretch>
-                  </pic:blipFill>
-                  <pic:spPr>
-                    <a:xfrm>
-                      <a:off x="0" y="0"/>
-                      <a:ext cx="5029200" cy="4037112"/>
-                    </a:xfrm>
-                    <a:prstGeom prst="rect"/>
-                  </pic:spPr>
-                </pic:pic>
-              </a:graphicData>
-            </a:graphic>
-          </wp:inline>
-        </w:drawing>
-      </w:r>
-    </w:p>
-    <w:p>
-      <w:pPr>
-        <w:jc w:val="center"/>
-      </w:pPr>
-      <w:r>
-        <w:rPr>
-          <w:rFonts w:ascii="Times New Roman" w:hAnsi="Times New Roman"/>
-          <w:b/>
-          <w:sz w:val="22"/>
-        </w:rPr>
-        <w:t>Admin dashboard</w:t>
-      </w:r>
-    </w:p>
-    <w:p>
-      <w:pPr>
-        <w:jc w:val="center"/>
-      </w:pPr>
-      <w:r>
-        <w:drawing>
-          <wp:inline xmlns:a="http://schemas.openxmlformats.org/drawingml/2006/main" xmlns:pic="http://schemas.openxmlformats.org/drawingml/2006/picture">
-            <wp:extent cx="5029200" cy="4027289"/>
-            <wp:docPr id="1768847211" name="Picture 1768847211"/>
-            <wp:cNvGraphicFramePr>
-              <a:graphicFrameLocks noChangeAspect="1"/>
-            </wp:cNvGraphicFramePr>
-            <a:graphic>
-              <a:graphicData uri="http://schemas.openxmlformats.org/drawingml/2006/picture">
-                <pic:pic>
-                  <pic:nvPicPr>
-                    <pic:cNvPr id="0" name="screen.png"/>
-                    <pic:cNvPicPr/>
-                  </pic:nvPicPr>
-                  <pic:blipFill>
-                    <a:blip r:embed="rId19"/>
-                    <a:stretch>
-                      <a:fillRect/>
-                    </a:stretch>
-                  </pic:blipFill>
-                  <pic:spPr>
-                    <a:xfrm>
-                      <a:off x="0" y="0"/>
-                      <a:ext cx="5029200" cy="4027289"/>
-                    </a:xfrm>
-                    <a:prstGeom prst="rect"/>
-                  </pic:spPr>
-                </pic:pic>
-              </a:graphicData>
-            </a:graphic>
-          </wp:inline>
-        </w:drawing>
-      </w:r>
-    </w:p>
-    <w:p>
-      <w:pPr>
-        <w:jc w:val="center"/>
-      </w:pPr>
-      <w:r>
-        <w:rPr>
-          <w:rFonts w:ascii="Times New Roman" w:hAnsi="Times New Roman"/>
-          <w:b/>
-          <w:sz w:val="22"/>
-        </w:rPr>
-        <w:t>Manage medicines</w:t>
-      </w:r>
-    </w:p>
-    <w:p>
-      <w:pPr>
-        <w:jc w:val="center"/>
-      </w:pPr>
-      <w:r>
-        <w:drawing>
-          <wp:inline xmlns:a="http://schemas.openxmlformats.org/drawingml/2006/main" xmlns:pic="http://schemas.openxmlformats.org/drawingml/2006/picture">
-            <wp:extent cx="5029200" cy="4027289"/>
-            <wp:docPr id="1768847212" name="Picture 1768847212"/>
-            <wp:cNvGraphicFramePr>
-              <a:graphicFrameLocks noChangeAspect="1"/>
-            </wp:cNvGraphicFramePr>
-            <a:graphic>
-              <a:graphicData uri="http://schemas.openxmlformats.org/drawingml/2006/picture">
-                <pic:pic>
-                  <pic:nvPicPr>
-                    <pic:cNvPr id="0" name="screen.png"/>
-                    <pic:cNvPicPr/>
-                  </pic:nvPicPr>
-                  <pic:blipFill>
-                    <a:blip r:embed="rId20"/>
-                    <a:stretch>
-                      <a:fillRect/>
-                    </a:stretch>
-                  </pic:blipFill>
-                  <pic:spPr>
-                    <a:xfrm>
-                      <a:off x="0" y="0"/>
-                      <a:ext cx="5029200" cy="4027289"/>
-                    </a:xfrm>
-                    <a:prstGeom prst="rect"/>
-                  </pic:spPr>
-                </pic:pic>
-              </a:graphicData>
-            </a:graphic>
-          </wp:inline>
-        </w:drawing>
-      </w:r>
-    </w:p>
-    <w:p>
-      <w:pPr>
-        <w:jc w:val="center"/>
-      </w:pPr>
-      <w:r>
-        <w:rPr>
-          <w:rFonts w:ascii="Times New Roman" w:hAnsi="Times New Roman"/>
-          <w:b/>
-          <w:sz w:val="22"/>
-        </w:rPr>
-        <w:t>Manage customers</w:t>
-      </w:r>
-    </w:p>
-    <w:p>
-      <w:pPr>
-        <w:jc w:val="center"/>
-      </w:pPr>
-      <w:r>
-        <w:drawing>
-          <wp:inline xmlns:a="http://schemas.openxmlformats.org/drawingml/2006/main" xmlns:pic="http://schemas.openxmlformats.org/drawingml/2006/picture">
-            <wp:extent cx="5029200" cy="4027289"/>
-            <wp:docPr id="1768847213" name="Picture 1768847213"/>
-            <wp:cNvGraphicFramePr>
-              <a:graphicFrameLocks noChangeAspect="1"/>
-            </wp:cNvGraphicFramePr>
-            <a:graphic>
-              <a:graphicData uri="http://schemas.openxmlformats.org/drawingml/2006/picture">
-                <pic:pic>
-                  <pic:nvPicPr>
-                    <pic:cNvPr id="0" name="screen.png"/>
-                    <pic:cNvPicPr/>
-                  </pic:nvPicPr>
-                  <pic:blipFill>
-                    <a:blip r:embed="rId21"/>
-                    <a:stretch>
-                      <a:fillRect/>
-                    </a:stretch>
-                  </pic:blipFill>
-                  <pic:spPr>
-                    <a:xfrm>
-                      <a:off x="0" y="0"/>
-                      <a:ext cx="5029200" cy="4027289"/>
-                    </a:xfrm>
-                    <a:prstGeom prst="rect"/>
-                  </pic:spPr>
-                </pic:pic>
-              </a:graphicData>
-            </a:graphic>
-          </wp:inline>
-        </w:drawing>
-      </w:r>
-    </w:p>
-    <w:p>
-      <w:pPr>
-        <w:jc w:val="center"/>
-      </w:pPr>
-      <w:r>
-        <w:rPr>
-          <w:rFonts w:ascii="Times New Roman" w:hAnsi="Times New Roman"/>
-          <w:b/>
-          <w:sz w:val="22"/>
-        </w:rPr>
-        <w:t>Manage orders</w:t>
-      </w:r>
-    </w:p>
-    <w:p>
-      <w:pPr>
-        <w:jc w:val="center"/>
-      </w:pPr>
-      <w:r>
-        <w:drawing>
-          <wp:inline xmlns:a="http://schemas.openxmlformats.org/drawingml/2006/main" xmlns:pic="http://schemas.openxmlformats.org/drawingml/2006/picture">
-            <wp:extent cx="5029200" cy="4243388"/>
-            <wp:docPr id="1768847214" name="Picture 1768847214"/>
-            <wp:cNvGraphicFramePr>
-              <a:graphicFrameLocks noChangeAspect="1"/>
-            </wp:cNvGraphicFramePr>
-            <a:graphic>
-              <a:graphicData uri="http://schemas.openxmlformats.org/drawingml/2006/picture">
-                <pic:pic>
-                  <pic:nvPicPr>
-                    <pic:cNvPr id="0" name="screen.png"/>
-                    <pic:cNvPicPr/>
-                  </pic:nvPicPr>
-                  <pic:blipFill>
-                    <a:blip r:embed="rId22"/>
-                    <a:stretch>
-                      <a:fillRect/>
-                    </a:stretch>
-                  </pic:blipFill>
-                  <pic:spPr>
-                    <a:xfrm>
-                      <a:off x="0" y="0"/>
-                      <a:ext cx="5029200" cy="4243388"/>
-                    </a:xfrm>
-                    <a:prstGeom prst="rect"/>
-                  </pic:spPr>
-                </pic:pic>
-              </a:graphicData>
-            </a:graphic>
-          </wp:inline>
-        </w:drawing>
-      </w:r>
-    </w:p>
-    <w:p>
-      <w:pPr>
-        <w:jc w:val="center"/>
-      </w:pPr>
-      <w:r>
-        <w:rPr>
-          <w:rFonts w:ascii="Times New Roman" w:hAnsi="Times New Roman"/>
-          <w:b/>
-          <w:sz w:val="22"/>
-        </w:rPr>
-        <w:t>Generate reports</w:t>
-      </w:r>
-    </w:p>
-    <w:p>
-      <w:pPr>
-        <w:jc w:val="center"/>
-      </w:pPr>
-      <w:r>
-        <w:drawing>
-          <wp:inline xmlns:a="http://schemas.openxmlformats.org/drawingml/2006/main" xmlns:pic="http://schemas.openxmlformats.org/drawingml/2006/picture">
-            <wp:extent cx="5029200" cy="4027289"/>
-            <wp:docPr id="1768847215" name="Picture 1768847215"/>
-            <wp:cNvGraphicFramePr>
-              <a:graphicFrameLocks noChangeAspect="1"/>
-            </wp:cNvGraphicFramePr>
-            <a:graphic>
-              <a:graphicData uri="http://schemas.openxmlformats.org/drawingml/2006/picture">
-                <pic:pic>
-                  <pic:nvPicPr>
-                    <pic:cNvPr id="0" name="screen.png"/>
-                    <pic:cNvPicPr/>
-                  </pic:nvPicPr>
-                  <pic:blipFill>
-                    <a:blip r:embed="rId23"/>
-                    <a:stretch>
-                      <a:fillRect/>
-                    </a:stretch>
-                  </pic:blipFill>
-                  <pic:spPr>
-                    <a:xfrm>
-                      <a:off x="0" y="0"/>
-                      <a:ext cx="5029200" cy="4027289"/>
-                    </a:xfrm>
-                    <a:prstGeom prst="rect"/>
-                  </pic:spPr>
-                </pic:pic>
-              </a:graphicData>
-            </a:graphic>
-          </wp:inline>
-        </w:drawing>
-      </w:r>
-    </w:p>
-    <w:p>
-      <w:pPr>
-        <w:pStyle w:val="Heading1"/>
-      </w:pPr>
-      <w:r>
-        <w:t>User Manual</w:t>
-      </w:r>
-    </w:p>
-    <w:p>
-      <w:pPr>
-        <w:pStyle w:val="Heading2"/>
-      </w:pPr>
-      <w:r>
-        <w:t>Installation Guide</w:t>
-      </w:r>
-    </w:p>
-    <w:p>
-      <w:pPr>
-        <w:pStyle w:val="BodyText"/>
-        <w:spacing w:line="360" w:lineRule="auto"/>
-      </w:pPr>
-      <w:r>
-        <w:rPr>
-          <w:rFonts w:ascii="Times New Roman" w:hAnsi="Times New Roman"/>
-          <w:sz w:val="24"/>
-        </w:rPr>
-        <w:t>Prerequisites: Windows 10+, .NET Framework 4.8, SQL Server, Visual Studio 2019+ (optional for running the built executable).</w:t>
-      </w:r>
-    </w:p>
-    <w:p>
-      <w:pPr>
-        <w:pStyle w:val="BodyText"/>
-        <w:spacing w:line="360" w:lineRule="auto"/>
-      </w:pPr>
-      <w:r>
-        <w:rPr>
-          <w:rFonts w:ascii="Times New Roman" w:hAnsi="Times New Roman"/>
-          <w:sz w:val="24"/>
-        </w:rPr>
-        <w:t>Database setup:</w:t>
-        <w:br/>
-        <w:t>1. Open SQL Server Management Studio.</w:t>
-        <w:br/>
-        <w:t>2. Execute Database/SmartMedDB.sql from the project folder.</w:t>
-        <w:br/>
-        <w:t>3. Confirm database SmartMedDB is created with seed data.</w:t>
-      </w:r>
-    </w:p>
-    <w:p>
-      <w:pPr>
-        <w:pStyle w:val="BodyText"/>
-        <w:spacing w:line="360" w:lineRule="auto"/>
-      </w:pPr>
-      <w:r>
-        <w:rPr>
-          <w:rFonts w:ascii="Times New Roman" w:hAnsi="Times New Roman"/>
-          <w:sz w:val="24"/>
-        </w:rPr>
-        <w:t>Connection string:</w:t>
-        <w:br/>
-        <w:t>1. Open SmartMed/App.config.</w:t>
-        <w:br/>
-        <w:t>2. Set the SmartMedDB connection string to match your SQL Server instance (e.g. local instance or LocalDB).</w:t>
-      </w:r>
-    </w:p>
-    <w:p>
-      <w:pPr>
-        <w:pStyle w:val="BodyText"/>
-        <w:spacing w:line="360" w:lineRule="auto"/>
-      </w:pPr>
-      <w:r>
-        <w:rPr>
-          <w:rFonts w:ascii="Times New Roman" w:hAnsi="Times New Roman"/>
-          <w:sz w:val="24"/>
-        </w:rPr>
-        <w:t>Build and run:</w:t>
-        <w:br/>
-        <w:t>1. Open SmartMed.sln in Visual Studio.</w:t>
-        <w:br/>
-        <w:t>2. Set SmartMed as the startup project.</w:t>
-        <w:br/>
-        <w:t>3. Build the solution (Ctrl+Shift+B) or run: dotnet build SmartMed.sln</w:t>
-        <w:br/>
-        <w:t>4. Press F5. The Login form appears.</w:t>
-        <w:br/>
-        <w:t>5. Admin login: username admin, password admin123.</w:t>
-        <w:br/>
-        <w:t>6. Customer: register via Register button or use sample credentials from the SQL seed script.</w:t>
-      </w:r>
-    </w:p>
-    <w:p>
-      <w:pPr>
-        <w:pStyle w:val="Heading2"/>
-      </w:pPr>
-      <w:r>
-        <w:t>Using the Application</w:t>
-      </w:r>
-    </w:p>
-    <w:p>
-      <w:pPr>
-        <w:pStyle w:val="BodyText"/>
-        <w:spacing w:line="360" w:lineRule="auto"/>
-      </w:pPr>
-      <w:r>
-        <w:rPr>
-          <w:rFonts w:ascii="Times New Roman" w:hAnsi="Times New Roman"/>
-          <w:sz w:val="24"/>
-        </w:rPr>
-        <w:t>Login — select Admin or Customer role, enter credentials, click Login.</w:t>
-      </w:r>
-    </w:p>
-    <w:p>
-      <w:pPr>
-        <w:pStyle w:val="BodyText"/>
-        <w:spacing w:line="360" w:lineRule="auto"/>
-      </w:pPr>
-      <w:r>
-        <w:rPr>
-          <w:rFonts w:ascii="Times New Roman" w:hAnsi="Times New Roman"/>
-          <w:sz w:val="24"/>
-        </w:rPr>
-        <w:t>Admin navigation — use the sidebar: Dashboard Overview, Manage Medicines, Manage Customers, Manage Orders, Generate Reports, Logout.</w:t>
-      </w:r>
-    </w:p>
-    <w:p>
-      <w:pPr>
-        <w:pStyle w:val="BodyText"/>
-        <w:spacing w:line="360" w:lineRule="auto"/>
-      </w:pPr>
-      <w:r>
-        <w:rPr>
-          <w:rFonts w:ascii="Times New Roman" w:hAnsi="Times New Roman"/>
-          <w:sz w:val="24"/>
-        </w:rPr>
-        <w:t>Manage Medicines — select a row in the grid to edit fields; use Add, Update, Delete buttons; view stock statistics at the top.</w:t>
-      </w:r>
-    </w:p>
-    <w:p>
-      <w:pPr>
-        <w:pStyle w:val="BodyText"/>
-        <w:spacing w:line="360" w:lineRule="auto"/>
-      </w:pPr>
-      <w:r>
-        <w:rPr>
-          <w:rFonts w:ascii="Times New Roman" w:hAnsi="Times New Roman"/>
-          <w:sz w:val="24"/>
-        </w:rPr>
-        <w:t>Manage Customers — select a customer to edit name, email, phone, address; save or delete as needed.</w:t>
-      </w:r>
-    </w:p>
-    <w:p>
-      <w:pPr>
-        <w:pStyle w:val="BodyText"/>
-        <w:spacing w:line="360" w:lineRule="auto"/>
-      </w:pPr>
-      <w:r>
-        <w:rPr>
-          <w:rFonts w:ascii="Times New Roman" w:hAnsi="Times New Roman"/>
-          <w:sz w:val="24"/>
-        </w:rPr>
-        <w:t>Manage Orders — select an order, choose a new status from the dropdown, click Update Status.</w:t>
-      </w:r>
-    </w:p>
-    <w:p>
-      <w:pPr>
-        <w:pStyle w:val="BodyText"/>
-        <w:spacing w:line="360" w:lineRule="auto"/>
-      </w:pPr>
-      <w:r>
-        <w:rPr>
-          <w:rFonts w:ascii="Times New Roman" w:hAnsi="Times New Roman"/>
-          <w:sz w:val="24"/>
-        </w:rPr>
-        <w:t>Reports — switch tabs for Sales, Stock, and Customer Order History; summary tiles show key figures.</w:t>
-      </w:r>
-    </w:p>
-    <w:p>
-      <w:pPr>
-        <w:pStyle w:val="BodyText"/>
-        <w:spacing w:line="360" w:lineRule="auto"/>
-      </w:pPr>
-      <w:r>
-        <w:rPr>
-          <w:rFonts w:ascii="Times New Roman" w:hAnsi="Times New Roman"/>
-          <w:sz w:val="24"/>
-        </w:rPr>
-        <w:t>Registration — customers complete the registration form with password confirmation; return to login after success.</w:t>
-      </w:r>
-    </w:p>
-    <w:p>
-      <w:pPr>
-        <w:pStyle w:val="BodyText"/>
-        <w:spacing w:line="360" w:lineRule="auto"/>
-      </w:pPr>
-      <w:r>
-        <w:rPr>
-          <w:rFonts w:ascii="Times New Roman" w:hAnsi="Times New Roman"/>
-          <w:sz w:val="24"/>
-        </w:rPr>
-        <w:t>Logout — use Logout in the sidebar or close (X) on the top bar to return to the login screen.</w:t>
-      </w:r>
-    </w:p>
-    <w:p>
-      <w:pPr>
-        <w:pStyle w:val="Heading1"/>
-      </w:pPr>
-      <w:r>
-        <w:t>Reflection</w:t>
-      </w:r>
-    </w:p>
-    <w:p>
-      <w:pPr>
-        <w:pStyle w:val="BodyText"/>
-        <w:spacing w:line="360" w:lineRule="auto"/>
-      </w:pPr>
-      <w:r>
-        <w:rPr>
-          <w:rFonts w:ascii="Times New Roman" w:hAnsi="Times New Roman"/>
-          <w:sz w:val="24"/>
-        </w:rPr>
-        <w:t>Developing SmartMed improved my understanding of C# object-oriented programming and event-driven Windows Forms applications. Moving from console programs to a multi-form desktop app required thinking about navigation (AdminShellForm), session state (Session service), and keeping SQL out of the UI layer.</w:t>
-      </w:r>
-    </w:p>
-    <w:p>
-      <w:pPr>
-        <w:pStyle w:val="BodyText"/>
-        <w:spacing w:line="360" w:lineRule="auto"/>
-      </w:pPr>
-      <w:r>
-        <w:rPr>
-          <w:rFonts w:ascii="Times New Roman" w:hAnsi="Times New Roman"/>
-          <w:sz w:val="24"/>
-        </w:rPr>
-        <w:t>I valued the folder structure (Forms, Models, Data, Services) because changes to MedicineRepository automatically benefited every form that loads medicines. Debugging login across LoginForm, AuthService, and AdminRepository with breakpoints showed how requests flow through layers.</w:t>
-      </w:r>
-    </w:p>
-    <w:p>
-      <w:pPr>
-        <w:pStyle w:val="BodyText"/>
-        <w:spacing w:line="360" w:lineRule="auto"/>
-      </w:pPr>
-      <w:r>
-        <w:rPr>
-          <w:rFonts w:ascii="Times New Roman" w:hAnsi="Times New Roman"/>
-          <w:sz w:val="24"/>
-        </w:rPr>
-        <w:t>Challenges included configuring App.config so DatabaseHelper reads the connection string at runtime, and keeping WinForms layout manageable when building page content in code. Using DataGridView for CRUD screens and ValidationService for shared rules reduced duplication.</w:t>
-      </w:r>
-    </w:p>
-    <w:p>
-      <w:pPr>
-        <w:pStyle w:val="BodyText"/>
-        <w:spacing w:line="360" w:lineRule="auto"/>
-      </w:pPr>
-      <w:r>
-        <w:rPr>
-          <w:rFonts w:ascii="Times New Roman" w:hAnsi="Times New Roman"/>
-          <w:sz w:val="24"/>
-        </w:rPr>
-        <w:t>SearchService linear search was straightforward to implement and document, matching the coursework requirement. Future work includes completing the customer portal (cart, order tracking, profile), prescription upload, and PDF export for reports.</w:t>
-      </w:r>
-    </w:p>
-    <w:p>
-      <w:pPr>
-        <w:pStyle w:val="BodyText"/>
-        <w:spacing w:line="360" w:lineRule="auto"/>
-      </w:pPr>
-      <w:r>
-        <w:rPr>
-          <w:rFonts w:ascii="Times New Roman" w:hAnsi="Times New Roman"/>
-          <w:sz w:val="24"/>
-        </w:rPr>
-        <w:t>Working in Visual Studio 2022 and building with dotnet CLI gave flexibility. Overall the project strengthened skills in ADO.NET, layered design, and technical documentation aligned with UML diagrams in Docs/Diagrams/.</w:t>
-      </w:r>
-    </w:p>
-    <w:p>
-      <w:pPr>
-        <w:pStyle w:val="Heading1"/>
-      </w:pPr>
-      <w:r>
-        <w:t>Conclusion</w:t>
-      </w:r>
-    </w:p>
-    <w:p>
-      <w:pPr>
-        <w:pStyle w:val="BodyText"/>
-        <w:spacing w:line="360" w:lineRule="auto"/>
-      </w:pPr>
-      <w:r>
-        <w:rPr>
-          <w:rFonts w:ascii="Times New Roman" w:hAnsi="Times New Roman"/>
-          <w:sz w:val="24"/>
-        </w:rPr>
-        <w:t>SmartMed Pharmacy Management System delivers a working admin desktop application for pharmacy inventory, customers, orders, dashboards, and reports. The implementation uses C# WinForms, SQL Server, and a clear layered architecture documented with architecture, use case, ER, class, and sequence diagrams.</w:t>
-      </w:r>
-    </w:p>
-    <w:p>
-      <w:pPr>
-        <w:pStyle w:val="BodyText"/>
-        <w:spacing w:line="360" w:lineRule="auto"/>
-      </w:pPr>
-      <w:r>
-        <w:rPr>
-          <w:rFonts w:ascii="Times New Roman" w:hAnsi="Times New Roman"/>
-          <w:sz w:val="24"/>
-        </w:rPr>
-        <w:t>Mandatory admin requirements are met: login, medicine CRUD, customer management, order status updates, reports, and dashboard metrics. Customer registration and login are implemented; extended customer features are planned. Linear search and filtering satisfy the search-algorithm requirement.</w:t>
-      </w:r>
-    </w:p>
-    <w:p>
-      <w:pPr>
-        <w:pStyle w:val="BodyText"/>
-        <w:spacing w:line="360" w:lineRule="auto"/>
-      </w:pPr>
-      <w:r>
-        <w:rPr>
-          <w:rFonts w:ascii="Times New Roman" w:hAnsi="Times New Roman"/>
-          <w:sz w:val="24"/>
-        </w:rPr>
+        <w:lastRenderedPageBreak/>
         <w:t>The report follows the coursework breakdown: requirements, design diagrams, class descriptions, implementation details, user manual, reflection, and conclusion. The solution is runnable against SmartMedDB seed data and suitable for demonstration and assessment.</w:t>
       </w:r>
     </w:p>

</xml_diff>

<commit_message>
Enhance SmartMed Report and fill_report.py for improved clarity and functionality
- Updated the introduction section in SmartMed Report.docx to provide a clearer overview of the system's purpose and functionality.
- Refined the structure and content of the report to better reflect the system's architecture and user roles.
- Modified fill_report.py to ensure safe report generation by implementing a temporary file save mechanism, enhancing reliability during updates.
</commit_message>
<xml_diff>
--- a/Docs/Report/SmartMed Report.docx
+++ b/Docs/Report/SmartMed Report.docx
@@ -1273,7 +1273,37 @@
           <w:rFonts w:ascii="Times New Roman" w:hAnsi="Times New Roman"/>
           <w:sz w:val="24"/>
         </w:rPr>
-        <w:t>SmartMed Pharmacy Management System is a desktop Windows Forms application developed in C# on .NET Framework 4.8. The system supports pharmacy operations for two roles: administrators who manage inventory, customers, and orders, and customers who register, log in, search medicines, and place orders.</w:t>
+        <w:t>This report presents SmartMed, a pharmacy management system</w:t>
+      </w:r>
+      <w:r>
+        <w:rPr>
+          <w:rFonts w:ascii="Times New Roman" w:hAnsi="Times New Roman"/>
+          <w:sz w:val="24"/>
+        </w:rPr>
+        <w:t xml:space="preserve">. </w:t>
+      </w:r>
+      <w:r>
+        <w:rPr>
+          <w:rFonts w:ascii="Times New Roman" w:hAnsi="Times New Roman"/>
+          <w:sz w:val="24"/>
+        </w:rPr>
+        <w:t xml:space="preserve">The application is intended to help a small pharmacy </w:t>
+      </w:r>
+      <w:proofErr w:type="gramStart"/>
+      <w:r>
+        <w:rPr>
+          <w:rFonts w:ascii="Times New Roman" w:hAnsi="Times New Roman"/>
+          <w:sz w:val="24"/>
+        </w:rPr>
+        <w:t>handle</w:t>
+      </w:r>
+      <w:proofErr w:type="gramEnd"/>
+      <w:r>
+        <w:rPr>
+          <w:rFonts w:ascii="Times New Roman" w:hAnsi="Times New Roman"/>
+          <w:sz w:val="24"/>
+        </w:rPr>
+        <w:t xml:space="preserve"> routine work through one Windows desktop program instead of depending on paper records or scattered files. Two user types are supported: an admin who manages the pharmacy operation, and a customer who signs in to use the customer-facing side of the system. Both roles enter through the same login screen, but each user sees only the features relevant to that role.</w:t>
       </w:r>
     </w:p>
     <w:p>
@@ -1286,27 +1316,54 @@
           <w:rFonts w:ascii="Times New Roman" w:hAnsi="Times New Roman"/>
           <w:sz w:val="24"/>
         </w:rPr>
-        <w:t>The main objectives are to digitise medicine stock control, customer records, and order fulfilment; provide searchable medicine catalogues using linear search and filtering; and present sales and stock information through admin dashboards and reports. Data is stored in Microsoft SQL Server using a layered design: Forms (presentation), Services (business logic), Data (repositories), and Models (entity classes).</w:t>
+        <w:t>The system was built using C# with Windows Forms on .NET Framework 4.8, which is well suited to a desktop business application of this kind. Persistent data is stored in a SQL Server database, with ADO.NET used to connect the forms to the database through helper and repository classes. The project structure separates the user interface, business logic, and data access</w:t>
+      </w:r>
+      <w:r>
+        <w:rPr>
+          <w:rFonts w:ascii="Times New Roman" w:hAnsi="Times New Roman"/>
+          <w:sz w:val="24"/>
+        </w:rPr>
+        <w:t xml:space="preserve">, </w:t>
+      </w:r>
+      <w:r>
+        <w:rPr>
+          <w:rFonts w:ascii="Times New Roman" w:hAnsi="Times New Roman"/>
+          <w:sz w:val="24"/>
+        </w:rPr>
+        <w:t>which makes the codebase easier to follow as features are added. Supporting diagrams such as use case, class, and sequence models were prepared to plan and explain how the system behaves.</w:t>
       </w:r>
     </w:p>
     <w:p>
       <w:pPr>
-        <w:pStyle w:val="Heading1"/>
-      </w:pPr>
-      <w:r>
-        <w:t>System Requirements</w:t>
+        <w:pStyle w:val="BodyText"/>
+        <w:spacing w:line="360" w:lineRule="auto"/>
+      </w:pPr>
+      <w:r>
+        <w:rPr>
+          <w:rFonts w:ascii="Times New Roman" w:hAnsi="Times New Roman"/>
+          <w:sz w:val="24"/>
+        </w:rPr>
+        <w:t>The overall aim was to apply object-oriented programming in a practical desktop application that a pharmacy could realistically use. Key goals included reliable login for both roles, keeping stock and order information accurate, and giving the admin useful dashboard and report information without manual calculations. Another priority was to keep the code readable and well organised so that further features could be added later without disrupting existing functionality.</w:t>
       </w:r>
     </w:p>
     <w:p>
       <w:pPr>
-        <w:pStyle w:val="Heading2"/>
-      </w:pPr>
-      <w:r>
-        <w:t>Functional Requirements</w:t>
+        <w:pStyle w:val="Heading1"/>
+      </w:pPr>
+      <w:r>
+        <w:t>System Requirements</w:t>
       </w:r>
     </w:p>
     <w:p>
       <w:pPr>
+        <w:pStyle w:val="Heading2"/>
+      </w:pPr>
+      <w:r>
+        <w:t>Functional Requirements</w:t>
+      </w:r>
+    </w:p>
+    <w:p>
+      <w:pPr>
         <w:pStyle w:val="BodyText"/>
         <w:spacing w:line="360" w:lineRule="auto"/>
       </w:pPr>
@@ -1355,6 +1412,13 @@
           <w:sz w:val="24"/>
         </w:rPr>
         <w:br/>
+      </w:r>
+      <w:r>
+        <w:rPr>
+          <w:rFonts w:ascii="Times New Roman" w:hAnsi="Times New Roman"/>
+          <w:sz w:val="24"/>
+        </w:rPr>
+        <w:lastRenderedPageBreak/>
         <w:t>• Generate Reports – Sales reports, stock reports, and customer order history.</w:t>
       </w:r>
       <w:r>
@@ -1445,13 +1509,6 @@
           <w:sz w:val="24"/>
         </w:rPr>
         <w:br/>
-      </w:r>
-      <w:r>
-        <w:rPr>
-          <w:rFonts w:ascii="Times New Roman" w:hAnsi="Times New Roman"/>
-          <w:sz w:val="24"/>
-        </w:rPr>
-        <w:lastRenderedPageBreak/>
         <w:t>• Include medicine expiry tracking notifications.</w:t>
       </w:r>
       <w:r>
@@ -1489,21 +1546,23 @@
           <w:rFonts w:ascii="Times New Roman" w:hAnsi="Times New Roman"/>
           <w:sz w:val="24"/>
         </w:rPr>
-        <w:t xml:space="preserve">• Usability </w:t>
+        <w:t>• Usability — role-based navigation via AdminShellForm sidebar; standard WinForms controls for data entry and grids.</w:t>
       </w:r>
       <w:r>
         <w:rPr>
           <w:rFonts w:ascii="Times New Roman" w:hAnsi="Times New Roman"/>
           <w:sz w:val="24"/>
         </w:rPr>
-        <w:t>-</w:t>
+        <w:br/>
+        <w:t>• Reliability — parameterized SQL queries prevent injection; validation runs before database access.</w:t>
       </w:r>
       <w:r>
         <w:rPr>
           <w:rFonts w:ascii="Times New Roman" w:hAnsi="Times New Roman"/>
           <w:sz w:val="24"/>
         </w:rPr>
-        <w:t xml:space="preserve"> role-based navigation via AdminShellForm sidebar; standard WinForms controls for data entry and grids.</w:t>
+        <w:br/>
+        <w:t>• Maintainability — separation of UI, services, and data access into distinct folders and namespaces.</w:t>
       </w:r>
       <w:r>
         <w:rPr>
@@ -1511,87 +1570,15 @@
           <w:sz w:val="24"/>
         </w:rPr>
         <w:br/>
-        <w:t xml:space="preserve">• Reliability </w:t>
+        <w:t>• Performance — linear search is acceptable for typical pharmacy catalogue sizes.</w:t>
       </w:r>
       <w:r>
         <w:rPr>
           <w:rFonts w:ascii="Times New Roman" w:hAnsi="Times New Roman"/>
           <w:sz w:val="24"/>
         </w:rPr>
-        <w:t>-</w:t>
-      </w:r>
-      <w:r>
-        <w:rPr>
-          <w:rFonts w:ascii="Times New Roman" w:hAnsi="Times New Roman"/>
-          <w:sz w:val="24"/>
-        </w:rPr>
-        <w:t xml:space="preserve"> parameterized SQL queries prevent injection; validation runs before database access.</w:t>
-      </w:r>
-      <w:r>
-        <w:rPr>
-          <w:rFonts w:ascii="Times New Roman" w:hAnsi="Times New Roman"/>
-          <w:sz w:val="24"/>
-        </w:rPr>
         <w:br/>
-        <w:t xml:space="preserve">• Maintainability </w:t>
-      </w:r>
-      <w:r>
-        <w:rPr>
-          <w:rFonts w:ascii="Times New Roman" w:hAnsi="Times New Roman"/>
-          <w:sz w:val="24"/>
-        </w:rPr>
-        <w:t>-</w:t>
-      </w:r>
-      <w:r>
-        <w:rPr>
-          <w:rFonts w:ascii="Times New Roman" w:hAnsi="Times New Roman"/>
-          <w:sz w:val="24"/>
-        </w:rPr>
-        <w:t xml:space="preserve"> separation of UI, services, and data access into distinct folders and namespaces.</w:t>
-      </w:r>
-      <w:r>
-        <w:rPr>
-          <w:rFonts w:ascii="Times New Roman" w:hAnsi="Times New Roman"/>
-          <w:sz w:val="24"/>
-        </w:rPr>
-        <w:br/>
-        <w:t xml:space="preserve">• Performance </w:t>
-      </w:r>
-      <w:r>
-        <w:rPr>
-          <w:rFonts w:ascii="Times New Roman" w:hAnsi="Times New Roman"/>
-          <w:sz w:val="24"/>
-        </w:rPr>
-        <w:t>-</w:t>
-      </w:r>
-      <w:r>
-        <w:rPr>
-          <w:rFonts w:ascii="Times New Roman" w:hAnsi="Times New Roman"/>
-          <w:sz w:val="24"/>
-        </w:rPr>
-        <w:t xml:space="preserve"> linear search is acceptable for typical pharmacy catalogue sizes.</w:t>
-      </w:r>
-      <w:r>
-        <w:rPr>
-          <w:rFonts w:ascii="Times New Roman" w:hAnsi="Times New Roman"/>
-          <w:sz w:val="24"/>
-        </w:rPr>
-        <w:br/>
-        <w:t xml:space="preserve">• Security </w:t>
-      </w:r>
-      <w:r>
-        <w:rPr>
-          <w:rFonts w:ascii="Times New Roman" w:hAnsi="Times New Roman"/>
-          <w:sz w:val="24"/>
-        </w:rPr>
-        <w:t>-</w:t>
-      </w:r>
-      <w:r>
-        <w:rPr>
-          <w:rFonts w:ascii="Times New Roman" w:hAnsi="Times New Roman"/>
-          <w:sz w:val="24"/>
-        </w:rPr>
-        <w:t xml:space="preserve"> passwords validated at login; session state held in Session service; admin and customer roles separated.</w:t>
+        <w:t>• Security — passwords validated at login; session state held in Session service; admin and customer roles separated.</w:t>
       </w:r>
     </w:p>
     <w:p>
@@ -1620,21 +1607,7 @@
           <w:sz w:val="24"/>
         </w:rPr>
         <w:br/>
-        <w:t xml:space="preserve">• Minimum </w:t>
-      </w:r>
-      <w:r>
-        <w:rPr>
-          <w:rFonts w:ascii="Times New Roman" w:hAnsi="Times New Roman"/>
-          <w:sz w:val="24"/>
-        </w:rPr>
-        <w:t>8</w:t>
-      </w:r>
-      <w:r>
-        <w:rPr>
-          <w:rFonts w:ascii="Times New Roman" w:hAnsi="Times New Roman"/>
-          <w:sz w:val="24"/>
-        </w:rPr>
-        <w:t xml:space="preserve"> GB RAM recommended for Visual Studio and SQL Server Express/LocalDB.</w:t>
+        <w:t>• Minimum 4 GB RAM recommended for Visual Studio and SQL Server Express/LocalDB.</w:t>
       </w:r>
       <w:r>
         <w:rPr>
@@ -1650,6 +1623,7 @@
         <w:pStyle w:val="Heading2"/>
       </w:pPr>
       <w:r>
+        <w:lastRenderedPageBreak/>
         <w:t>Software Requirements</w:t>
       </w:r>
     </w:p>
@@ -1663,6 +1637,14 @@
           <w:rFonts w:ascii="Times New Roman" w:hAnsi="Times New Roman"/>
           <w:sz w:val="24"/>
         </w:rPr>
+        <w:t>• Microsoft Windows 10 or later.</w:t>
+      </w:r>
+      <w:r>
+        <w:rPr>
+          <w:rFonts w:ascii="Times New Roman" w:hAnsi="Times New Roman"/>
+          <w:sz w:val="24"/>
+        </w:rPr>
+        <w:br/>
         <w:t>• .NET Framework 4.8.</w:t>
       </w:r>
       <w:r>
@@ -1671,7 +1653,7 @@
           <w:sz w:val="24"/>
         </w:rPr>
         <w:br/>
-        <w:t xml:space="preserve">• Microsoft SQL Server </w:t>
+        <w:t>• Microsoft SQL Server (Express, LocalDB, or full edition) with Windows Authentication.</w:t>
       </w:r>
       <w:r>
         <w:rPr>
@@ -1679,7 +1661,7 @@
           <w:sz w:val="24"/>
         </w:rPr>
         <w:br/>
-        <w:t xml:space="preserve">• Visual Studio 2019 or later with .NET desktop development workload </w:t>
+        <w:t>• Visual Studio 2019 or later with .NET desktop development workload (for building from source).</w:t>
       </w:r>
     </w:p>
     <w:p>
@@ -1708,23 +1690,23 @@
           <w:sz w:val="24"/>
         </w:rPr>
         <w:br/>
-        <w:t>• UI: Windows Forms (</w:t>
-      </w:r>
-      <w:proofErr w:type="gramStart"/>
+        <w:t>• UI: Windows Forms (System.Windows.Forms)</w:t>
+      </w:r>
       <w:r>
         <w:rPr>
           <w:rFonts w:ascii="Times New Roman" w:hAnsi="Times New Roman"/>
           <w:sz w:val="24"/>
         </w:rPr>
-        <w:t>System.Windows.Forms</w:t>
-      </w:r>
-      <w:proofErr w:type="gramEnd"/>
+        <w:br/>
+        <w:t>• Data access: ADO.NET (System.Data.SqlClient), parameterized commands via DatabaseHelper</w:t>
+      </w:r>
       <w:r>
         <w:rPr>
           <w:rFonts w:ascii="Times New Roman" w:hAnsi="Times New Roman"/>
           <w:sz w:val="24"/>
         </w:rPr>
-        <w:t>)</w:t>
+        <w:br/>
+        <w:t>• Database: Microsoft SQL Server — script Database/SmartMedDB.sql</w:t>
       </w:r>
       <w:r>
         <w:rPr>
@@ -1732,49 +1714,15 @@
           <w:sz w:val="24"/>
         </w:rPr>
         <w:br/>
-        <w:t>• Data access: ADO.NET (</w:t>
-      </w:r>
-      <w:proofErr w:type="spellStart"/>
-      <w:proofErr w:type="gramStart"/>
+        <w:t>• IDE: Visual Studio 2022; builds also supported via dotnet CLI</w:t>
+      </w:r>
       <w:r>
         <w:rPr>
           <w:rFonts w:ascii="Times New Roman" w:hAnsi="Times New Roman"/>
           <w:sz w:val="24"/>
         </w:rPr>
-        <w:t>System.Data.SqlClient</w:t>
-      </w:r>
-      <w:proofErr w:type="spellEnd"/>
-      <w:proofErr w:type="gramEnd"/>
-      <w:r>
-        <w:rPr>
-          <w:rFonts w:ascii="Times New Roman" w:hAnsi="Times New Roman"/>
-          <w:sz w:val="24"/>
-        </w:rPr>
-        <w:t>)</w:t>
-      </w:r>
-      <w:r>
-        <w:rPr>
-          <w:rFonts w:ascii="Times New Roman" w:hAnsi="Times New Roman"/>
-          <w:sz w:val="24"/>
-        </w:rPr>
         <w:br/>
-        <w:t xml:space="preserve">• Database: Microsoft SQL Server </w:t>
-      </w:r>
-      <w:r>
-        <w:rPr>
-          <w:rFonts w:ascii="Times New Roman" w:hAnsi="Times New Roman"/>
-          <w:sz w:val="24"/>
-        </w:rPr>
-        <w:br/>
-        <w:t>• IDE: Visual Studio 2022</w:t>
-      </w:r>
-      <w:r>
-        <w:rPr>
-          <w:rFonts w:ascii="Times New Roman" w:hAnsi="Times New Roman"/>
-          <w:sz w:val="24"/>
-        </w:rPr>
-        <w:br/>
-        <w:t xml:space="preserve">• Diagrams: draw.io </w:t>
+        <w:t>• Diagrams: draw.io files in Docs/Diagrams/ (Architecture, Use Case, ER, Class, Sequence)</w:t>
       </w:r>
     </w:p>
     <w:p>
@@ -1782,7 +1730,6 @@
         <w:pStyle w:val="Heading1"/>
       </w:pPr>
       <w:r>
-        <w:lastRenderedPageBreak/>
         <w:t>Design Diagrams</w:t>
       </w:r>
     </w:p>
@@ -1796,442 +1743,220 @@
     </w:p>
     <w:p>
       <w:pPr>
-        <w:jc w:val="center"/>
-      </w:pPr>
+        <w:pStyle w:val="BodyText"/>
+        <w:spacing w:line="360" w:lineRule="auto"/>
+      </w:pPr>
+      <w:r>
+        <w:rPr>
+          <w:rFonts w:ascii="Times New Roman" w:hAnsi="Times New Roman"/>
+          <w:sz w:val="24"/>
+        </w:rPr>
+        <w:t>The application follows a three-layer architecture documented in Docs/Diagrams/Architecture.drawio, covering both Admin and Customer modules:</w:t>
+      </w:r>
     </w:p>
     <w:p>
       <w:pPr>
-        <w:jc w:val="center"/>
+        <w:pStyle w:val="BodyText"/>
+        <w:spacing w:line="360" w:lineRule="auto"/>
       </w:pPr>
       <w:r>
         <w:rPr>
           <w:rFonts w:ascii="Times New Roman" w:hAnsi="Times New Roman"/>
-          <w:i/>
-          <w:sz w:val="20"/>
-        </w:rPr>
-        <w:t>Figure: Architecture Diagram</w:t>
+          <w:sz w:val="24"/>
+        </w:rPr>
+        <w:t>Presentation Layer (Forms/): shared LoginForm and RegistrationForm; admin forms (AdminShellForm, AdminDashboardForm, ManageMedicinesForm, ManageCustomersForm, ManageOrdersForm, ReportsForm); customer portal forms (CustomerDashboardForm, SearchMedicinesForm, PlaceOrderForm, TrackOrdersForm, ProfileManagementForm).</w:t>
       </w:r>
     </w:p>
     <w:p>
       <w:pPr>
-        <w:pStyle w:val="Heading2"/>
-      </w:pPr>
-      <w:r>
-        <w:t>Use Case Diagram</w:t>
+        <w:pStyle w:val="BodyText"/>
+        <w:spacing w:line="360" w:lineRule="auto"/>
+      </w:pPr>
+      <w:r>
+        <w:rPr>
+          <w:rFonts w:ascii="Times New Roman" w:hAnsi="Times New Roman"/>
+          <w:sz w:val="24"/>
+        </w:rPr>
+        <w:t>Application Layer (Services/ + Models/): models for Admin, Customer, Medicine, Order, OrderItem, Prescription; AuthService and Session for both roles; SearchService and MedicineService for customer search and ordering; MedicineService and ReportService for admin operations.</w:t>
       </w:r>
     </w:p>
     <w:p>
-      <w:r>
-        <w:rPr>
-          <w:noProof/>
-        </w:rPr>
-        <w:drawing>
-          <wp:inline distT="0" distB="0" distL="0" distR="0" wp14:anchorId="39929C56" wp14:editId="2CF07B85">
-            <wp:extent cx="5932805" cy="5546090"/>
-            <wp:effectExtent l="0" t="0" r="0" b="0"/>
-            <wp:docPr id="1659303593" name="Picture 2"/>
-            <wp:cNvGraphicFramePr>
-              <a:graphicFrameLocks xmlns:a="http://schemas.openxmlformats.org/drawingml/2006/main" noChangeAspect="1"/>
-            </wp:cNvGraphicFramePr>
-            <a:graphic xmlns:a="http://schemas.openxmlformats.org/drawingml/2006/main">
-              <a:graphicData uri="http://schemas.openxmlformats.org/drawingml/2006/picture">
-                <pic:pic xmlns:pic="http://schemas.openxmlformats.org/drawingml/2006/picture">
-                  <pic:nvPicPr>
-                    <pic:cNvPr id="0" name="Picture 1"/>
-                    <pic:cNvPicPr>
-                      <a:picLocks noChangeAspect="1" noChangeArrowheads="1"/>
-                    </pic:cNvPicPr>
-                  </pic:nvPicPr>
-                  <pic:blipFill>
-                    <a:blip r:embed="rId11">
-                      <a:extLst>
-                        <a:ext uri="{28A0092B-C50C-407E-A947-70E740481C1C}">
-                          <a14:useLocalDpi xmlns:a14="http://schemas.microsoft.com/office/drawing/2010/main" val="0"/>
-                        </a:ext>
-                      </a:extLst>
-                    </a:blip>
-                    <a:srcRect/>
-                    <a:stretch>
-                      <a:fillRect/>
-                    </a:stretch>
-                  </pic:blipFill>
-                  <pic:spPr bwMode="auto">
-                    <a:xfrm>
-                      <a:off x="0" y="0"/>
-                      <a:ext cx="5932805" cy="5546090"/>
-                    </a:xfrm>
-                    <a:prstGeom prst="rect">
-                      <a:avLst/>
-                    </a:prstGeom>
-                    <a:noFill/>
-                    <a:ln>
-                      <a:noFill/>
-                    </a:ln>
-                  </pic:spPr>
-                </pic:pic>
-              </a:graphicData>
-            </a:graphic>
-          </wp:inline>
-        </w:drawing>
+      <w:pPr>
+        <w:pStyle w:val="BodyText"/>
+        <w:spacing w:line="360" w:lineRule="auto"/>
+      </w:pPr>
+      <w:r>
+        <w:rPr>
+          <w:rFonts w:ascii="Times New Roman" w:hAnsi="Times New Roman"/>
+          <w:sz w:val="24"/>
+        </w:rPr>
+        <w:t xml:space="preserve">Data Layer (Data/): DatabaseHelper plus repositories — CustomerRepository and OrderRepository for registration, profile, place/track orders; MedicineRepository for search and </w:t>
+      </w:r>
+      <w:r>
+        <w:rPr>
+          <w:rFonts w:ascii="Times New Roman" w:hAnsi="Times New Roman"/>
+          <w:sz w:val="24"/>
+        </w:rPr>
+        <w:lastRenderedPageBreak/>
+        <w:t>inventory; AdminRepository for admin login; all repositories access SmartMedDB on SQL Server.</w:t>
       </w:r>
     </w:p>
     <w:p>
       <w:pPr>
-        <w:jc w:val="center"/>
-      </w:pPr>
-      <w:r>
-        <w:rPr>
-          <w:rFonts w:ascii="Times New Roman" w:hAnsi="Times New Roman"/>
-          <w:i/>
-          <w:sz w:val="20"/>
-        </w:rPr>
-        <w:t>Figure: Use Case Diagram</w:t>
+        <w:pStyle w:val="Heading2"/>
+      </w:pPr>
+      <w:r>
+        <w:t>Use Case Diagram</w:t>
       </w:r>
     </w:p>
     <w:p>
       <w:pPr>
-        <w:pStyle w:val="Heading2"/>
-      </w:pPr>
-      <w:r>
-        <w:lastRenderedPageBreak/>
-        <w:t>ER Diagram</w:t>
+        <w:pStyle w:val="BodyText"/>
+        <w:spacing w:line="360" w:lineRule="auto"/>
+      </w:pPr>
+      <w:r>
+        <w:rPr>
+          <w:rFonts w:ascii="Times New Roman" w:hAnsi="Times New Roman"/>
+          <w:sz w:val="24"/>
+        </w:rPr>
+        <w:t>Docs/Diagrams/Usecase.drawio defines actors Admin and Customer.</w:t>
       </w:r>
     </w:p>
     <w:p>
       <w:pPr>
-        <w:jc w:val="center"/>
-      </w:pPr>
-      <w:r>
-        <w:rPr>
-          <w:noProof/>
-        </w:rPr>
-        <w:drawing>
-          <wp:inline distT="0" distB="0" distL="0" distR="0" wp14:anchorId="093587F6" wp14:editId="314393D7">
-            <wp:extent cx="5937885" cy="4479290"/>
-            <wp:effectExtent l="0" t="0" r="5715" b="0"/>
-            <wp:docPr id="2028614983" name="Picture 3"/>
-            <wp:cNvGraphicFramePr>
-              <a:graphicFrameLocks xmlns:a="http://schemas.openxmlformats.org/drawingml/2006/main" noChangeAspect="1"/>
-            </wp:cNvGraphicFramePr>
-            <a:graphic xmlns:a="http://schemas.openxmlformats.org/drawingml/2006/main">
-              <a:graphicData uri="http://schemas.openxmlformats.org/drawingml/2006/picture">
-                <pic:pic xmlns:pic="http://schemas.openxmlformats.org/drawingml/2006/picture">
-                  <pic:nvPicPr>
-                    <pic:cNvPr id="0" name="Picture 2"/>
-                    <pic:cNvPicPr>
-                      <a:picLocks noChangeAspect="1" noChangeArrowheads="1"/>
-                    </pic:cNvPicPr>
-                  </pic:nvPicPr>
-                  <pic:blipFill>
-                    <a:blip r:embed="rId12">
-                      <a:extLst>
-                        <a:ext uri="{28A0092B-C50C-407E-A947-70E740481C1C}">
-                          <a14:useLocalDpi xmlns:a14="http://schemas.microsoft.com/office/drawing/2010/main" val="0"/>
-                        </a:ext>
-                      </a:extLst>
-                    </a:blip>
-                    <a:srcRect/>
-                    <a:stretch>
-                      <a:fillRect/>
-                    </a:stretch>
-                  </pic:blipFill>
-                  <pic:spPr bwMode="auto">
-                    <a:xfrm>
-                      <a:off x="0" y="0"/>
-                      <a:ext cx="5937885" cy="4479290"/>
-                    </a:xfrm>
-                    <a:prstGeom prst="rect">
-                      <a:avLst/>
-                    </a:prstGeom>
-                    <a:noFill/>
-                    <a:ln>
-                      <a:noFill/>
-                    </a:ln>
-                  </pic:spPr>
-                </pic:pic>
-              </a:graphicData>
-            </a:graphic>
-          </wp:inline>
-        </w:drawing>
+        <w:pStyle w:val="BodyText"/>
+        <w:spacing w:line="360" w:lineRule="auto"/>
+      </w:pPr>
+      <w:r>
+        <w:rPr>
+          <w:rFonts w:ascii="Times New Roman" w:hAnsi="Times New Roman"/>
+          <w:sz w:val="24"/>
+        </w:rPr>
+        <w:t>Admin use cases: login, dashboard overview, manage medicines, manage customers, manage orders, generate reports.</w:t>
       </w:r>
     </w:p>
     <w:p>
       <w:pPr>
-        <w:jc w:val="center"/>
+        <w:pStyle w:val="BodyText"/>
+        <w:spacing w:line="360" w:lineRule="auto"/>
       </w:pPr>
       <w:r>
         <w:rPr>
           <w:rFonts w:ascii="Times New Roman" w:hAnsi="Times New Roman"/>
-          <w:i/>
-          <w:sz w:val="20"/>
-        </w:rPr>
-        <w:t>Figure: ER Diagram</w:t>
+          <w:sz w:val="24"/>
+        </w:rPr>
+        <w:t>Customer use cases: register, login, search medicines, place order, track order, manage profile.</w:t>
       </w:r>
     </w:p>
     <w:p>
       <w:pPr>
-        <w:pStyle w:val="Heading2"/>
-      </w:pPr>
-      <w:r>
-        <w:lastRenderedPageBreak/>
-        <w:t>Class Diagram</w:t>
+        <w:pStyle w:val="BodyText"/>
+        <w:spacing w:line="360" w:lineRule="auto"/>
+      </w:pPr>
+      <w:r>
+        <w:rPr>
+          <w:rFonts w:ascii="Times New Roman" w:hAnsi="Times New Roman"/>
+          <w:sz w:val="24"/>
+        </w:rPr>
+        <w:t>Include relationships show that placing an order includes searching medicines. Implemented WinForms map directly to these use cases.</w:t>
       </w:r>
     </w:p>
     <w:p>
       <w:pPr>
-        <w:jc w:val="center"/>
-      </w:pPr>
-      <w:r>
-        <w:rPr>
-          <w:noProof/>
-        </w:rPr>
-        <w:drawing>
-          <wp:inline distT="0" distB="0" distL="0" distR="0" wp14:anchorId="44B61F7A" wp14:editId="3D179D8B">
-            <wp:extent cx="5937885" cy="4201795"/>
-            <wp:effectExtent l="0" t="0" r="5715" b="8255"/>
-            <wp:docPr id="721075322" name="Picture 5"/>
-            <wp:cNvGraphicFramePr>
-              <a:graphicFrameLocks xmlns:a="http://schemas.openxmlformats.org/drawingml/2006/main" noChangeAspect="1"/>
-            </wp:cNvGraphicFramePr>
-            <a:graphic xmlns:a="http://schemas.openxmlformats.org/drawingml/2006/main">
-              <a:graphicData uri="http://schemas.openxmlformats.org/drawingml/2006/picture">
-                <pic:pic xmlns:pic="http://schemas.openxmlformats.org/drawingml/2006/picture">
-                  <pic:nvPicPr>
-                    <pic:cNvPr id="0" name="Picture 4"/>
-                    <pic:cNvPicPr>
-                      <a:picLocks noChangeAspect="1" noChangeArrowheads="1"/>
-                    </pic:cNvPicPr>
-                  </pic:nvPicPr>
-                  <pic:blipFill>
-                    <a:blip r:embed="rId13">
-                      <a:extLst>
-                        <a:ext uri="{28A0092B-C50C-407E-A947-70E740481C1C}">
-                          <a14:useLocalDpi xmlns:a14="http://schemas.microsoft.com/office/drawing/2010/main" val="0"/>
-                        </a:ext>
-                      </a:extLst>
-                    </a:blip>
-                    <a:srcRect/>
-                    <a:stretch>
-                      <a:fillRect/>
-                    </a:stretch>
-                  </pic:blipFill>
-                  <pic:spPr bwMode="auto">
-                    <a:xfrm>
-                      <a:off x="0" y="0"/>
-                      <a:ext cx="5937885" cy="4201795"/>
-                    </a:xfrm>
-                    <a:prstGeom prst="rect">
-                      <a:avLst/>
-                    </a:prstGeom>
-                    <a:noFill/>
-                    <a:ln>
-                      <a:noFill/>
-                    </a:ln>
-                  </pic:spPr>
-                </pic:pic>
-              </a:graphicData>
-            </a:graphic>
-          </wp:inline>
-        </w:drawing>
+        <w:pStyle w:val="Heading2"/>
+      </w:pPr>
+      <w:r>
+        <w:t>ER Diagram</w:t>
       </w:r>
     </w:p>
     <w:p>
       <w:pPr>
-        <w:jc w:val="center"/>
+        <w:pStyle w:val="BodyText"/>
+        <w:spacing w:line="360" w:lineRule="auto"/>
       </w:pPr>
       <w:r>
         <w:rPr>
           <w:rFonts w:ascii="Times New Roman" w:hAnsi="Times New Roman"/>
-          <w:i/>
-          <w:sz w:val="20"/>
-        </w:rPr>
-        <w:t>Figure: Class Diagram</w:t>
+          <w:sz w:val="24"/>
+        </w:rPr>
+        <w:t>Docs/Diagrams/ER.drawio models six entities: Admin, Customer, Medicine, Order, OrderItem, and Prescription.</w:t>
       </w:r>
     </w:p>
     <w:p>
       <w:pPr>
-        <w:pStyle w:val="Heading2"/>
-      </w:pPr>
-      <w:r>
-        <w:lastRenderedPageBreak/>
-        <w:t>Sequence Diagram</w:t>
+        <w:pStyle w:val="BodyText"/>
+        <w:spacing w:line="360" w:lineRule="auto"/>
+      </w:pPr>
+      <w:r>
+        <w:rPr>
+          <w:rFonts w:ascii="Times New Roman" w:hAnsi="Times New Roman"/>
+          <w:sz w:val="24"/>
+        </w:rPr>
+        <w:t>Customer places Orders (one-to-many). Order contains OrderItems (one-to-many). Medicine appears in OrderItems. Customer may upload Prescriptions (one-to-many). Primary keys are identity integers. Database/SmartMedDB.sql implements this schema with foreign keys and a CHECK constraint on Order.Status.</w:t>
       </w:r>
     </w:p>
     <w:p>
       <w:pPr>
-        <w:jc w:val="center"/>
-      </w:pPr>
-      <w:r>
-        <w:rPr>
-          <w:noProof/>
-        </w:rPr>
-        <w:drawing>
-          <wp:inline distT="0" distB="0" distL="0" distR="0" wp14:anchorId="265EF689" wp14:editId="4E201405">
-            <wp:extent cx="5791200" cy="3291032"/>
-            <wp:effectExtent l="0" t="0" r="0" b="5080"/>
-            <wp:docPr id="414156896" name="Picture 6"/>
-            <wp:cNvGraphicFramePr>
-              <a:graphicFrameLocks xmlns:a="http://schemas.openxmlformats.org/drawingml/2006/main" noChangeAspect="1"/>
-            </wp:cNvGraphicFramePr>
-            <a:graphic xmlns:a="http://schemas.openxmlformats.org/drawingml/2006/main">
-              <a:graphicData uri="http://schemas.openxmlformats.org/drawingml/2006/picture">
-                <pic:pic xmlns:pic="http://schemas.openxmlformats.org/drawingml/2006/picture">
-                  <pic:nvPicPr>
-                    <pic:cNvPr id="0" name="Picture 5"/>
-                    <pic:cNvPicPr>
-                      <a:picLocks noChangeAspect="1" noChangeArrowheads="1"/>
-                    </pic:cNvPicPr>
-                  </pic:nvPicPr>
-                  <pic:blipFill>
-                    <a:blip r:embed="rId14">
-                      <a:extLst>
-                        <a:ext uri="{28A0092B-C50C-407E-A947-70E740481C1C}">
-                          <a14:useLocalDpi xmlns:a14="http://schemas.microsoft.com/office/drawing/2010/main" val="0"/>
-                        </a:ext>
-                      </a:extLst>
-                    </a:blip>
-                    <a:srcRect/>
-                    <a:stretch>
-                      <a:fillRect/>
-                    </a:stretch>
-                  </pic:blipFill>
-                  <pic:spPr bwMode="auto">
-                    <a:xfrm>
-                      <a:off x="0" y="0"/>
-                      <a:ext cx="5792525" cy="3291785"/>
-                    </a:xfrm>
-                    <a:prstGeom prst="rect">
-                      <a:avLst/>
-                    </a:prstGeom>
-                    <a:noFill/>
-                    <a:ln>
-                      <a:noFill/>
-                    </a:ln>
-                  </pic:spPr>
-                </pic:pic>
-              </a:graphicData>
-            </a:graphic>
-          </wp:inline>
-        </w:drawing>
+        <w:pStyle w:val="Heading2"/>
+      </w:pPr>
+      <w:r>
+        <w:t>Class Diagram</w:t>
       </w:r>
     </w:p>
     <w:p>
       <w:pPr>
-        <w:jc w:val="center"/>
+        <w:pStyle w:val="BodyText"/>
+        <w:spacing w:line="360" w:lineRule="auto"/>
+      </w:pPr>
+      <w:r>
         <w:rPr>
           <w:rFonts w:ascii="Times New Roman" w:hAnsi="Times New Roman"/>
-          <w:i/>
-          <w:sz w:val="20"/>
-        </w:rPr>
-      </w:pPr>
-      <w:r>
-        <w:rPr>
-          <w:rFonts w:ascii="Times New Roman" w:hAnsi="Times New Roman"/>
-          <w:i/>
-          <w:sz w:val="20"/>
-        </w:rPr>
-        <w:t>Figure: Sequence Diagram</w:t>
-      </w:r>
-      <w:r>
-        <w:rPr>
-          <w:rFonts w:ascii="Times New Roman" w:hAnsi="Times New Roman"/>
-          <w:i/>
-          <w:sz w:val="20"/>
-        </w:rPr>
-        <w:t>1</w:t>
+          <w:sz w:val="24"/>
+        </w:rPr>
+        <w:t>Docs/Diagrams/Class.drawio shows Person as the base class with Name, Email, Phone, Password. Customer and Admin inherit Person. Customer adds CustomerID and Address; Admin adds AdminID and Username.</w:t>
       </w:r>
     </w:p>
     <w:p>
       <w:pPr>
-        <w:jc w:val="center"/>
+        <w:pStyle w:val="BodyText"/>
+        <w:spacing w:line="360" w:lineRule="auto"/>
+      </w:pPr>
+      <w:r>
         <w:rPr>
           <w:rFonts w:ascii="Times New Roman" w:hAnsi="Times New Roman"/>
-          <w:i/>
-          <w:sz w:val="20"/>
-        </w:rPr>
-      </w:pPr>
-      <w:r>
-        <w:rPr>
-          <w:rFonts w:ascii="Times New Roman" w:hAnsi="Times New Roman"/>
-          <w:i/>
-          <w:noProof/>
-          <w:sz w:val="20"/>
-        </w:rPr>
-        <w:drawing>
-          <wp:inline distT="0" distB="0" distL="0" distR="0" wp14:anchorId="5041C743" wp14:editId="49EA9843">
-            <wp:extent cx="4903825" cy="3947160"/>
-            <wp:effectExtent l="0" t="0" r="0" b="0"/>
-            <wp:docPr id="1540573818" name="Picture 7"/>
-            <wp:cNvGraphicFramePr>
-              <a:graphicFrameLocks xmlns:a="http://schemas.openxmlformats.org/drawingml/2006/main" noChangeAspect="1"/>
-            </wp:cNvGraphicFramePr>
-            <a:graphic xmlns:a="http://schemas.openxmlformats.org/drawingml/2006/main">
-              <a:graphicData uri="http://schemas.openxmlformats.org/drawingml/2006/picture">
-                <pic:pic xmlns:pic="http://schemas.openxmlformats.org/drawingml/2006/picture">
-                  <pic:nvPicPr>
-                    <pic:cNvPr id="0" name="Picture 6"/>
-                    <pic:cNvPicPr>
-                      <a:picLocks noChangeAspect="1" noChangeArrowheads="1"/>
-                    </pic:cNvPicPr>
-                  </pic:nvPicPr>
-                  <pic:blipFill>
-                    <a:blip r:embed="rId15">
-                      <a:extLst>
-                        <a:ext uri="{28A0092B-C50C-407E-A947-70E740481C1C}">
-                          <a14:useLocalDpi xmlns:a14="http://schemas.microsoft.com/office/drawing/2010/main" val="0"/>
-                        </a:ext>
-                      </a:extLst>
-                    </a:blip>
-                    <a:srcRect/>
-                    <a:stretch>
-                      <a:fillRect/>
-                    </a:stretch>
-                  </pic:blipFill>
-                  <pic:spPr bwMode="auto">
-                    <a:xfrm>
-                      <a:off x="0" y="0"/>
-                      <a:ext cx="4908121" cy="3950618"/>
-                    </a:xfrm>
-                    <a:prstGeom prst="rect">
-                      <a:avLst/>
-                    </a:prstGeom>
-                    <a:noFill/>
-                    <a:ln>
-                      <a:noFill/>
-                    </a:ln>
-                  </pic:spPr>
-                </pic:pic>
-              </a:graphicData>
-            </a:graphic>
-          </wp:inline>
-        </w:drawing>
+          <w:sz w:val="24"/>
+        </w:rPr>
+        <w:t>Entity classes Medicine, Order, OrderItem, and Prescription model pharmacy domain objects. Services coordinate validation and repository calls; repositories map rows to Models.</w:t>
       </w:r>
     </w:p>
     <w:p>
       <w:pPr>
-        <w:jc w:val="center"/>
-      </w:pPr>
-      <w:r>
-        <w:rPr>
-          <w:rFonts w:ascii="Times New Roman" w:hAnsi="Times New Roman"/>
-          <w:i/>
-          <w:sz w:val="20"/>
-        </w:rPr>
-        <w:t>Figure: Sequence Diagram</w:t>
-      </w:r>
-      <w:r>
-        <w:rPr>
-          <w:rFonts w:ascii="Times New Roman" w:hAnsi="Times New Roman"/>
-          <w:i/>
-          <w:sz w:val="20"/>
-        </w:rPr>
-        <w:t>2</w:t>
+        <w:pStyle w:val="Heading2"/>
+      </w:pPr>
+      <w:r>
+        <w:t>Sequence Diagram</w:t>
       </w:r>
     </w:p>
     <w:p>
       <w:pPr>
-        <w:jc w:val="center"/>
-      </w:pPr>
+        <w:pStyle w:val="BodyText"/>
+        <w:spacing w:line="360" w:lineRule="auto"/>
+      </w:pPr>
+      <w:r>
+        <w:rPr>
+          <w:rFonts w:ascii="Times New Roman" w:hAnsi="Times New Roman"/>
+          <w:sz w:val="24"/>
+        </w:rPr>
+        <w:t xml:space="preserve">Docs/Diagrams/Sequence.drawio reflects the current single-project SmartMed architecture (Forms/, Services/, Data/, Models/). Repositories in Data/ always call DatabaseHelper before SmartMedDB. Services are used only where implemented: AuthService (login/registration), MedicineService (medicine CRUD), and ReportService (reports/dashboard stats). ManageOrdersForm and ManageCustomersForm call repositories directly with no service class. </w:t>
+      </w:r>
+      <w:r>
+        <w:rPr>
+          <w:rFonts w:ascii="Times New Roman" w:hAnsi="Times New Roman"/>
+          <w:sz w:val="24"/>
+        </w:rPr>
+        <w:lastRenderedPageBreak/>
+        <w:t>SD1 shows Form→Service→Repository; SD2 shows Form→Repository; SD3 shows medicine and report flows through services.</w:t>
+      </w:r>
     </w:p>
     <w:p>
       <w:pPr>
@@ -2243,171 +1968,213 @@
     </w:p>
     <w:p>
       <w:pPr>
-        <w:jc w:val="center"/>
-      </w:pPr>
+        <w:pStyle w:val="BodyText"/>
+        <w:spacing w:line="360" w:lineRule="auto"/>
+      </w:pPr>
+      <w:r>
+        <w:rPr>
+          <w:rFonts w:ascii="Times New Roman" w:hAnsi="Times New Roman"/>
+          <w:sz w:val="24"/>
+        </w:rPr>
+        <w:t>Database SmartMedDB contains tables Admin, Customer, Medicine, Order, OrderItem, and Prescription. Seed data includes a default admin (admin / admin123) and sample customers and medicines. Order.Status is limited to Pending, Ready for Pickup, or Delivered. OrderItem stores quantity, unit price, and subtotal at order time.</w:t>
+      </w:r>
     </w:p>
     <w:p>
       <w:pPr>
-        <w:jc w:val="center"/>
-      </w:pPr>
-      <w:r>
-        <w:rPr>
-          <w:rFonts w:ascii="Times New Roman" w:hAnsi="Times New Roman"/>
-          <w:i/>
-          <w:sz w:val="20"/>
-        </w:rPr>
-        <w:t>Figure: Database Design</w:t>
+        <w:pStyle w:val="Heading1"/>
+      </w:pPr>
+      <w:r>
+        <w:t>Description of Classes, Properties and Methods</w:t>
       </w:r>
     </w:p>
     <w:p>
       <w:pPr>
-        <w:pStyle w:val="Heading1"/>
-      </w:pPr>
-      <w:r>
-        <w:t>Description of Classes, Properties and Methods</w:t>
+        <w:pStyle w:val="BodyText"/>
+        <w:spacing w:line="360" w:lineRule="auto"/>
+      </w:pPr>
+      <w:r>
+        <w:rPr>
+          <w:rFonts w:ascii="Times New Roman" w:hAnsi="Times New Roman"/>
+          <w:sz w:val="24"/>
+        </w:rPr>
+        <w:t>The Models folder contains entity classes aligned with the class diagram.</w:t>
       </w:r>
     </w:p>
     <w:p>
       <w:pPr>
-        <w:pStyle w:val="Heading1"/>
-      </w:pPr>
-      <w:r>
-        <w:t>Implementation</w:t>
+        <w:pStyle w:val="BodyText"/>
+        <w:spacing w:line="360" w:lineRule="auto"/>
+      </w:pPr>
+      <w:r>
+        <w:rPr>
+          <w:rFonts w:ascii="Times New Roman" w:hAnsi="Times New Roman"/>
+          <w:sz w:val="24"/>
+        </w:rPr>
+        <w:t>Person — base class: Name, Email, Phone, Password.</w:t>
       </w:r>
     </w:p>
     <w:p>
       <w:pPr>
-        <w:pStyle w:val="Heading2"/>
-      </w:pPr>
-      <w:r>
-        <w:t>Brief Description of Functions</w:t>
+        <w:pStyle w:val="BodyText"/>
+        <w:spacing w:line="360" w:lineRule="auto"/>
+      </w:pPr>
+      <w:r>
+        <w:rPr>
+          <w:rFonts w:ascii="Times New Roman" w:hAnsi="Times New Roman"/>
+          <w:sz w:val="24"/>
+        </w:rPr>
+        <w:t>Customer : Person — CustomerID, Address; methods Register(), Login(), SearchMedicine(), PlaceOrder(), TrackOrder(), UpdateProfile() document intended behaviour; AuthService and forms implement the workflows.</w:t>
       </w:r>
     </w:p>
     <w:p>
       <w:pPr>
-        <w:pStyle w:val="Heading2"/>
-      </w:pPr>
-      <w:r>
-        <w:t>Code Snippets</w:t>
+        <w:pStyle w:val="BodyText"/>
+        <w:spacing w:line="360" w:lineRule="auto"/>
+      </w:pPr>
+      <w:r>
+        <w:rPr>
+          <w:rFonts w:ascii="Times New Roman" w:hAnsi="Times New Roman"/>
+          <w:sz w:val="24"/>
+        </w:rPr>
+        <w:t>Admin : Person — AdminID, Username; Login() via AuthService.AdminLogin.</w:t>
       </w:r>
     </w:p>
     <w:p>
       <w:pPr>
-        <w:pStyle w:val="Heading2"/>
-      </w:pPr>
-      <w:r>
-        <w:t>Output Screens</w:t>
+        <w:pStyle w:val="BodyText"/>
+        <w:spacing w:line="360" w:lineRule="auto"/>
+      </w:pPr>
+      <w:r>
+        <w:rPr>
+          <w:rFonts w:ascii="Times New Roman" w:hAnsi="Times New Roman"/>
+          <w:sz w:val="24"/>
+        </w:rPr>
+        <w:t>Medicine — MedicineID, MedicineName, Category, Dosage, Price, StockQuantity, Supplier, ExpiryDate, RequiresPrescription; CRUD methods AddMedicine(), UpdateMedicine(), DeleteMedicine(), CheckExpiry().</w:t>
       </w:r>
     </w:p>
     <w:p>
       <w:pPr>
-        <w:rPr>
-          <w:bCs/>
-        </w:rPr>
+        <w:pStyle w:val="BodyText"/>
+        <w:spacing w:line="360" w:lineRule="auto"/>
       </w:pPr>
       <w:r>
         <w:rPr>
           <w:rFonts w:ascii="Times New Roman" w:hAnsi="Times New Roman"/>
-          <w:bCs/>
-        </w:rPr>
-        <w:t>Login screen</w:t>
+          <w:sz w:val="24"/>
+        </w:rPr>
+        <w:t>Order — OrderID, CustomerID, OrderDate, Status, TotalAmount.</w:t>
       </w:r>
     </w:p>
     <w:p>
       <w:pPr>
-        <w:rPr>
-          <w:bCs/>
-        </w:rPr>
+        <w:pStyle w:val="BodyText"/>
+        <w:spacing w:line="360" w:lineRule="auto"/>
       </w:pPr>
       <w:r>
         <w:rPr>
           <w:rFonts w:ascii="Times New Roman" w:hAnsi="Times New Roman"/>
-          <w:bCs/>
-        </w:rPr>
-        <w:t>Admin dashboard</w:t>
+          <w:sz w:val="24"/>
+        </w:rPr>
+        <w:t>OrderItem — links Order and Medicine with Quantity, UnitPrice, Subtotal.</w:t>
       </w:r>
     </w:p>
     <w:p>
       <w:pPr>
-        <w:rPr>
-          <w:bCs/>
-        </w:rPr>
-      </w:pPr>
+        <w:pStyle w:val="BodyText"/>
+        <w:spacing w:line="360" w:lineRule="auto"/>
+      </w:pPr>
+      <w:r>
+        <w:rPr>
+          <w:rFonts w:ascii="Times New Roman" w:hAnsi="Times New Roman"/>
+          <w:sz w:val="24"/>
+        </w:rPr>
+        <w:t>Prescription — PrescriptionID, CustomerID, PrescriptionFile, UploadDate, Status (table created; upload UI planned).</w:t>
+      </w:r>
     </w:p>
     <w:p>
       <w:pPr>
-        <w:rPr>
-          <w:bCs/>
-        </w:rPr>
+        <w:pStyle w:val="BodyText"/>
+        <w:spacing w:line="360" w:lineRule="auto"/>
       </w:pPr>
       <w:r>
         <w:rPr>
           <w:rFonts w:ascii="Times New Roman" w:hAnsi="Times New Roman"/>
-          <w:bCs/>
-        </w:rPr>
-        <w:t>Manage medicines</w:t>
+          <w:sz w:val="24"/>
+        </w:rPr>
+        <w:t>Services: AuthService (AdminLogin, CustomerLogin, RegisterCustomer), ValidationService (input rules), SearchService (linear search and filters), ReportService (dashboard and report statistics), Session (CurrentAdmin, CurrentCustomer, Clear).</w:t>
       </w:r>
     </w:p>
     <w:p>
       <w:pPr>
-        <w:rPr>
-          <w:bCs/>
-        </w:rPr>
+        <w:pStyle w:val="BodyText"/>
+        <w:spacing w:line="360" w:lineRule="auto"/>
       </w:pPr>
       <w:r>
         <w:rPr>
           <w:rFonts w:ascii="Times New Roman" w:hAnsi="Times New Roman"/>
-          <w:bCs/>
-        </w:rPr>
-        <w:t>Manage customers</w:t>
+          <w:sz w:val="24"/>
+        </w:rPr>
+        <w:t>Data repositories expose GetAll, GetById, Insert, Update, Delete, and query methods using parameterized SQL.</w:t>
       </w:r>
     </w:p>
     <w:p>
       <w:pPr>
-        <w:rPr>
-          <w:bCs/>
-        </w:rPr>
+        <w:pStyle w:val="BodyText"/>
+        <w:spacing w:line="360" w:lineRule="auto"/>
       </w:pPr>
       <w:r>
         <w:rPr>
           <w:rFonts w:ascii="Times New Roman" w:hAnsi="Times New Roman"/>
-          <w:bCs/>
-        </w:rPr>
-        <w:t>Manage orders</w:t>
+          <w:sz w:val="24"/>
+        </w:rPr>
+        <w:lastRenderedPageBreak/>
+        <w:t>[Insert screenshot: Person, Customer, and Admin classes in Visual Studio Class View or Solution Explorer with properties visible.]</w:t>
       </w:r>
     </w:p>
     <w:p>
       <w:pPr>
-        <w:rPr>
-          <w:bCs/>
-        </w:rPr>
+        <w:pStyle w:val="BodyText"/>
+        <w:spacing w:line="360" w:lineRule="auto"/>
       </w:pPr>
       <w:r>
         <w:rPr>
           <w:rFonts w:ascii="Times New Roman" w:hAnsi="Times New Roman"/>
-          <w:bCs/>
-        </w:rPr>
-        <w:t>Generate reports</w:t>
+          <w:sz w:val="24"/>
+        </w:rPr>
+        <w:t>[Insert screenshot: Medicine and Order classes showing properties and methods.]</w:t>
       </w:r>
     </w:p>
     <w:p>
       <w:pPr>
-        <w:pStyle w:val="Heading1"/>
-      </w:pPr>
-      <w:r>
-        <w:t>User Manual</w:t>
+        <w:pStyle w:val="BodyText"/>
+        <w:spacing w:line="360" w:lineRule="auto"/>
+      </w:pPr>
+      <w:r>
+        <w:rPr>
+          <w:rFonts w:ascii="Times New Roman" w:hAnsi="Times New Roman"/>
+          <w:sz w:val="24"/>
+        </w:rPr>
+        <w:t>[Insert screenshot: AuthService and MedicineRepository class structure.]</w:t>
       </w:r>
     </w:p>
     <w:p>
       <w:pPr>
-        <w:pStyle w:val="Heading2"/>
-      </w:pPr>
-      <w:r>
-        <w:t>Installation Guide</w:t>
+        <w:pStyle w:val="Heading1"/>
+      </w:pPr>
+      <w:r>
+        <w:t>Implementation</w:t>
       </w:r>
     </w:p>
     <w:p>
       <w:pPr>
+        <w:pStyle w:val="Heading2"/>
+      </w:pPr>
+      <w:r>
+        <w:t>Brief Description of Functions</w:t>
+      </w:r>
+    </w:p>
+    <w:p>
+      <w:pPr>
         <w:pStyle w:val="BodyText"/>
         <w:spacing w:line="360" w:lineRule="auto"/>
       </w:pPr>
@@ -2416,7 +2183,7 @@
           <w:rFonts w:ascii="Times New Roman" w:hAnsi="Times New Roman"/>
           <w:sz w:val="24"/>
         </w:rPr>
-        <w:t>Prerequisites: Windows 10+, .NET Framework 4.8, SQL Server, Visual Studio 2019+ (optional for running the built executable).</w:t>
+        <w:t>Program.Main — starts the application and opens LoginForm.</w:t>
       </w:r>
     </w:p>
     <w:p>
@@ -2429,6 +2196,410 @@
           <w:rFonts w:ascii="Times New Roman" w:hAnsi="Times New Roman"/>
           <w:sz w:val="24"/>
         </w:rPr>
+        <w:t>AuthService.AdminLogin / CustomerLogin — validate credentials through AdminRepository or CustomerRepository after ValidationService checks.</w:t>
+      </w:r>
+    </w:p>
+    <w:p>
+      <w:pPr>
+        <w:pStyle w:val="BodyText"/>
+        <w:spacing w:line="360" w:lineRule="auto"/>
+      </w:pPr>
+      <w:r>
+        <w:rPr>
+          <w:rFonts w:ascii="Times New Roman" w:hAnsi="Times New Roman"/>
+          <w:sz w:val="24"/>
+        </w:rPr>
+        <w:t>AuthService.RegisterCustomer — validate customer fields and insert via CustomerRepository.</w:t>
+      </w:r>
+    </w:p>
+    <w:p>
+      <w:pPr>
+        <w:pStyle w:val="BodyText"/>
+        <w:spacing w:line="360" w:lineRule="auto"/>
+      </w:pPr>
+      <w:r>
+        <w:rPr>
+          <w:rFonts w:ascii="Times New Roman" w:hAnsi="Times New Roman"/>
+          <w:sz w:val="24"/>
+        </w:rPr>
+        <w:t>SearchService.SearchByName — linear O(n) scan comparing MedicineName to keyword (case-insensitive Contains).</w:t>
+      </w:r>
+    </w:p>
+    <w:p>
+      <w:pPr>
+        <w:pStyle w:val="BodyText"/>
+        <w:spacing w:line="360" w:lineRule="auto"/>
+      </w:pPr>
+      <w:r>
+        <w:rPr>
+          <w:rFonts w:ascii="Times New Roman" w:hAnsi="Times New Roman"/>
+          <w:sz w:val="24"/>
+        </w:rPr>
+        <w:t>SearchService.FilterByCategory / FilterByPriceRange — additional linear passes for filtering.</w:t>
+      </w:r>
+    </w:p>
+    <w:p>
+      <w:pPr>
+        <w:pStyle w:val="BodyText"/>
+        <w:spacing w:line="360" w:lineRule="auto"/>
+      </w:pPr>
+      <w:r>
+        <w:rPr>
+          <w:rFonts w:ascii="Times New Roman" w:hAnsi="Times New Roman"/>
+          <w:sz w:val="24"/>
+        </w:rPr>
+        <w:t>MedicineRepository.GetAll / Insert / Update / Delete — CRUD for medicine inventory.</w:t>
+      </w:r>
+    </w:p>
+    <w:p>
+      <w:pPr>
+        <w:pStyle w:val="BodyText"/>
+        <w:spacing w:line="360" w:lineRule="auto"/>
+      </w:pPr>
+      <w:r>
+        <w:rPr>
+          <w:rFonts w:ascii="Times New Roman" w:hAnsi="Times New Roman"/>
+          <w:sz w:val="24"/>
+        </w:rPr>
+        <w:t>OrderRepository — list orders, update status, and transactional order placement with stock updates.</w:t>
+      </w:r>
+    </w:p>
+    <w:p>
+      <w:pPr>
+        <w:pStyle w:val="BodyText"/>
+        <w:spacing w:line="360" w:lineRule="auto"/>
+      </w:pPr>
+      <w:r>
+        <w:rPr>
+          <w:rFonts w:ascii="Times New Roman" w:hAnsi="Times New Roman"/>
+          <w:sz w:val="24"/>
+        </w:rPr>
+        <w:t>ReportService — aggregate totals for dashboard and ReportsForm.</w:t>
+      </w:r>
+    </w:p>
+    <w:p>
+      <w:pPr>
+        <w:pStyle w:val="BodyText"/>
+        <w:spacing w:line="360" w:lineRule="auto"/>
+      </w:pPr>
+      <w:r>
+        <w:rPr>
+          <w:rFonts w:ascii="Times New Roman" w:hAnsi="Times New Roman"/>
+          <w:sz w:val="24"/>
+        </w:rPr>
+        <w:t>Admin forms — LoadMedicines, LoadCustomers, grid selection handlers, and Save/Delete button handlers bind UI to repositories.</w:t>
+      </w:r>
+    </w:p>
+    <w:p>
+      <w:pPr>
+        <w:pStyle w:val="Heading2"/>
+      </w:pPr>
+      <w:r>
+        <w:t>Code Snippets</w:t>
+      </w:r>
+    </w:p>
+    <w:p>
+      <w:pPr>
+        <w:pStyle w:val="BodyText"/>
+        <w:spacing w:line="360" w:lineRule="auto"/>
+      </w:pPr>
+      <w:r>
+        <w:rPr>
+          <w:rFonts w:ascii="Times New Roman" w:hAnsi="Times New Roman"/>
+          <w:sz w:val="24"/>
+        </w:rPr>
+        <w:t>Application entry point (Program.cs):</w:t>
+      </w:r>
+      <w:r>
+        <w:rPr>
+          <w:rFonts w:ascii="Times New Roman" w:hAnsi="Times New Roman"/>
+          <w:sz w:val="24"/>
+        </w:rPr>
+        <w:br/>
+        <w:t>Application.EnableVisualStyles();</w:t>
+      </w:r>
+      <w:r>
+        <w:rPr>
+          <w:rFonts w:ascii="Times New Roman" w:hAnsi="Times New Roman"/>
+          <w:sz w:val="24"/>
+        </w:rPr>
+        <w:br/>
+        <w:t>Application.Run(new LoginForm());</w:t>
+      </w:r>
+    </w:p>
+    <w:p>
+      <w:pPr>
+        <w:pStyle w:val="BodyText"/>
+        <w:spacing w:line="360" w:lineRule="auto"/>
+      </w:pPr>
+      <w:r>
+        <w:rPr>
+          <w:rFonts w:ascii="Times New Roman" w:hAnsi="Times New Roman"/>
+          <w:sz w:val="24"/>
+        </w:rPr>
+        <w:t>Linear search by medicine name (SearchService.cs):</w:t>
+      </w:r>
+      <w:r>
+        <w:rPr>
+          <w:rFonts w:ascii="Times New Roman" w:hAnsi="Times New Roman"/>
+          <w:sz w:val="24"/>
+        </w:rPr>
+        <w:br/>
+        <w:t>foreach (var medicine in medicines)</w:t>
+      </w:r>
+      <w:r>
+        <w:rPr>
+          <w:rFonts w:ascii="Times New Roman" w:hAnsi="Times New Roman"/>
+          <w:sz w:val="24"/>
+        </w:rPr>
+        <w:br/>
+        <w:t>{</w:t>
+      </w:r>
+      <w:r>
+        <w:rPr>
+          <w:rFonts w:ascii="Times New Roman" w:hAnsi="Times New Roman"/>
+          <w:sz w:val="24"/>
+        </w:rPr>
+        <w:br/>
+      </w:r>
+      <w:r>
+        <w:rPr>
+          <w:rFonts w:ascii="Times New Roman" w:hAnsi="Times New Roman"/>
+          <w:sz w:val="24"/>
+        </w:rPr>
+        <w:lastRenderedPageBreak/>
+        <w:t xml:space="preserve">    if (medicine.MedicineName.ToLower().Contains(key))</w:t>
+      </w:r>
+      <w:r>
+        <w:rPr>
+          <w:rFonts w:ascii="Times New Roman" w:hAnsi="Times New Roman"/>
+          <w:sz w:val="24"/>
+        </w:rPr>
+        <w:br/>
+        <w:t xml:space="preserve">        results.Add(medicine);</w:t>
+      </w:r>
+      <w:r>
+        <w:rPr>
+          <w:rFonts w:ascii="Times New Roman" w:hAnsi="Times New Roman"/>
+          <w:sz w:val="24"/>
+        </w:rPr>
+        <w:br/>
+        <w:t>}</w:t>
+      </w:r>
+    </w:p>
+    <w:p>
+      <w:pPr>
+        <w:pStyle w:val="BodyText"/>
+        <w:spacing w:line="360" w:lineRule="auto"/>
+      </w:pPr>
+      <w:r>
+        <w:rPr>
+          <w:rFonts w:ascii="Times New Roman" w:hAnsi="Times New Roman"/>
+          <w:sz w:val="24"/>
+        </w:rPr>
+        <w:t>Admin login validation (AuthService.cs):</w:t>
+      </w:r>
+      <w:r>
+        <w:rPr>
+          <w:rFonts w:ascii="Times New Roman" w:hAnsi="Times New Roman"/>
+          <w:sz w:val="24"/>
+        </w:rPr>
+        <w:br/>
+        <w:t>if (ValidationService.IsNullOrWhiteSpace(username) || ValidationService.IsNullOrWhiteSpace(password))</w:t>
+      </w:r>
+      <w:r>
+        <w:rPr>
+          <w:rFonts w:ascii="Times New Roman" w:hAnsi="Times New Roman"/>
+          <w:sz w:val="24"/>
+        </w:rPr>
+        <w:br/>
+        <w:t xml:space="preserve">    throw new ArgumentException("Username and password are required.");</w:t>
+      </w:r>
+      <w:r>
+        <w:rPr>
+          <w:rFonts w:ascii="Times New Roman" w:hAnsi="Times New Roman"/>
+          <w:sz w:val="24"/>
+        </w:rPr>
+        <w:br/>
+        <w:t>return _adminRepo.GetByCredentials(username.Trim(), password);</w:t>
+      </w:r>
+    </w:p>
+    <w:p>
+      <w:pPr>
+        <w:pStyle w:val="BodyText"/>
+        <w:spacing w:line="360" w:lineRule="auto"/>
+      </w:pPr>
+      <w:r>
+        <w:rPr>
+          <w:rFonts w:ascii="Times New Roman" w:hAnsi="Times New Roman"/>
+          <w:sz w:val="24"/>
+        </w:rPr>
+        <w:t>Parameterized insert (MedicineRepository.cs):</w:t>
+      </w:r>
+      <w:r>
+        <w:rPr>
+          <w:rFonts w:ascii="Times New Roman" w:hAnsi="Times New Roman"/>
+          <w:sz w:val="24"/>
+        </w:rPr>
+        <w:br/>
+        <w:t>DatabaseHelper.ExecuteNonQuery(</w:t>
+      </w:r>
+      <w:r>
+        <w:rPr>
+          <w:rFonts w:ascii="Times New Roman" w:hAnsi="Times New Roman"/>
+          <w:sz w:val="24"/>
+        </w:rPr>
+        <w:br/>
+        <w:t xml:space="preserve">    "INSERT INTO Medicine (MedicineName, Category, ...) VALUES (@n, @c, ...)",</w:t>
+      </w:r>
+      <w:r>
+        <w:rPr>
+          <w:rFonts w:ascii="Times New Roman" w:hAnsi="Times New Roman"/>
+          <w:sz w:val="24"/>
+        </w:rPr>
+        <w:br/>
+        <w:t xml:space="preserve">    new SqlParameter("@n", item.MedicineName), ...);</w:t>
+      </w:r>
+    </w:p>
+    <w:p>
+      <w:pPr>
+        <w:pStyle w:val="Heading2"/>
+      </w:pPr>
+      <w:r>
+        <w:t>Output Screens</w:t>
+      </w:r>
+    </w:p>
+    <w:p>
+      <w:pPr>
+        <w:pStyle w:val="BodyText"/>
+        <w:spacing w:line="360" w:lineRule="auto"/>
+      </w:pPr>
+      <w:r>
+        <w:rPr>
+          <w:rFonts w:ascii="Times New Roman" w:hAnsi="Times New Roman"/>
+          <w:sz w:val="24"/>
+        </w:rPr>
+        <w:t>[Insert screenshot: Login form — role selection, username/email, password.]</w:t>
+      </w:r>
+    </w:p>
+    <w:p>
+      <w:pPr>
+        <w:pStyle w:val="BodyText"/>
+        <w:spacing w:line="360" w:lineRule="auto"/>
+      </w:pPr>
+      <w:r>
+        <w:rPr>
+          <w:rFonts w:ascii="Times New Roman" w:hAnsi="Times New Roman"/>
+          <w:sz w:val="24"/>
+        </w:rPr>
+        <w:t>[Insert screenshot: Admin Dashboard — statistics cards, recent activity, alerts.]</w:t>
+      </w:r>
+    </w:p>
+    <w:p>
+      <w:pPr>
+        <w:pStyle w:val="BodyText"/>
+        <w:spacing w:line="360" w:lineRule="auto"/>
+      </w:pPr>
+      <w:r>
+        <w:rPr>
+          <w:rFonts w:ascii="Times New Roman" w:hAnsi="Times New Roman"/>
+          <w:sz w:val="24"/>
+        </w:rPr>
+        <w:t>[Insert screenshot: Manage Medicines — grid, add/update/delete form, stat tiles.]</w:t>
+      </w:r>
+    </w:p>
+    <w:p>
+      <w:pPr>
+        <w:pStyle w:val="BodyText"/>
+        <w:spacing w:line="360" w:lineRule="auto"/>
+      </w:pPr>
+      <w:r>
+        <w:rPr>
+          <w:rFonts w:ascii="Times New Roman" w:hAnsi="Times New Roman"/>
+          <w:sz w:val="24"/>
+        </w:rPr>
+        <w:t>[Insert screenshot: Manage Customers — customer grid and edit panel.]</w:t>
+      </w:r>
+    </w:p>
+    <w:p>
+      <w:pPr>
+        <w:pStyle w:val="BodyText"/>
+        <w:spacing w:line="360" w:lineRule="auto"/>
+      </w:pPr>
+      <w:r>
+        <w:rPr>
+          <w:rFonts w:ascii="Times New Roman" w:hAnsi="Times New Roman"/>
+          <w:sz w:val="24"/>
+        </w:rPr>
+        <w:t>[Insert screenshot: Manage Orders — order list and status update.]</w:t>
+      </w:r>
+    </w:p>
+    <w:p>
+      <w:pPr>
+        <w:pStyle w:val="BodyText"/>
+        <w:spacing w:line="360" w:lineRule="auto"/>
+      </w:pPr>
+      <w:r>
+        <w:rPr>
+          <w:rFonts w:ascii="Times New Roman" w:hAnsi="Times New Roman"/>
+          <w:sz w:val="24"/>
+        </w:rPr>
+        <w:t>[Insert screenshot: Generate Reports — sales/stock/history tabs.]</w:t>
+      </w:r>
+    </w:p>
+    <w:p>
+      <w:pPr>
+        <w:pStyle w:val="BodyText"/>
+        <w:spacing w:line="360" w:lineRule="auto"/>
+      </w:pPr>
+      <w:r>
+        <w:rPr>
+          <w:rFonts w:ascii="Times New Roman" w:hAnsi="Times New Roman"/>
+          <w:sz w:val="24"/>
+        </w:rPr>
+        <w:t>Design mock PNG files are available under Docs/DesignMocks/ for reference when capturing screenshots.</w:t>
+      </w:r>
+    </w:p>
+    <w:p>
+      <w:pPr>
+        <w:pStyle w:val="Heading1"/>
+      </w:pPr>
+      <w:r>
+        <w:t>User Manual</w:t>
+      </w:r>
+    </w:p>
+    <w:p>
+      <w:pPr>
+        <w:pStyle w:val="Heading2"/>
+      </w:pPr>
+      <w:r>
+        <w:t>Installation Guide</w:t>
+      </w:r>
+    </w:p>
+    <w:p>
+      <w:pPr>
+        <w:pStyle w:val="BodyText"/>
+        <w:spacing w:line="360" w:lineRule="auto"/>
+      </w:pPr>
+      <w:r>
+        <w:rPr>
+          <w:rFonts w:ascii="Times New Roman" w:hAnsi="Times New Roman"/>
+          <w:sz w:val="24"/>
+        </w:rPr>
+        <w:t>Prerequisites: Windows 10+, .NET Framework 4.8, SQL Server, Visual Studio 2019+ (optional for running the built executable).</w:t>
+      </w:r>
+    </w:p>
+    <w:p>
+      <w:pPr>
+        <w:pStyle w:val="BodyText"/>
+        <w:spacing w:line="360" w:lineRule="auto"/>
+      </w:pPr>
+      <w:r>
+        <w:rPr>
+          <w:rFonts w:ascii="Times New Roman" w:hAnsi="Times New Roman"/>
+          <w:sz w:val="24"/>
+        </w:rPr>
+        <w:lastRenderedPageBreak/>
         <w:t>Database setup:</w:t>
       </w:r>
       <w:r>
@@ -2466,7 +2637,6 @@
           <w:rFonts w:ascii="Times New Roman" w:hAnsi="Times New Roman"/>
           <w:sz w:val="24"/>
         </w:rPr>
-        <w:lastRenderedPageBreak/>
         <w:t>Connection string:</w:t>
       </w:r>
       <w:r>
@@ -2565,21 +2735,7 @@
           <w:rFonts w:ascii="Times New Roman" w:hAnsi="Times New Roman"/>
           <w:sz w:val="24"/>
         </w:rPr>
-        <w:t xml:space="preserve">Login </w:t>
-      </w:r>
-      <w:r>
-        <w:rPr>
-          <w:rFonts w:ascii="Times New Roman" w:hAnsi="Times New Roman"/>
-          <w:sz w:val="24"/>
-        </w:rPr>
-        <w:t>-</w:t>
-      </w:r>
-      <w:r>
-        <w:rPr>
-          <w:rFonts w:ascii="Times New Roman" w:hAnsi="Times New Roman"/>
-          <w:sz w:val="24"/>
-        </w:rPr>
-        <w:t xml:space="preserve"> select Admin or Customer role, enter credentials, click Login.</w:t>
+        <w:t>Login — select Admin or Customer role, enter credentials, click Login.</w:t>
       </w:r>
     </w:p>
     <w:p>
@@ -2592,21 +2748,7 @@
           <w:rFonts w:ascii="Times New Roman" w:hAnsi="Times New Roman"/>
           <w:sz w:val="24"/>
         </w:rPr>
-        <w:t xml:space="preserve">Admin navigation </w:t>
-      </w:r>
-      <w:r>
-        <w:rPr>
-          <w:rFonts w:ascii="Times New Roman" w:hAnsi="Times New Roman"/>
-          <w:sz w:val="24"/>
-        </w:rPr>
-        <w:t>-</w:t>
-      </w:r>
-      <w:r>
-        <w:rPr>
-          <w:rFonts w:ascii="Times New Roman" w:hAnsi="Times New Roman"/>
-          <w:sz w:val="24"/>
-        </w:rPr>
-        <w:t xml:space="preserve"> use the sidebar: Dashboard Overview, Manage Medicines, Manage Customers, Manage Orders, Generate Reports, Logout.</w:t>
+        <w:t>Admin navigation — use the sidebar: Dashboard Overview, Manage Medicines, Manage Customers, Manage Orders, Generate Reports, Logout.</w:t>
       </w:r>
     </w:p>
     <w:p>
@@ -2619,37 +2761,7 @@
           <w:rFonts w:ascii="Times New Roman" w:hAnsi="Times New Roman"/>
           <w:sz w:val="24"/>
         </w:rPr>
-        <w:t xml:space="preserve">Manage Medicines </w:t>
-      </w:r>
-      <w:r>
-        <w:rPr>
-          <w:rFonts w:ascii="Times New Roman" w:hAnsi="Times New Roman"/>
-          <w:sz w:val="24"/>
-        </w:rPr>
-        <w:t>-</w:t>
-      </w:r>
-      <w:r>
-        <w:rPr>
-          <w:rFonts w:ascii="Times New Roman" w:hAnsi="Times New Roman"/>
-          <w:sz w:val="24"/>
-        </w:rPr>
-        <w:t xml:space="preserve"> select a row in the grid to edit fields; use Add, Update, </w:t>
-      </w:r>
-      <w:proofErr w:type="gramStart"/>
-      <w:r>
-        <w:rPr>
-          <w:rFonts w:ascii="Times New Roman" w:hAnsi="Times New Roman"/>
-          <w:sz w:val="24"/>
-        </w:rPr>
-        <w:t>Delete</w:t>
-      </w:r>
-      <w:proofErr w:type="gramEnd"/>
-      <w:r>
-        <w:rPr>
-          <w:rFonts w:ascii="Times New Roman" w:hAnsi="Times New Roman"/>
-          <w:sz w:val="24"/>
-        </w:rPr>
-        <w:t xml:space="preserve"> buttons; view stock statistics at the top.</w:t>
+        <w:t>Manage Medicines — select a row in the grid to edit fields; use Add, Update, Delete buttons; view stock statistics at the top.</w:t>
       </w:r>
     </w:p>
     <w:p>
@@ -2662,37 +2774,7 @@
           <w:rFonts w:ascii="Times New Roman" w:hAnsi="Times New Roman"/>
           <w:sz w:val="24"/>
         </w:rPr>
-        <w:t xml:space="preserve">Manage Customers </w:t>
-      </w:r>
-      <w:r>
-        <w:rPr>
-          <w:rFonts w:ascii="Times New Roman" w:hAnsi="Times New Roman"/>
-          <w:sz w:val="24"/>
-        </w:rPr>
-        <w:t>-</w:t>
-      </w:r>
-      <w:r>
-        <w:rPr>
-          <w:rFonts w:ascii="Times New Roman" w:hAnsi="Times New Roman"/>
-          <w:sz w:val="24"/>
-        </w:rPr>
-        <w:t xml:space="preserve"> select a customer to edit name, email, phone, address; save or </w:t>
-      </w:r>
-      <w:proofErr w:type="gramStart"/>
-      <w:r>
-        <w:rPr>
-          <w:rFonts w:ascii="Times New Roman" w:hAnsi="Times New Roman"/>
-          <w:sz w:val="24"/>
-        </w:rPr>
-        <w:t>delete</w:t>
-      </w:r>
-      <w:proofErr w:type="gramEnd"/>
-      <w:r>
-        <w:rPr>
-          <w:rFonts w:ascii="Times New Roman" w:hAnsi="Times New Roman"/>
-          <w:sz w:val="24"/>
-        </w:rPr>
-        <w:t xml:space="preserve"> as needed.</w:t>
+        <w:t>Manage Customers — select a customer to edit name, email, phone, address; save or delete as needed.</w:t>
       </w:r>
     </w:p>
     <w:p>
@@ -2705,21 +2787,7 @@
           <w:rFonts w:ascii="Times New Roman" w:hAnsi="Times New Roman"/>
           <w:sz w:val="24"/>
         </w:rPr>
-        <w:t xml:space="preserve">Manage Orders </w:t>
-      </w:r>
-      <w:r>
-        <w:rPr>
-          <w:rFonts w:ascii="Times New Roman" w:hAnsi="Times New Roman"/>
-          <w:sz w:val="24"/>
-        </w:rPr>
-        <w:t>-</w:t>
-      </w:r>
-      <w:r>
-        <w:rPr>
-          <w:rFonts w:ascii="Times New Roman" w:hAnsi="Times New Roman"/>
-          <w:sz w:val="24"/>
-        </w:rPr>
-        <w:t xml:space="preserve"> select an order, choose a new status from the dropdown, click Update Status.</w:t>
+        <w:t>Manage Orders — select an order, choose a new status from the dropdown, click Update Status.</w:t>
       </w:r>
     </w:p>
     <w:p>
@@ -2732,21 +2800,7 @@
           <w:rFonts w:ascii="Times New Roman" w:hAnsi="Times New Roman"/>
           <w:sz w:val="24"/>
         </w:rPr>
-        <w:t xml:space="preserve">Reports </w:t>
-      </w:r>
-      <w:r>
-        <w:rPr>
-          <w:rFonts w:ascii="Times New Roman" w:hAnsi="Times New Roman"/>
-          <w:sz w:val="24"/>
-        </w:rPr>
-        <w:t>-</w:t>
-      </w:r>
-      <w:r>
-        <w:rPr>
-          <w:rFonts w:ascii="Times New Roman" w:hAnsi="Times New Roman"/>
-          <w:sz w:val="24"/>
-        </w:rPr>
-        <w:t xml:space="preserve"> switch tabs for Sales, Stock, and Customer Order History; summary tiles show key figures.</w:t>
+        <w:t>Reports — switch tabs for Sales, Stock, and Customer Order History; summary tiles show key figures.</w:t>
       </w:r>
     </w:p>
     <w:p>
@@ -2759,21 +2813,7 @@
           <w:rFonts w:ascii="Times New Roman" w:hAnsi="Times New Roman"/>
           <w:sz w:val="24"/>
         </w:rPr>
-        <w:t xml:space="preserve">Registration </w:t>
-      </w:r>
-      <w:r>
-        <w:rPr>
-          <w:rFonts w:ascii="Times New Roman" w:hAnsi="Times New Roman"/>
-          <w:sz w:val="24"/>
-        </w:rPr>
-        <w:t>-</w:t>
-      </w:r>
-      <w:r>
-        <w:rPr>
-          <w:rFonts w:ascii="Times New Roman" w:hAnsi="Times New Roman"/>
-          <w:sz w:val="24"/>
-        </w:rPr>
-        <w:t xml:space="preserve"> customers complete the registration form with password confirmation; return to login after success.</w:t>
+        <w:t>Registration — customers complete the registration form with password confirmation; return to login after success.</w:t>
       </w:r>
     </w:p>
     <w:p>
@@ -2786,30 +2826,8 @@
           <w:rFonts w:ascii="Times New Roman" w:hAnsi="Times New Roman"/>
           <w:sz w:val="24"/>
         </w:rPr>
-        <w:t xml:space="preserve">Logout </w:t>
-      </w:r>
-      <w:proofErr w:type="gramStart"/>
-      <w:r>
-        <w:rPr>
-          <w:rFonts w:ascii="Times New Roman" w:hAnsi="Times New Roman"/>
-          <w:sz w:val="24"/>
-        </w:rPr>
-        <w:t xml:space="preserve">- </w:t>
-      </w:r>
-      <w:r>
-        <w:rPr>
-          <w:rFonts w:ascii="Times New Roman" w:hAnsi="Times New Roman"/>
-          <w:sz w:val="24"/>
-        </w:rPr>
-        <w:t xml:space="preserve"> use</w:t>
-      </w:r>
-      <w:proofErr w:type="gramEnd"/>
-      <w:r>
-        <w:rPr>
-          <w:rFonts w:ascii="Times New Roman" w:hAnsi="Times New Roman"/>
-          <w:sz w:val="24"/>
-        </w:rPr>
-        <w:t xml:space="preserve"> Logout in the sidebar or close (X) on the top bar to return to the login screen.</w:t>
+        <w:lastRenderedPageBreak/>
+        <w:t>Logout — use Logout in the sidebar or close (X) on the top bar to return to the login screen.</w:t>
       </w:r>
     </w:p>
     <w:p>
@@ -2817,7 +2835,6 @@
         <w:pStyle w:val="Heading1"/>
       </w:pPr>
       <w:r>
-        <w:lastRenderedPageBreak/>
         <w:t>Reflection</w:t>
       </w:r>
     </w:p>
@@ -2917,7 +2934,15 @@
           <w:rFonts w:ascii="Times New Roman" w:hAnsi="Times New Roman"/>
           <w:sz w:val="24"/>
         </w:rPr>
-        <w:t>Mandatory admin requirements are met: login, medicine CRUD, customer management, order status updates, reports, and dashboard metrics. Customer registration and login are implemented; extended customer features are planned. Linear search and filtering satisfy the search-algorithm requirement.</w:t>
+        <w:t xml:space="preserve">Mandatory admin requirements are met: login, medicine CRUD, customer management, order status updates, reports, and dashboard metrics. Customer registration and login are implemented; </w:t>
+      </w:r>
+      <w:r>
+        <w:rPr>
+          <w:rFonts w:ascii="Times New Roman" w:hAnsi="Times New Roman"/>
+          <w:sz w:val="24"/>
+        </w:rPr>
+        <w:lastRenderedPageBreak/>
+        <w:t>extended customer features are planned. Linear search and filtering satisfy the search-algorithm requirement.</w:t>
       </w:r>
     </w:p>
     <w:p>
@@ -2930,7 +2955,6 @@
           <w:rFonts w:ascii="Times New Roman" w:hAnsi="Times New Roman"/>
           <w:sz w:val="24"/>
         </w:rPr>
-        <w:lastRenderedPageBreak/>
         <w:t>The report follows the coursework breakdown: requirements, design diagrams, class descriptions, implementation details, user manual, reflection, and conclusion. The solution is runnable against SmartMedDB seed data and suitable for demonstration and assessment.</w:t>
       </w:r>
     </w:p>

</xml_diff>

<commit_message>
Update SmartMed Report.docx to include author details and enhance design diagrams descriptions
- Added author information for the module leader and student at the beginning of the report.
- Expanded descriptions for the use case, ER, class, and sequence diagrams to clarify their roles and importance in the system design.
</commit_message>
<xml_diff>
--- a/Docs/Report/SmartMed Report.docx
+++ b/Docs/Report/SmartMed Report.docx
@@ -191,14 +191,104 @@
     <w:p>
       <w:pPr>
         <w:spacing w:line="360" w:lineRule="auto"/>
-        <w:jc w:val="both"/>
-      </w:pPr>
+        <w:jc w:val="center"/>
+        <w:rPr>
+          <w:color w:val="17365D" w:themeColor="text2" w:themeShade="BF"/>
+        </w:rPr>
+      </w:pPr>
+      <w:r>
+        <w:rPr>
+          <w:color w:val="17365D" w:themeColor="text2" w:themeShade="BF"/>
+        </w:rPr>
+        <w:t xml:space="preserve">Module </w:t>
+      </w:r>
+      <w:proofErr w:type="gramStart"/>
+      <w:r>
+        <w:rPr>
+          <w:color w:val="17365D" w:themeColor="text2" w:themeShade="BF"/>
+        </w:rPr>
+        <w:t>Leader :</w:t>
+      </w:r>
+      <w:proofErr w:type="gramEnd"/>
+      <w:r>
+        <w:rPr>
+          <w:color w:val="17365D" w:themeColor="text2" w:themeShade="BF"/>
+        </w:rPr>
+        <w:t xml:space="preserve"> </w:t>
+      </w:r>
+      <w:proofErr w:type="spellStart"/>
+      <w:proofErr w:type="gramStart"/>
+      <w:r>
+        <w:rPr>
+          <w:rFonts w:cstheme="majorBidi"/>
+          <w:bCs/>
+          <w:iCs/>
+          <w:color w:val="17365D" w:themeColor="text2" w:themeShade="BF"/>
+          <w:spacing w:val="-1"/>
+          <w:szCs w:val="24"/>
+        </w:rPr>
+        <w:t>Ms.Shifani</w:t>
+      </w:r>
+      <w:proofErr w:type="spellEnd"/>
+      <w:proofErr w:type="gramEnd"/>
+      <w:r>
+        <w:rPr>
+          <w:rFonts w:cstheme="majorBidi"/>
+          <w:bCs/>
+          <w:iCs/>
+          <w:color w:val="17365D" w:themeColor="text2" w:themeShade="BF"/>
+          <w:spacing w:val="-1"/>
+          <w:szCs w:val="24"/>
+        </w:rPr>
+        <w:t xml:space="preserve"> Mohideen</w:t>
+      </w:r>
     </w:p>
     <w:p>
       <w:pPr>
         <w:spacing w:line="360" w:lineRule="auto"/>
-        <w:jc w:val="both"/>
-      </w:pPr>
+        <w:jc w:val="center"/>
+        <w:rPr>
+          <w:rFonts w:cstheme="majorBidi"/>
+          <w:bCs/>
+          <w:iCs/>
+          <w:color w:val="17365D" w:themeColor="text2" w:themeShade="BF"/>
+          <w:szCs w:val="24"/>
+        </w:rPr>
+      </w:pPr>
+      <w:proofErr w:type="gramStart"/>
+      <w:r>
+        <w:rPr>
+          <w:color w:val="17365D" w:themeColor="text2" w:themeShade="BF"/>
+        </w:rPr>
+        <w:t>Student :</w:t>
+      </w:r>
+      <w:proofErr w:type="gramEnd"/>
+      <w:r>
+        <w:rPr>
+          <w:color w:val="17365D" w:themeColor="text2" w:themeShade="BF"/>
+        </w:rPr>
+        <w:t xml:space="preserve"> M.N Sahla Baanu – E301118 [</w:t>
+      </w:r>
+      <w:r>
+        <w:rPr>
+          <w:rFonts w:cstheme="majorBidi"/>
+          <w:bCs/>
+          <w:iCs/>
+          <w:color w:val="17365D" w:themeColor="text2" w:themeShade="BF"/>
+          <w:szCs w:val="24"/>
+        </w:rPr>
+        <w:t>25045082</w:t>
+      </w:r>
+      <w:r>
+        <w:rPr>
+          <w:rFonts w:cstheme="majorBidi"/>
+          <w:bCs/>
+          <w:iCs/>
+          <w:color w:val="17365D" w:themeColor="text2" w:themeShade="BF"/>
+          <w:szCs w:val="24"/>
+        </w:rPr>
+        <w:t>]</w:t>
+      </w:r>
     </w:p>
     <w:p>
       <w:pPr>
@@ -837,11 +927,15 @@
                               <w:jc w:val="both"/>
                               <w:rPr>
                                 <w:rFonts w:cstheme="majorBidi"/>
+                                <w:sz w:val="22"/>
+                                <w:szCs w:val="20"/>
                               </w:rPr>
                             </w:pPr>
                             <w:r>
                               <w:rPr>
                                 <w:rFonts w:cstheme="majorBidi"/>
+                                <w:sz w:val="22"/>
+                                <w:szCs w:val="20"/>
                               </w:rPr>
                               <w:t xml:space="preserve">This header sheet should be attached to the work you </w:t>
                             </w:r>
@@ -849,6 +943,8 @@
                             <w:r>
                               <w:rPr>
                                 <w:rFonts w:cstheme="majorBidi"/>
+                                <w:sz w:val="22"/>
+                                <w:szCs w:val="20"/>
                               </w:rPr>
                               <w:t>submit</w:t>
                             </w:r>
@@ -856,6 +952,8 @@
                             <w:r>
                               <w:rPr>
                                 <w:rFonts w:cstheme="majorBidi"/>
+                                <w:sz w:val="22"/>
+                                <w:szCs w:val="20"/>
                               </w:rPr>
                               <w:t xml:space="preserve">. </w:t>
                             </w:r>
@@ -865,11 +963,15 @@
                               <w:jc w:val="both"/>
                               <w:rPr>
                                 <w:rFonts w:cstheme="majorBidi"/>
+                                <w:sz w:val="22"/>
+                                <w:szCs w:val="20"/>
                               </w:rPr>
                             </w:pPr>
                             <w:r>
                               <w:rPr>
                                 <w:rFonts w:cstheme="majorBidi"/>
+                                <w:sz w:val="22"/>
+                                <w:szCs w:val="20"/>
                               </w:rPr>
                               <w:t xml:space="preserve">Academic Integrity means being honest in your academic work and your studies and making sure that you acknowledge the work of others and giving credit where you have used other people's ideas as part of presenting your arguments. Your assessment submissions must therefore always be entirely your own work, based on your own learning and appropriately referenced including how you have used Generative AI. The University regards the use of Generative AI applications by students to deceive to gain unfair advantage as </w:t>
                             </w:r>
@@ -878,12 +980,16 @@
                                 <w:rFonts w:cstheme="majorBidi"/>
                                 <w:b/>
                                 <w:bCs/>
+                                <w:sz w:val="22"/>
+                                <w:szCs w:val="20"/>
                               </w:rPr>
                               <w:t>academic misconduct</w:t>
                             </w:r>
                             <w:r>
                               <w:rPr>
                                 <w:rFonts w:cstheme="majorBidi"/>
+                                <w:sz w:val="22"/>
+                                <w:szCs w:val="20"/>
                               </w:rPr>
                               <w:t>. This usage includes:</w:t>
                             </w:r>
@@ -895,6 +1001,8 @@
                               <w:jc w:val="both"/>
                               <w:rPr>
                                 <w:rFonts w:cstheme="majorBidi"/>
+                                <w:sz w:val="22"/>
+                                <w:szCs w:val="20"/>
                               </w:rPr>
                             </w:pPr>
                           </w:p>
@@ -910,6 +1018,8 @@
                               <w:jc w:val="both"/>
                               <w:rPr>
                                 <w:rFonts w:cstheme="majorBidi"/>
+                                <w:sz w:val="22"/>
+                                <w:szCs w:val="20"/>
                               </w:rPr>
                             </w:pPr>
                             <w:r>
@@ -917,12 +1027,16 @@
                                 <w:rFonts w:eastAsiaTheme="majorEastAsia" w:cstheme="majorBidi"/>
                                 <w:b/>
                                 <w:bCs/>
+                                <w:sz w:val="22"/>
+                                <w:szCs w:val="20"/>
                               </w:rPr>
                               <w:t>Plagiarism</w:t>
                             </w:r>
                             <w:r>
                               <w:rPr>
                                 <w:rFonts w:cstheme="majorBidi"/>
+                                <w:sz w:val="22"/>
+                                <w:szCs w:val="20"/>
                               </w:rPr>
                               <w:t>, where AI tools are used to generate output and ideas that are presented or submitted as if they were the student's own work, without proper citation or references.</w:t>
                             </w:r>
@@ -939,23 +1053,31 @@
                               <w:jc w:val="both"/>
                               <w:rPr>
                                 <w:rFonts w:cstheme="majorBidi"/>
+                                <w:sz w:val="22"/>
+                                <w:szCs w:val="20"/>
                               </w:rPr>
                             </w:pPr>
                             <w:r>
                               <w:rPr>
                                 <w:rFonts w:cstheme="majorBidi"/>
+                                <w:sz w:val="22"/>
+                                <w:szCs w:val="20"/>
                               </w:rPr>
                               <w:t>Where a complete assignment is created using Generative AI and represented as a student's own work, this will be regarded as </w:t>
                             </w:r>
                             <w:r>
                               <w:rPr>
                                 <w:rFonts w:eastAsiaTheme="majorEastAsia" w:cstheme="majorBidi"/>
+                                <w:sz w:val="22"/>
+                                <w:szCs w:val="20"/>
                               </w:rPr>
                               <w:t>contract cheating</w:t>
                             </w:r>
                             <w:r>
                               <w:rPr>
                                 <w:rFonts w:cstheme="majorBidi"/>
+                                <w:sz w:val="22"/>
+                                <w:szCs w:val="20"/>
                               </w:rPr>
                               <w:t xml:space="preserve"> in the same way as commissioning an 'Essay Mill' or other third party to complete your work. Further information can be found on : </w:t>
                             </w:r>
@@ -964,6 +1086,8 @@
                                 <w:rPr>
                                   <w:rStyle w:val="Hyperlink"/>
                                   <w:rFonts w:eastAsiaTheme="majorEastAsia" w:cstheme="majorBidi"/>
+                                  <w:sz w:val="22"/>
+                                  <w:szCs w:val="20"/>
                                 </w:rPr>
                                 <w:t>Guidance on the use of Artificial Intelligence.</w:t>
                               </w:r>
@@ -974,6 +1098,8 @@
                               <w:jc w:val="both"/>
                               <w:rPr>
                                 <w:rFonts w:cstheme="majorBidi"/>
+                                <w:sz w:val="22"/>
+                                <w:szCs w:val="20"/>
                               </w:rPr>
                             </w:pPr>
                           </w:p>
@@ -989,12 +1115,16 @@
                                 <w:rFonts w:cstheme="majorBidi"/>
                                 <w:b/>
                                 <w:bCs/>
+                                <w:sz w:val="22"/>
+                                <w:szCs w:val="20"/>
                               </w:rPr>
                               <w:t>Academic misconduct:</w:t>
                             </w:r>
                             <w:r>
                               <w:rPr>
                                 <w:rFonts w:cstheme="majorBidi"/>
+                                <w:sz w:val="22"/>
+                                <w:szCs w:val="20"/>
                               </w:rPr>
                               <w:t xml:space="preserve"> The University takes academic misconduct very seriously and seeks at all times to rigorously protect its academic standards. Plagiarism, collusion and other forms of cheating constitute academic misconduct, for which there is an explicit range of graduated penalties depending on the particular type of academic misconduct. The penalties that can be applied if academic misconduct is substantiated range from a reprimand to expulsion in very serious cases and for repeated instances of misconduct. You are also responsible for ensuring that all work submitted is your own and that it is appropriately referenced. The University does not tolerate cheating of any kind. You are strongly advised to </w:t>
                             </w:r>
@@ -1002,6 +1132,8 @@
                             <w:r>
                               <w:rPr>
                                 <w:rFonts w:cstheme="majorBidi"/>
+                                <w:sz w:val="22"/>
+                                <w:szCs w:val="20"/>
                               </w:rPr>
                               <w:t>familiarise</w:t>
                             </w:r>
@@ -1009,6 +1141,8 @@
                             <w:r>
                               <w:rPr>
                                 <w:rFonts w:cstheme="majorBidi"/>
+                                <w:sz w:val="22"/>
+                                <w:szCs w:val="20"/>
                               </w:rPr>
                               <w:t xml:space="preserve"> yourself with the Academic Misconduct Policy and Procedure (</w:t>
                             </w:r>
@@ -1017,6 +1151,8 @@
                                 <w:rPr>
                                   <w:rStyle w:val="Hyperlink"/>
                                   <w:rFonts w:cstheme="majorBidi"/>
+                                  <w:sz w:val="22"/>
+                                  <w:szCs w:val="20"/>
                                 </w:rPr>
                                 <w:t>Academic Misconduct</w:t>
                               </w:r>
@@ -1024,8 +1160,24 @@
                             <w:r>
                               <w:rPr>
                                 <w:rFonts w:cstheme="majorBidi"/>
+                                <w:sz w:val="22"/>
+                                <w:szCs w:val="20"/>
                               </w:rPr>
-                              <w:t>), which list a range of categories of academic misconduct and associated penalties, covering instances of academic misconduct (plagiarism, collusion, exam cheating).</w:t>
+                              <w:t xml:space="preserve">), which list a range of categories of academic misconduct and associated penalties, covering instances of academic misconduct </w:t>
+                            </w:r>
+                            <w:r>
+                              <w:rPr>
+                                <w:rFonts w:cstheme="majorBidi"/>
+                              </w:rPr>
+                              <w:t>(</w:t>
+                            </w:r>
+                            <w:r>
+                              <w:rPr>
+                                <w:rFonts w:cstheme="majorBidi"/>
+                                <w:sz w:val="22"/>
+                                <w:szCs w:val="20"/>
+                              </w:rPr>
+                              <w:t>plagiarism, collusion, exam cheating).</w:t>
                             </w:r>
                           </w:p>
                         </w:txbxContent>
@@ -1065,11 +1217,15 @@
                         <w:jc w:val="both"/>
                         <w:rPr>
                           <w:rFonts w:cstheme="majorBidi"/>
+                          <w:sz w:val="22"/>
+                          <w:szCs w:val="20"/>
                         </w:rPr>
                       </w:pPr>
                       <w:r>
                         <w:rPr>
                           <w:rFonts w:cstheme="majorBidi"/>
+                          <w:sz w:val="22"/>
+                          <w:szCs w:val="20"/>
                         </w:rPr>
                         <w:t xml:space="preserve">This header sheet should be attached to the work you </w:t>
                       </w:r>
@@ -1077,6 +1233,8 @@
                       <w:r>
                         <w:rPr>
                           <w:rFonts w:cstheme="majorBidi"/>
+                          <w:sz w:val="22"/>
+                          <w:szCs w:val="20"/>
                         </w:rPr>
                         <w:t>submit</w:t>
                       </w:r>
@@ -1084,6 +1242,8 @@
                       <w:r>
                         <w:rPr>
                           <w:rFonts w:cstheme="majorBidi"/>
+                          <w:sz w:val="22"/>
+                          <w:szCs w:val="20"/>
                         </w:rPr>
                         <w:t xml:space="preserve">. </w:t>
                       </w:r>
@@ -1093,11 +1253,15 @@
                         <w:jc w:val="both"/>
                         <w:rPr>
                           <w:rFonts w:cstheme="majorBidi"/>
+                          <w:sz w:val="22"/>
+                          <w:szCs w:val="20"/>
                         </w:rPr>
                       </w:pPr>
                       <w:r>
                         <w:rPr>
                           <w:rFonts w:cstheme="majorBidi"/>
+                          <w:sz w:val="22"/>
+                          <w:szCs w:val="20"/>
                         </w:rPr>
                         <w:t xml:space="preserve">Academic Integrity means being honest in your academic work and your studies and making sure that you acknowledge the work of others and giving credit where you have used other people's ideas as part of presenting your arguments. Your assessment submissions must therefore always be entirely your own work, based on your own learning and appropriately referenced including how you have used Generative AI. The University regards the use of Generative AI applications by students to deceive to gain unfair advantage as </w:t>
                       </w:r>
@@ -1106,12 +1270,16 @@
                           <w:rFonts w:cstheme="majorBidi"/>
                           <w:b/>
                           <w:bCs/>
+                          <w:sz w:val="22"/>
+                          <w:szCs w:val="20"/>
                         </w:rPr>
                         <w:t>academic misconduct</w:t>
                       </w:r>
                       <w:r>
                         <w:rPr>
                           <w:rFonts w:cstheme="majorBidi"/>
+                          <w:sz w:val="22"/>
+                          <w:szCs w:val="20"/>
                         </w:rPr>
                         <w:t>. This usage includes:</w:t>
                       </w:r>
@@ -1123,6 +1291,8 @@
                         <w:jc w:val="both"/>
                         <w:rPr>
                           <w:rFonts w:cstheme="majorBidi"/>
+                          <w:sz w:val="22"/>
+                          <w:szCs w:val="20"/>
                         </w:rPr>
                       </w:pPr>
                     </w:p>
@@ -1138,6 +1308,8 @@
                         <w:jc w:val="both"/>
                         <w:rPr>
                           <w:rFonts w:cstheme="majorBidi"/>
+                          <w:sz w:val="22"/>
+                          <w:szCs w:val="20"/>
                         </w:rPr>
                       </w:pPr>
                       <w:r>
@@ -1145,12 +1317,16 @@
                           <w:rFonts w:eastAsiaTheme="majorEastAsia" w:cstheme="majorBidi"/>
                           <w:b/>
                           <w:bCs/>
+                          <w:sz w:val="22"/>
+                          <w:szCs w:val="20"/>
                         </w:rPr>
                         <w:t>Plagiarism</w:t>
                       </w:r>
                       <w:r>
                         <w:rPr>
                           <w:rFonts w:cstheme="majorBidi"/>
+                          <w:sz w:val="22"/>
+                          <w:szCs w:val="20"/>
                         </w:rPr>
                         <w:t>, where AI tools are used to generate output and ideas that are presented or submitted as if they were the student's own work, without proper citation or references.</w:t>
                       </w:r>
@@ -1167,23 +1343,31 @@
                         <w:jc w:val="both"/>
                         <w:rPr>
                           <w:rFonts w:cstheme="majorBidi"/>
+                          <w:sz w:val="22"/>
+                          <w:szCs w:val="20"/>
                         </w:rPr>
                       </w:pPr>
                       <w:r>
                         <w:rPr>
                           <w:rFonts w:cstheme="majorBidi"/>
+                          <w:sz w:val="22"/>
+                          <w:szCs w:val="20"/>
                         </w:rPr>
                         <w:t>Where a complete assignment is created using Generative AI and represented as a student's own work, this will be regarded as </w:t>
                       </w:r>
                       <w:r>
                         <w:rPr>
                           <w:rFonts w:eastAsiaTheme="majorEastAsia" w:cstheme="majorBidi"/>
+                          <w:sz w:val="22"/>
+                          <w:szCs w:val="20"/>
                         </w:rPr>
                         <w:t>contract cheating</w:t>
                       </w:r>
                       <w:r>
                         <w:rPr>
                           <w:rFonts w:cstheme="majorBidi"/>
+                          <w:sz w:val="22"/>
+                          <w:szCs w:val="20"/>
                         </w:rPr>
                         <w:t xml:space="preserve"> in the same way as commissioning an 'Essay Mill' or other third party to complete your work. Further information can be found on : </w:t>
                       </w:r>
@@ -1192,6 +1376,8 @@
                           <w:rPr>
                             <w:rStyle w:val="Hyperlink"/>
                             <w:rFonts w:eastAsiaTheme="majorEastAsia" w:cstheme="majorBidi"/>
+                            <w:sz w:val="22"/>
+                            <w:szCs w:val="20"/>
                           </w:rPr>
                           <w:t>Guidance on the use of Artificial Intelligence.</w:t>
                         </w:r>
@@ -1202,6 +1388,8 @@
                         <w:jc w:val="both"/>
                         <w:rPr>
                           <w:rFonts w:cstheme="majorBidi"/>
+                          <w:sz w:val="22"/>
+                          <w:szCs w:val="20"/>
                         </w:rPr>
                       </w:pPr>
                     </w:p>
@@ -1217,12 +1405,16 @@
                           <w:rFonts w:cstheme="majorBidi"/>
                           <w:b/>
                           <w:bCs/>
+                          <w:sz w:val="22"/>
+                          <w:szCs w:val="20"/>
                         </w:rPr>
                         <w:t>Academic misconduct:</w:t>
                       </w:r>
                       <w:r>
                         <w:rPr>
                           <w:rFonts w:cstheme="majorBidi"/>
+                          <w:sz w:val="22"/>
+                          <w:szCs w:val="20"/>
                         </w:rPr>
                         <w:t xml:space="preserve"> The University takes academic misconduct very seriously and seeks at all times to rigorously protect its academic standards. Plagiarism, collusion and other forms of cheating constitute academic misconduct, for which there is an explicit range of graduated penalties depending on the particular type of academic misconduct. The penalties that can be applied if academic misconduct is substantiated range from a reprimand to expulsion in very serious cases and for repeated instances of misconduct. You are also responsible for ensuring that all work submitted is your own and that it is appropriately referenced. The University does not tolerate cheating of any kind. You are strongly advised to </w:t>
                       </w:r>
@@ -1230,6 +1422,8 @@
                       <w:r>
                         <w:rPr>
                           <w:rFonts w:cstheme="majorBidi"/>
+                          <w:sz w:val="22"/>
+                          <w:szCs w:val="20"/>
                         </w:rPr>
                         <w:t>familiarise</w:t>
                       </w:r>
@@ -1237,6 +1431,8 @@
                       <w:r>
                         <w:rPr>
                           <w:rFonts w:cstheme="majorBidi"/>
+                          <w:sz w:val="22"/>
+                          <w:szCs w:val="20"/>
                         </w:rPr>
                         <w:t xml:space="preserve"> yourself with the Academic Misconduct Policy and Procedure (</w:t>
                       </w:r>
@@ -1245,6 +1441,8 @@
                           <w:rPr>
                             <w:rStyle w:val="Hyperlink"/>
                             <w:rFonts w:cstheme="majorBidi"/>
+                            <w:sz w:val="22"/>
+                            <w:szCs w:val="20"/>
                           </w:rPr>
                           <w:t>Academic Misconduct</w:t>
                         </w:r>
@@ -1252,8 +1450,24 @@
                       <w:r>
                         <w:rPr>
                           <w:rFonts w:cstheme="majorBidi"/>
+                          <w:sz w:val="22"/>
+                          <w:szCs w:val="20"/>
                         </w:rPr>
-                        <w:t>), which list a range of categories of academic misconduct and associated penalties, covering instances of academic misconduct (plagiarism, collusion, exam cheating).</w:t>
+                        <w:t xml:space="preserve">), which list a range of categories of academic misconduct and associated penalties, covering instances of academic misconduct </w:t>
+                      </w:r>
+                      <w:r>
+                        <w:rPr>
+                          <w:rFonts w:cstheme="majorBidi"/>
+                        </w:rPr>
+                        <w:t>(</w:t>
+                      </w:r>
+                      <w:r>
+                        <w:rPr>
+                          <w:rFonts w:cstheme="majorBidi"/>
+                          <w:sz w:val="22"/>
+                          <w:szCs w:val="20"/>
+                        </w:rPr>
+                        <w:t>plagiarism, collusion, exam cheating).</w:t>
                       </w:r>
                     </w:p>
                   </w:txbxContent>
@@ -1268,22 +1482,11 @@
     </w:p>
     <w:p>
       <w:pPr>
-        <w:pStyle w:val="BodyText"/>
-        <w:spacing w:before="11" w:line="360" w:lineRule="auto"/>
-        <w:jc w:val="both"/>
-        <w:rPr>
-          <w:rFonts w:cstheme="majorBidi"/>
-          <w:szCs w:val="24"/>
-          <w:u w:val="single"/>
-        </w:rPr>
-      </w:pPr>
-    </w:p>
-    <w:p>
-      <w:pPr>
         <w:pStyle w:val="Heading1"/>
         <w:spacing w:line="360" w:lineRule="auto"/>
       </w:pPr>
       <w:r>
+        <w:lastRenderedPageBreak/>
         <w:t>Introduction</w:t>
       </w:r>
     </w:p>
@@ -1367,6 +1570,9 @@
       <w:pPr>
         <w:pStyle w:val="BodyText"/>
         <w:spacing w:line="360" w:lineRule="auto"/>
+        <w:rPr>
+          <w:rFonts w:ascii="Times New Roman" w:hAnsi="Times New Roman"/>
+        </w:rPr>
       </w:pPr>
       <w:r>
         <w:rPr>
@@ -1405,10 +1611,26 @@
     </w:p>
     <w:p>
       <w:pPr>
+        <w:pStyle w:val="BodyText"/>
+        <w:spacing w:line="360" w:lineRule="auto"/>
+        <w:rPr>
+          <w:rFonts w:ascii="Times New Roman" w:hAnsi="Times New Roman"/>
+        </w:rPr>
+      </w:pPr>
+    </w:p>
+    <w:p>
+      <w:pPr>
+        <w:pStyle w:val="BodyText"/>
+        <w:spacing w:line="360" w:lineRule="auto"/>
+      </w:pPr>
+    </w:p>
+    <w:p>
+      <w:pPr>
         <w:pStyle w:val="Heading1"/>
         <w:spacing w:line="360" w:lineRule="auto"/>
       </w:pPr>
       <w:r>
+        <w:lastRenderedPageBreak/>
         <w:t>System Requirements</w:t>
       </w:r>
     </w:p>
@@ -1453,7 +1675,6 @@
         <w:spacing w:line="360" w:lineRule="auto"/>
       </w:pPr>
       <w:r>
-        <w:lastRenderedPageBreak/>
         <w:t>Maintain medicine information by adding new medicines, updating existing records, removing discontinued medicines, and managing details such as category, dosage, price, stock quantity, supplier information, expiry dates, and prescription requirements.</w:t>
       </w:r>
     </w:p>
@@ -1617,6 +1838,7 @@
         <w:spacing w:line="360" w:lineRule="auto"/>
       </w:pPr>
       <w:r>
+        <w:lastRenderedPageBreak/>
         <w:t xml:space="preserve">Monitor previously placed orders and track their </w:t>
       </w:r>
       <w:proofErr w:type="gramStart"/>
@@ -1672,7 +1894,6 @@
         <w:spacing w:line="360" w:lineRule="auto"/>
       </w:pPr>
       <w:r>
-        <w:lastRenderedPageBreak/>
         <w:t>View available discounts and promotional offers that can be applied to eligible medicines.</w:t>
       </w:r>
     </w:p>
@@ -1870,6 +2091,7 @@
         <w:spacing w:line="360" w:lineRule="auto"/>
       </w:pPr>
       <w:r>
+        <w:lastRenderedPageBreak/>
         <w:t xml:space="preserve">Scalability </w:t>
       </w:r>
       <w:r>
@@ -1967,7 +2189,6 @@
         <w:spacing w:line="360" w:lineRule="auto"/>
       </w:pPr>
       <w:r>
-        <w:lastRenderedPageBreak/>
         <w:t>Minimum 4 GB RAM (8 GB recommended for development).</w:t>
       </w:r>
     </w:p>
@@ -2276,11 +2497,35 @@
     </w:p>
     <w:p>
       <w:pPr>
+        <w:spacing w:line="360" w:lineRule="auto"/>
+      </w:pPr>
+      <w:proofErr w:type="gramStart"/>
+      <w:r>
+        <w:t>The use</w:t>
+      </w:r>
+      <w:proofErr w:type="gramEnd"/>
+      <w:r>
+        <w:t xml:space="preserve"> case model captures what each actor is allowed to do in the system from an external viewpoint, without going into screen layout or code structure. It was useful during requirements analysis to confirm that both admin and customer journeys were covered and to highlight </w:t>
+      </w:r>
+      <w:r>
+        <w:lastRenderedPageBreak/>
+        <w:t xml:space="preserve">relationships such as </w:t>
+      </w:r>
+      <w:proofErr w:type="gramStart"/>
+      <w:r>
+        <w:t>searching</w:t>
+      </w:r>
+      <w:proofErr w:type="gramEnd"/>
+      <w:r>
+        <w:t xml:space="preserve"> before placing an order. The diagram acts as a checklist against which implemented forms and services can be reviewed.</w:t>
+      </w:r>
+    </w:p>
+    <w:p>
+      <w:pPr>
         <w:pStyle w:val="Heading2"/>
         <w:spacing w:line="360" w:lineRule="auto"/>
       </w:pPr>
       <w:r>
-        <w:lastRenderedPageBreak/>
         <w:t>ER Diagram</w:t>
       </w:r>
     </w:p>
@@ -2344,6 +2589,22 @@
     </w:p>
     <w:p>
       <w:pPr>
+        <w:spacing w:line="360" w:lineRule="auto"/>
+      </w:pPr>
+      <w:r>
+        <w:t xml:space="preserve">An entity–relationship model was drawn to decide how pharmacy data should be stored and linked before writing the SQL script. It clarifies which records depend on others so that foreign keys and integrity rules in the database are consistent with </w:t>
+      </w:r>
+      <w:proofErr w:type="gramStart"/>
+      <w:r>
+        <w:t>real business</w:t>
+      </w:r>
+      <w:proofErr w:type="gramEnd"/>
+      <w:r>
+        <w:t xml:space="preserve"> rules. This reduced the risk of designing tables that could not support reporting or order history later.</w:t>
+      </w:r>
+    </w:p>
+    <w:p>
+      <w:pPr>
         <w:pStyle w:val="Heading2"/>
         <w:spacing w:line="360" w:lineRule="auto"/>
       </w:pPr>
@@ -2414,6 +2675,25 @@
       <w:pPr>
         <w:spacing w:line="360" w:lineRule="auto"/>
       </w:pPr>
+      <w:r>
+        <w:t xml:space="preserve">The class diagram documents the object-oriented structure of the domain and how major types relate through inheritance and associations. It supported translating the problem domain into C# classes and helped plan where shared </w:t>
+      </w:r>
+      <w:proofErr w:type="spellStart"/>
+      <w:r>
+        <w:t>behaviour</w:t>
+      </w:r>
+      <w:proofErr w:type="spellEnd"/>
+      <w:r>
+        <w:t xml:space="preserve"> could be </w:t>
+      </w:r>
+      <w:proofErr w:type="spellStart"/>
+      <w:r>
+        <w:t>centralised</w:t>
+      </w:r>
+      <w:proofErr w:type="spellEnd"/>
+      <w:r>
+        <w:t xml:space="preserve"> instead of duplicated. The diagram is a design reference rather than a full listing of every method in the finished project.</w:t>
+      </w:r>
     </w:p>
     <w:p>
       <w:pPr>
@@ -2434,7 +2714,7 @@
           <w:noProof/>
         </w:rPr>
         <w:drawing>
-          <wp:anchor distT="0" distB="0" distL="114300" distR="114300" simplePos="0" relativeHeight="251658240" behindDoc="0" locked="0" layoutInCell="1" allowOverlap="1" wp14:anchorId="139BB19E" wp14:editId="41078B8B">
+          <wp:anchor distT="0" distB="0" distL="114300" distR="114300" simplePos="0" relativeHeight="251658240" behindDoc="0" locked="0" layoutInCell="1" allowOverlap="1" wp14:anchorId="139BB19E" wp14:editId="71505D88">
             <wp:simplePos x="0" y="0"/>
             <wp:positionH relativeFrom="column">
               <wp:posOffset>280987</wp:posOffset>
@@ -2546,11 +2826,27 @@
     </w:p>
     <w:p>
       <w:pPr>
+        <w:spacing w:line="360" w:lineRule="auto"/>
+      </w:pPr>
+      <w:r>
+        <w:lastRenderedPageBreak/>
+        <w:t xml:space="preserve">Sequence diagrams were included to show the order of interactions between the user interface, application services, repositories, and the database for important scenarios such as registration, order handling, and reporting. They are especially helpful where </w:t>
+      </w:r>
+      <w:proofErr w:type="gramStart"/>
+      <w:r>
+        <w:t>some</w:t>
+      </w:r>
+      <w:proofErr w:type="gramEnd"/>
+      <w:r>
+        <w:t xml:space="preserve"> forms call a service layer and others talk to repositories directly, because the message flow can be compared to the actual implementation. Together, the three sequences illustrate typical paths through the system at runtime.</w:t>
+      </w:r>
+    </w:p>
+    <w:p>
+      <w:pPr>
         <w:pStyle w:val="Heading2"/>
         <w:spacing w:line="360" w:lineRule="auto"/>
       </w:pPr>
       <w:r>
-        <w:lastRenderedPageBreak/>
         <w:t>Database Design</w:t>
       </w:r>
     </w:p>
@@ -4231,7 +4527,7 @@
     <w:uiPriority w:val="9"/>
     <w:unhideWhenUsed/>
     <w:qFormat/>
-    <w:rsid w:val="00173212"/>
+    <w:rsid w:val="00BE1BA7"/>
     <w:pPr>
       <w:keepNext/>
       <w:keepLines/>
@@ -4241,7 +4537,7 @@
     <w:rPr>
       <w:rFonts w:eastAsiaTheme="majorEastAsia" w:cstheme="majorBidi"/>
       <w:bCs/>
-      <w:color w:val="004BE2"/>
+      <w:color w:val="003CB4"/>
     </w:rPr>
   </w:style>
   <w:style w:type="paragraph" w:styleId="Heading4">
@@ -4496,11 +4792,11 @@
     <w:basedOn w:val="DefaultParagraphFont"/>
     <w:link w:val="Heading3"/>
     <w:uiPriority w:val="9"/>
-    <w:rsid w:val="00173212"/>
+    <w:rsid w:val="00BE1BA7"/>
     <w:rPr>
       <w:rFonts w:asciiTheme="majorBidi" w:eastAsiaTheme="majorEastAsia" w:hAnsiTheme="majorBidi" w:cstheme="majorBidi"/>
       <w:bCs/>
-      <w:color w:val="004BE2"/>
+      <w:color w:val="003CB4"/>
       <w:sz w:val="24"/>
     </w:rPr>
   </w:style>

</xml_diff>

<commit_message>
Enhance SmartMed Report and fill_report.py with detailed class descriptions
- Expanded the SmartMed Report.docx to include comprehensive descriptions of the User, Admin, Customer, Medicine, Order, OrderItem, and Prescription classes, clarifying their roles and relationships within the system.
- Updated fill_report.py to reflect the changes in class hierarchy from Person to User, ensuring consistency in documentation and improving clarity in the class diagram representation.
</commit_message>
<xml_diff>
--- a/Docs/Report/SmartMed Report.docx
+++ b/Docs/Report/SmartMed Report.docx
@@ -200,24 +200,9 @@
         <w:rPr>
           <w:color w:val="17365D" w:themeColor="text2" w:themeShade="BF"/>
         </w:rPr>
-        <w:t xml:space="preserve">Module </w:t>
-      </w:r>
-      <w:proofErr w:type="gramStart"/>
-      <w:r>
-        <w:rPr>
-          <w:color w:val="17365D" w:themeColor="text2" w:themeShade="BF"/>
-        </w:rPr>
-        <w:t>Leader :</w:t>
-      </w:r>
-      <w:proofErr w:type="gramEnd"/>
-      <w:r>
-        <w:rPr>
-          <w:color w:val="17365D" w:themeColor="text2" w:themeShade="BF"/>
-        </w:rPr>
-        <w:t xml:space="preserve"> </w:t>
+        <w:t xml:space="preserve">Module Leader : </w:t>
       </w:r>
       <w:proofErr w:type="spellStart"/>
-      <w:proofErr w:type="gramStart"/>
       <w:r>
         <w:rPr>
           <w:rFonts w:cstheme="majorBidi"/>
@@ -230,7 +215,6 @@
         <w:t>Ms.Shifani</w:t>
       </w:r>
       <w:proofErr w:type="spellEnd"/>
-      <w:proofErr w:type="gramEnd"/>
       <w:r>
         <w:rPr>
           <w:rFonts w:cstheme="majorBidi"/>
@@ -255,19 +239,11 @@
           <w:szCs w:val="24"/>
         </w:rPr>
       </w:pPr>
-      <w:proofErr w:type="gramStart"/>
       <w:r>
         <w:rPr>
           <w:color w:val="17365D" w:themeColor="text2" w:themeShade="BF"/>
         </w:rPr>
-        <w:t>Student :</w:t>
-      </w:r>
-      <w:proofErr w:type="gramEnd"/>
-      <w:r>
-        <w:rPr>
-          <w:color w:val="17365D" w:themeColor="text2" w:themeShade="BF"/>
-        </w:rPr>
-        <w:t xml:space="preserve"> M.N Sahla Baanu – E301118 [</w:t>
+        <w:t>Student : M.N Sahla Baanu – E301118 [</w:t>
       </w:r>
       <w:r>
         <w:rPr>
@@ -277,17 +253,7 @@
           <w:color w:val="17365D" w:themeColor="text2" w:themeShade="BF"/>
           <w:szCs w:val="24"/>
         </w:rPr>
-        <w:t>25045082</w:t>
-      </w:r>
-      <w:r>
-        <w:rPr>
-          <w:rFonts w:cstheme="majorBidi"/>
-          <w:bCs/>
-          <w:iCs/>
-          <w:color w:val="17365D" w:themeColor="text2" w:themeShade="BF"/>
-          <w:szCs w:val="24"/>
-        </w:rPr>
-        <w:t>]</w:t>
+        <w:t>25045082]</w:t>
       </w:r>
     </w:p>
     <w:p>
@@ -559,7 +525,6 @@
         </w:rPr>
         <w:t xml:space="preserve"> the </w:t>
       </w:r>
-      <w:proofErr w:type="gramStart"/>
       <w:r>
         <w:rPr>
           <w:iCs/>
@@ -577,7 +542,6 @@
         </w:rPr>
         <w:t>th</w:t>
       </w:r>
-      <w:proofErr w:type="gramEnd"/>
       <w:r>
         <w:rPr>
           <w:iCs/>
@@ -621,7 +585,6 @@
         <w:t xml:space="preserve"> </w:t>
       </w:r>
       <w:proofErr w:type="spellStart"/>
-      <w:proofErr w:type="gramStart"/>
       <w:r>
         <w:rPr>
           <w:rFonts w:cstheme="majorBidi"/>
@@ -633,7 +596,6 @@
         <w:t>Ms.Shifani</w:t>
       </w:r>
       <w:proofErr w:type="spellEnd"/>
-      <w:proofErr w:type="gramEnd"/>
       <w:r>
         <w:rPr>
           <w:rFonts w:cstheme="majorBidi"/>
@@ -741,23 +703,7 @@
           <w:rFonts w:cstheme="majorBidi"/>
           <w:szCs w:val="24"/>
         </w:rPr>
-        <w:t>(</w:t>
-      </w:r>
-      <w:proofErr w:type="gramStart"/>
-      <w:r>
-        <w:rPr>
-          <w:rFonts w:cstheme="majorBidi"/>
-          <w:szCs w:val="24"/>
-        </w:rPr>
-        <w:t>signature</w:t>
-      </w:r>
-      <w:proofErr w:type="gramEnd"/>
-      <w:r>
-        <w:rPr>
-          <w:rFonts w:cstheme="majorBidi"/>
-          <w:szCs w:val="24"/>
-        </w:rPr>
-        <w:t>:)</w:t>
+        <w:t>(signature:)</w:t>
       </w:r>
       <w:r>
         <w:rPr>
@@ -775,25 +721,14 @@
         </w:rPr>
         <w:tab/>
       </w:r>
-      <w:proofErr w:type="gramStart"/>
       <w:r>
         <w:rPr>
           <w:rFonts w:cstheme="majorBidi"/>
           <w:szCs w:val="24"/>
           <w:u w:val="single"/>
         </w:rPr>
-        <w:t>M.N</w:t>
-      </w:r>
-      <w:proofErr w:type="gramEnd"/>
-      <w:r>
-        <w:rPr>
-          <w:rFonts w:cstheme="majorBidi"/>
-          <w:szCs w:val="24"/>
-          <w:u w:val="single"/>
-        </w:rPr>
-        <w:t xml:space="preserve"> Sahla Baanu </w:t>
-      </w:r>
-      <w:proofErr w:type="gramStart"/>
+        <w:t xml:space="preserve">M.N Sahla Baanu </w:t>
+      </w:r>
       <w:r>
         <w:rPr>
           <w:rFonts w:cstheme="majorBidi"/>
@@ -811,21 +746,12 @@
         </w:rPr>
         <w:tab/>
       </w:r>
-      <w:proofErr w:type="gramEnd"/>
       <w:r>
         <w:rPr>
           <w:rFonts w:cstheme="majorBidi"/>
           <w:szCs w:val="24"/>
         </w:rPr>
-        <w:t>Date</w:t>
-      </w:r>
-      <w:proofErr w:type="gramStart"/>
-      <w:r>
-        <w:rPr>
-          <w:rFonts w:cstheme="majorBidi"/>
-          <w:szCs w:val="24"/>
-        </w:rPr>
-        <w:t xml:space="preserve">: </w:t>
+        <w:t xml:space="preserve">Date: </w:t>
       </w:r>
       <w:r>
         <w:rPr>
@@ -857,16 +783,7 @@
           <w:szCs w:val="24"/>
           <w:u w:val="single"/>
         </w:rPr>
-        <w:t>30</w:t>
-      </w:r>
-      <w:proofErr w:type="gramEnd"/>
-      <w:r>
-        <w:rPr>
-          <w:rFonts w:cstheme="majorBidi"/>
-          <w:szCs w:val="24"/>
-          <w:u w:val="single"/>
-        </w:rPr>
-        <w:t>/06/2026</w:t>
+        <w:t>30/06/2026</w:t>
       </w:r>
       <w:r>
         <w:rPr>
@@ -937,25 +854,7 @@
                                 <w:sz w:val="22"/>
                                 <w:szCs w:val="20"/>
                               </w:rPr>
-                              <w:t xml:space="preserve">This header sheet should be attached to the work you </w:t>
-                            </w:r>
-                            <w:proofErr w:type="gramStart"/>
-                            <w:r>
-                              <w:rPr>
-                                <w:rFonts w:cstheme="majorBidi"/>
-                                <w:sz w:val="22"/>
-                                <w:szCs w:val="20"/>
-                              </w:rPr>
-                              <w:t>submit</w:t>
-                            </w:r>
-                            <w:proofErr w:type="gramEnd"/>
-                            <w:r>
-                              <w:rPr>
-                                <w:rFonts w:cstheme="majorBidi"/>
-                                <w:sz w:val="22"/>
-                                <w:szCs w:val="20"/>
-                              </w:rPr>
-                              <w:t xml:space="preserve">. </w:t>
+                              <w:t xml:space="preserve">This header sheet should be attached to the work you submit. </w:t>
                             </w:r>
                           </w:p>
                           <w:p>
@@ -1126,25 +1025,7 @@
                                 <w:sz w:val="22"/>
                                 <w:szCs w:val="20"/>
                               </w:rPr>
-                              <w:t xml:space="preserve"> The University takes academic misconduct very seriously and seeks at all times to rigorously protect its academic standards. Plagiarism, collusion and other forms of cheating constitute academic misconduct, for which there is an explicit range of graduated penalties depending on the particular type of academic misconduct. The penalties that can be applied if academic misconduct is substantiated range from a reprimand to expulsion in very serious cases and for repeated instances of misconduct. You are also responsible for ensuring that all work submitted is your own and that it is appropriately referenced. The University does not tolerate cheating of any kind. You are strongly advised to </w:t>
-                            </w:r>
-                            <w:proofErr w:type="spellStart"/>
-                            <w:r>
-                              <w:rPr>
-                                <w:rFonts w:cstheme="majorBidi"/>
-                                <w:sz w:val="22"/>
-                                <w:szCs w:val="20"/>
-                              </w:rPr>
-                              <w:t>familiarise</w:t>
-                            </w:r>
-                            <w:proofErr w:type="spellEnd"/>
-                            <w:r>
-                              <w:rPr>
-                                <w:rFonts w:cstheme="majorBidi"/>
-                                <w:sz w:val="22"/>
-                                <w:szCs w:val="20"/>
-                              </w:rPr>
-                              <w:t xml:space="preserve"> yourself with the Academic Misconduct Policy and Procedure (</w:t>
+                              <w:t xml:space="preserve"> The University takes academic misconduct very seriously and seeks at all times to rigorously protect its academic standards. Plagiarism, collusion and other forms of cheating constitute academic misconduct, for which there is an explicit range of graduated penalties depending on the particular type of academic misconduct. The penalties that can be applied if academic misconduct is substantiated range from a reprimand to expulsion in very serious cases and for repeated instances of misconduct. You are also responsible for ensuring that all work submitted is your own and that it is appropriately referenced. The University does not tolerate cheating of any kind. You are strongly advised to familiarise yourself with the Academic Misconduct Policy and Procedure (</w:t>
                             </w:r>
                             <w:hyperlink r:id="rId8" w:history="1">
                               <w:r>
@@ -1227,25 +1108,7 @@
                           <w:sz w:val="22"/>
                           <w:szCs w:val="20"/>
                         </w:rPr>
-                        <w:t xml:space="preserve">This header sheet should be attached to the work you </w:t>
-                      </w:r>
-                      <w:proofErr w:type="gramStart"/>
-                      <w:r>
-                        <w:rPr>
-                          <w:rFonts w:cstheme="majorBidi"/>
-                          <w:sz w:val="22"/>
-                          <w:szCs w:val="20"/>
-                        </w:rPr>
-                        <w:t>submit</w:t>
-                      </w:r>
-                      <w:proofErr w:type="gramEnd"/>
-                      <w:r>
-                        <w:rPr>
-                          <w:rFonts w:cstheme="majorBidi"/>
-                          <w:sz w:val="22"/>
-                          <w:szCs w:val="20"/>
-                        </w:rPr>
-                        <w:t xml:space="preserve">. </w:t>
+                        <w:t xml:space="preserve">This header sheet should be attached to the work you submit. </w:t>
                       </w:r>
                     </w:p>
                     <w:p>
@@ -1416,25 +1279,7 @@
                           <w:sz w:val="22"/>
                           <w:szCs w:val="20"/>
                         </w:rPr>
-                        <w:t xml:space="preserve"> The University takes academic misconduct very seriously and seeks at all times to rigorously protect its academic standards. Plagiarism, collusion and other forms of cheating constitute academic misconduct, for which there is an explicit range of graduated penalties depending on the particular type of academic misconduct. The penalties that can be applied if academic misconduct is substantiated range from a reprimand to expulsion in very serious cases and for repeated instances of misconduct. You are also responsible for ensuring that all work submitted is your own and that it is appropriately referenced. The University does not tolerate cheating of any kind. You are strongly advised to </w:t>
-                      </w:r>
-                      <w:proofErr w:type="spellStart"/>
-                      <w:r>
-                        <w:rPr>
-                          <w:rFonts w:cstheme="majorBidi"/>
-                          <w:sz w:val="22"/>
-                          <w:szCs w:val="20"/>
-                        </w:rPr>
-                        <w:t>familiarise</w:t>
-                      </w:r>
-                      <w:proofErr w:type="spellEnd"/>
-                      <w:r>
-                        <w:rPr>
-                          <w:rFonts w:cstheme="majorBidi"/>
-                          <w:sz w:val="22"/>
-                          <w:szCs w:val="20"/>
-                        </w:rPr>
-                        <w:t xml:space="preserve"> yourself with the Academic Misconduct Policy and Procedure (</w:t>
+                        <w:t xml:space="preserve"> The University takes academic misconduct very seriously and seeks at all times to rigorously protect its academic standards. Plagiarism, collusion and other forms of cheating constitute academic misconduct, for which there is an explicit range of graduated penalties depending on the particular type of academic misconduct. The penalties that can be applied if academic misconduct is substantiated range from a reprimand to expulsion in very serious cases and for repeated instances of misconduct. You are also responsible for ensuring that all work submitted is your own and that it is appropriately referenced. The University does not tolerate cheating of any kind. You are strongly advised to familiarise yourself with the Academic Misconduct Policy and Procedure (</w:t>
                       </w:r>
                       <w:hyperlink r:id="rId10" w:history="1">
                         <w:r>
@@ -1525,21 +1370,7 @@
         <w:rPr>
           <w:rFonts w:ascii="Times New Roman" w:hAnsi="Times New Roman"/>
         </w:rPr>
-        <w:t xml:space="preserve">The application is intended to help a small pharmacy </w:t>
-      </w:r>
-      <w:proofErr w:type="gramStart"/>
-      <w:r>
-        <w:rPr>
-          <w:rFonts w:ascii="Times New Roman" w:hAnsi="Times New Roman"/>
-        </w:rPr>
-        <w:t>handle</w:t>
-      </w:r>
-      <w:proofErr w:type="gramEnd"/>
-      <w:r>
-        <w:rPr>
-          <w:rFonts w:ascii="Times New Roman" w:hAnsi="Times New Roman"/>
-        </w:rPr>
-        <w:t xml:space="preserve"> routine work through one Windows desktop program instead of depending on paper records or scattered files. Two user types are supported: an admin who manages the pharmacy operation, and a customer who signs in to use the customer-facing side of the system. Both roles enter through the same login screen, but each user sees only the features relevant to that role.</w:t>
+        <w:t>The application is intended to help a small pharmacy handle routine work through one Windows desktop program instead of depending on paper records or scattered files. Two user types are supported: an admin who manages the pharmacy operation, and a customer who signs in to use the customer-facing side of the system. Both roles enter through the same login screen, but each user sees only the features relevant to that role.</w:t>
       </w:r>
     </w:p>
     <w:p>
@@ -1578,21 +1409,7 @@
         <w:rPr>
           <w:rFonts w:ascii="Times New Roman" w:hAnsi="Times New Roman"/>
         </w:rPr>
-        <w:t xml:space="preserve">The overall aim was to apply object-oriented programming in a practical desktop application that a pharmacy could realistically use. Key goals included reliable login for both roles, keeping stock and order information </w:t>
-      </w:r>
-      <w:proofErr w:type="gramStart"/>
-      <w:r>
-        <w:rPr>
-          <w:rFonts w:ascii="Times New Roman" w:hAnsi="Times New Roman"/>
-        </w:rPr>
-        <w:t>accurate</w:t>
-      </w:r>
-      <w:proofErr w:type="gramEnd"/>
-      <w:r>
-        <w:rPr>
-          <w:rFonts w:ascii="Times New Roman" w:hAnsi="Times New Roman"/>
-        </w:rPr>
-        <w:t xml:space="preserve">, and giving the admin useful dashboard and report information without manual calculations. Another priority was to keep the code readable and well </w:t>
+        <w:t xml:space="preserve">The overall aim was to apply object-oriented programming in a practical desktop application that a pharmacy could realistically use. Key goals included reliable login for both roles, keeping stock and order information accurate, and giving the admin useful dashboard and report information without manual calculations. Another priority was to keep the code readable and well </w:t>
       </w:r>
       <w:proofErr w:type="spellStart"/>
       <w:r>
@@ -1753,15 +1570,7 @@
         <w:spacing w:line="360" w:lineRule="auto"/>
       </w:pPr>
       <w:r>
-        <w:t xml:space="preserve">Track medicine expiry dates and receive notifications for medicines approaching expiry </w:t>
-      </w:r>
-      <w:proofErr w:type="gramStart"/>
-      <w:r>
-        <w:t>in order to</w:t>
-      </w:r>
-      <w:proofErr w:type="gramEnd"/>
-      <w:r>
-        <w:t xml:space="preserve"> ensure inventory safety and compliance.</w:t>
+        <w:t>Track medicine expiry dates and receive notifications for medicines approaching expiry in order to ensure inventory safety and compliance.</w:t>
       </w:r>
     </w:p>
     <w:p>
@@ -1796,23 +1605,7 @@
         <w:spacing w:line="360" w:lineRule="auto"/>
       </w:pPr>
       <w:r>
-        <w:t xml:space="preserve">Search and browse available medicines by name, category, or price range and view detailed </w:t>
-      </w:r>
-      <w:proofErr w:type="gramStart"/>
-      <w:r>
-        <w:t>medicine</w:t>
-      </w:r>
-      <w:proofErr w:type="gramEnd"/>
-      <w:r>
-        <w:t xml:space="preserve"> information before </w:t>
-      </w:r>
-      <w:proofErr w:type="gramStart"/>
-      <w:r>
-        <w:t>purchasing</w:t>
-      </w:r>
-      <w:proofErr w:type="gramEnd"/>
-      <w:r>
-        <w:t>.</w:t>
+        <w:t>Search and browse available medicines by name, category, or price range and view detailed medicine information before purchasing.</w:t>
       </w:r>
     </w:p>
     <w:p>
@@ -1839,15 +1632,7 @@
       </w:pPr>
       <w:r>
         <w:lastRenderedPageBreak/>
-        <w:t xml:space="preserve">Monitor previously placed orders and track their </w:t>
-      </w:r>
-      <w:proofErr w:type="gramStart"/>
-      <w:r>
-        <w:t>current status</w:t>
-      </w:r>
-      <w:proofErr w:type="gramEnd"/>
-      <w:r>
-        <w:t xml:space="preserve"> throughout the order processing lifecycle.</w:t>
+        <w:t>Monitor previously placed orders and track their current status throughout the order processing lifecycle.</w:t>
       </w:r>
     </w:p>
     <w:p>
@@ -1873,15 +1658,7 @@
         <w:spacing w:line="360" w:lineRule="auto"/>
       </w:pPr>
       <w:r>
-        <w:t xml:space="preserve">Upload prescription documents when </w:t>
-      </w:r>
-      <w:proofErr w:type="gramStart"/>
-      <w:r>
-        <w:t>purchasing</w:t>
-      </w:r>
-      <w:proofErr w:type="gramEnd"/>
-      <w:r>
-        <w:t xml:space="preserve"> medicines that require prescription verification.</w:t>
+        <w:t>Upload prescription documents when purchasing medicines that require prescription verification.</w:t>
       </w:r>
     </w:p>
     <w:p>
@@ -1935,15 +1712,7 @@
         <w:t>-</w:t>
       </w:r>
       <w:r>
-        <w:t xml:space="preserve"> The system </w:t>
-      </w:r>
-      <w:proofErr w:type="gramStart"/>
-      <w:r>
-        <w:t>shall</w:t>
-      </w:r>
-      <w:proofErr w:type="gramEnd"/>
-      <w:r>
-        <w:t xml:space="preserve"> provide an intuitive and user-friendly interface with role-based navigation, allowing administrators and customers to easily access their respective functionalities through clearly organized forms and menus.</w:t>
+        <w:t xml:space="preserve"> The system shall provide an intuitive and user-friendly interface with role-based navigation, allowing administrators and customers to easily access their respective functionalities through clearly organized forms and menus.</w:t>
       </w:r>
     </w:p>
     <w:p>
@@ -1962,23 +1731,7 @@
         <w:t>-</w:t>
       </w:r>
       <w:r>
-        <w:t xml:space="preserve"> The system shall </w:t>
-      </w:r>
-      <w:proofErr w:type="gramStart"/>
-      <w:r>
-        <w:t>validate</w:t>
-      </w:r>
-      <w:proofErr w:type="gramEnd"/>
-      <w:r>
-        <w:t xml:space="preserve"> user inputs before processing and use parameterized SQL queries to ensure </w:t>
-      </w:r>
-      <w:proofErr w:type="gramStart"/>
-      <w:r>
-        <w:t>accurate</w:t>
-      </w:r>
-      <w:proofErr w:type="gramEnd"/>
-      <w:r>
-        <w:t xml:space="preserve"> data handling and prevent database-related errors.</w:t>
+        <w:t xml:space="preserve"> The system shall validate user inputs before processing and use parameterized SQL queries to ensure accurate data handling and prevent database-related errors.</w:t>
       </w:r>
     </w:p>
     <w:p>
@@ -2016,23 +1769,7 @@
         <w:t>-</w:t>
       </w:r>
       <w:r>
-        <w:t xml:space="preserve"> The system shall provide responsive operation for </w:t>
-      </w:r>
-      <w:proofErr w:type="gramStart"/>
-      <w:r>
-        <w:t>medicine searches</w:t>
-      </w:r>
-      <w:proofErr w:type="gramEnd"/>
-      <w:r>
-        <w:t xml:space="preserve">, order processing, and report generation, with search and filtering functionality </w:t>
-      </w:r>
-      <w:proofErr w:type="gramStart"/>
-      <w:r>
-        <w:t>optimized</w:t>
-      </w:r>
-      <w:proofErr w:type="gramEnd"/>
-      <w:r>
-        <w:t xml:space="preserve"> for typical pharmacy inventory sizes.</w:t>
+        <w:t xml:space="preserve"> The system shall provide responsive operation for medicine searches, order processing, and report generation, with search and filtering functionality optimized for typical pharmacy inventory sizes.</w:t>
       </w:r>
     </w:p>
     <w:p>
@@ -2051,15 +1788,7 @@
         <w:t>-</w:t>
       </w:r>
       <w:r>
-        <w:t xml:space="preserve"> The system shall authenticate users through secure login mechanisms, restrict access based on user roles, and </w:t>
-      </w:r>
-      <w:proofErr w:type="gramStart"/>
-      <w:r>
-        <w:t>maintain</w:t>
-      </w:r>
-      <w:proofErr w:type="gramEnd"/>
-      <w:r>
-        <w:t xml:space="preserve"> session information for authenticated users.</w:t>
+        <w:t xml:space="preserve"> The system shall authenticate users through secure login mechanisms, restrict access based on user roles, and maintain session information for authenticated users.</w:t>
       </w:r>
     </w:p>
     <w:p>
@@ -2098,15 +1827,7 @@
         <w:t>-</w:t>
       </w:r>
       <w:r>
-        <w:t xml:space="preserve"> The system shall support future enhancements such as </w:t>
-      </w:r>
-      <w:proofErr w:type="gramStart"/>
-      <w:r>
-        <w:t>additional</w:t>
-      </w:r>
-      <w:proofErr w:type="gramEnd"/>
-      <w:r>
-        <w:t xml:space="preserve"> user roles, advanced reporting features, and expanded inventory management without major architectural changes.</w:t>
+        <w:t xml:space="preserve"> The system shall support future enhancements such as additional user roles, advanced reporting features, and expanded inventory management without major architectural changes.</w:t>
       </w:r>
     </w:p>
     <w:p>
@@ -2125,23 +1846,7 @@
         <w:t>-</w:t>
       </w:r>
       <w:r>
-        <w:t xml:space="preserve"> The system shall </w:t>
-      </w:r>
-      <w:proofErr w:type="gramStart"/>
-      <w:r>
-        <w:t>maintain</w:t>
-      </w:r>
-      <w:proofErr w:type="gramEnd"/>
-      <w:r>
-        <w:t xml:space="preserve"> consistent and </w:t>
-      </w:r>
-      <w:proofErr w:type="gramStart"/>
-      <w:r>
-        <w:t>accurate</w:t>
-      </w:r>
-      <w:proofErr w:type="gramEnd"/>
-      <w:r>
-        <w:t xml:space="preserve"> data through validation rules, database constraints, and controlled update operations.</w:t>
+        <w:t xml:space="preserve"> The system shall maintain consistent and accurate data through validation rules, database constraints, and controlled update operations.</w:t>
       </w:r>
     </w:p>
     <w:p>
@@ -2499,25 +2204,12 @@
       <w:pPr>
         <w:spacing w:line="360" w:lineRule="auto"/>
       </w:pPr>
-      <w:proofErr w:type="gramStart"/>
-      <w:r>
-        <w:t>The use</w:t>
-      </w:r>
-      <w:proofErr w:type="gramEnd"/>
-      <w:r>
-        <w:t xml:space="preserve"> case model captures what each actor is allowed to do in the system from an external viewpoint, without going into screen layout or code structure. It was useful during requirements analysis to confirm that both admin and customer journeys were covered and to highlight </w:t>
+      <w:r>
+        <w:t xml:space="preserve">The use case model captures what each actor is allowed to do in the system from an external viewpoint, without going into screen layout or code structure. It was useful during requirements analysis to confirm that both admin and customer journeys were covered and to highlight </w:t>
       </w:r>
       <w:r>
         <w:lastRenderedPageBreak/>
-        <w:t xml:space="preserve">relationships such as </w:t>
-      </w:r>
-      <w:proofErr w:type="gramStart"/>
-      <w:r>
-        <w:t>searching</w:t>
-      </w:r>
-      <w:proofErr w:type="gramEnd"/>
-      <w:r>
-        <w:t xml:space="preserve"> before placing an order. The diagram acts as a checklist against which implemented forms and services can be reviewed.</w:t>
+        <w:t>relationships such as searching before placing an order. The diagram acts as a checklist against which implemented forms and services can be reviewed.</w:t>
       </w:r>
     </w:p>
     <w:p>
@@ -2592,15 +2284,7 @@
         <w:spacing w:line="360" w:lineRule="auto"/>
       </w:pPr>
       <w:r>
-        <w:t xml:space="preserve">An entity–relationship model was drawn to decide how pharmacy data should be stored and linked before writing the SQL script. It clarifies which records depend on others so that foreign keys and integrity rules in the database are consistent with </w:t>
-      </w:r>
-      <w:proofErr w:type="gramStart"/>
-      <w:r>
-        <w:t>real business</w:t>
-      </w:r>
-      <w:proofErr w:type="gramEnd"/>
-      <w:r>
-        <w:t xml:space="preserve"> rules. This reduced the risk of designing tables that could not support reporting or order history later.</w:t>
+        <w:t>An entity–relationship model was drawn to decide how pharmacy data should be stored and linked before writing the SQL script. It clarifies which records depend on others so that foreign keys and integrity rules in the database are consistent with real business rules. This reduced the risk of designing tables that could not support reporting or order history later.</w:t>
       </w:r>
     </w:p>
     <w:p>
@@ -2830,15 +2514,7 @@
       </w:pPr>
       <w:r>
         <w:lastRenderedPageBreak/>
-        <w:t xml:space="preserve">Sequence diagrams were included to show the order of interactions between the user interface, application services, repositories, and the database for important scenarios such as registration, order handling, and reporting. They are especially helpful where </w:t>
-      </w:r>
-      <w:proofErr w:type="gramStart"/>
-      <w:r>
-        <w:t>some</w:t>
-      </w:r>
-      <w:proofErr w:type="gramEnd"/>
-      <w:r>
-        <w:t xml:space="preserve"> forms call a service layer and others talk to repositories directly, because the message flow can be compared to the actual implementation. Together, the three sequences illustrate typical paths through the system at runtime.</w:t>
+        <w:t>Sequence diagrams were included to show the order of interactions between the user interface, application services, repositories, and the database for important scenarios such as registration, order handling, and reporting. They are especially helpful where some forms call a service layer and others talk to repositories directly, because the message flow can be compared to the actual implementation. Together, the three sequences illustrate typical paths through the system at runtime.</w:t>
       </w:r>
     </w:p>
     <w:p>
@@ -2857,6 +2533,437 @@
       </w:pPr>
       <w:r>
         <w:t>Description of Classes, Properties and Methods</w:t>
+      </w:r>
+    </w:p>
+    <w:p>
+      <w:pPr>
+        <w:pStyle w:val="Heading3"/>
+      </w:pPr>
+      <w:r>
+        <w:t>User</w:t>
+      </w:r>
+    </w:p>
+    <w:p>
+      <w:r>
+        <w:drawing>
+          <wp:inline distT="0" distB="0" distL="0" distR="0" wp14:anchorId="0D0D4C96" wp14:editId="2ACFA72F">
+            <wp:extent cx="3100705" cy="1878830"/>
+            <wp:effectExtent l="0" t="0" r="4445" b="7620"/>
+            <wp:docPr id="1956349562" name="Picture 1"/>
+            <wp:cNvGraphicFramePr>
+              <a:graphicFrameLocks xmlns:a="http://schemas.openxmlformats.org/drawingml/2006/main" noChangeAspect="1"/>
+            </wp:cNvGraphicFramePr>
+            <a:graphic xmlns:a="http://schemas.openxmlformats.org/drawingml/2006/main">
+              <a:graphicData uri="http://schemas.openxmlformats.org/drawingml/2006/picture">
+                <pic:pic xmlns:pic="http://schemas.openxmlformats.org/drawingml/2006/picture">
+                  <pic:nvPicPr>
+                    <pic:cNvPr id="1956349562" name=""/>
+                    <pic:cNvPicPr/>
+                  </pic:nvPicPr>
+                  <pic:blipFill rotWithShape="1">
+                    <a:blip r:embed="rId16"/>
+                    <a:srcRect l="8479" t="12755" r="8475" b="13408"/>
+                    <a:stretch>
+                      <a:fillRect/>
+                    </a:stretch>
+                  </pic:blipFill>
+                  <pic:spPr bwMode="auto">
+                    <a:xfrm>
+                      <a:off x="0" y="0"/>
+                      <a:ext cx="3102856" cy="1880133"/>
+                    </a:xfrm>
+                    <a:prstGeom prst="rect">
+                      <a:avLst/>
+                    </a:prstGeom>
+                    <a:ln>
+                      <a:noFill/>
+                    </a:ln>
+                    <a:extLst>
+                      <a:ext uri="{53640926-AAD7-44D8-BBD7-CCE9431645EC}">
+                        <a14:shadowObscured xmlns:a14="http://schemas.microsoft.com/office/drawing/2010/main"/>
+                      </a:ext>
+                    </a:extLst>
+                  </pic:spPr>
+                </pic:pic>
+              </a:graphicData>
+            </a:graphic>
+          </wp:inline>
+        </w:drawing>
+      </w:r>
+    </w:p>
+    <w:p>
+      <w:r>
+        <w:t>The User class is the base model for all authenticated users in SmartMed. It defines shared account information used by both customers and administrators, supporting inheritance and reducing code duplication across user-related classes.</w:t>
+      </w:r>
+    </w:p>
+    <w:p>
+      <w:pPr>
+        <w:pStyle w:val="Heading3"/>
+      </w:pPr>
+      <w:r>
+        <w:t>Admin</w:t>
+      </w:r>
+    </w:p>
+    <w:p>
+      <w:r>
+        <w:drawing>
+          <wp:inline distT="0" distB="0" distL="0" distR="0" wp14:anchorId="49B61C41" wp14:editId="61E03D20">
+            <wp:extent cx="2235200" cy="1974850"/>
+            <wp:effectExtent l="0" t="0" r="0" b="6350"/>
+            <wp:docPr id="1228245200" name="Picture 1"/>
+            <wp:cNvGraphicFramePr>
+              <a:graphicFrameLocks xmlns:a="http://schemas.openxmlformats.org/drawingml/2006/main" noChangeAspect="1"/>
+            </wp:cNvGraphicFramePr>
+            <a:graphic xmlns:a="http://schemas.openxmlformats.org/drawingml/2006/main">
+              <a:graphicData uri="http://schemas.openxmlformats.org/drawingml/2006/picture">
+                <pic:pic xmlns:pic="http://schemas.openxmlformats.org/drawingml/2006/picture">
+                  <pic:nvPicPr>
+                    <pic:cNvPr id="1228245200" name=""/>
+                    <pic:cNvPicPr/>
+                  </pic:nvPicPr>
+                  <pic:blipFill rotWithShape="1">
+                    <a:blip r:embed="rId17"/>
+                    <a:srcRect l="8929" t="10036" r="8363" b="9910"/>
+                    <a:stretch>
+                      <a:fillRect/>
+                    </a:stretch>
+                  </pic:blipFill>
+                  <pic:spPr bwMode="auto">
+                    <a:xfrm>
+                      <a:off x="0" y="0"/>
+                      <a:ext cx="2242056" cy="1980907"/>
+                    </a:xfrm>
+                    <a:prstGeom prst="rect">
+                      <a:avLst/>
+                    </a:prstGeom>
+                    <a:ln>
+                      <a:noFill/>
+                    </a:ln>
+                    <a:extLst>
+                      <a:ext uri="{53640926-AAD7-44D8-BBD7-CCE9431645EC}">
+                        <a14:shadowObscured xmlns:a14="http://schemas.microsoft.com/office/drawing/2010/main"/>
+                      </a:ext>
+                    </a:extLst>
+                  </pic:spPr>
+                </pic:pic>
+              </a:graphicData>
+            </a:graphic>
+          </wp:inline>
+        </w:drawing>
+      </w:r>
+    </w:p>
+    <w:p>
+      <w:r>
+        <w:lastRenderedPageBreak/>
+        <w:t>The Admin class extends User and represents pharmacy staff who manage system operations. It supports administrative tasks such as inventory control, customer management, order processing, and report generation.</w:t>
+      </w:r>
+    </w:p>
+    <w:p>
+      <w:pPr>
+        <w:pStyle w:val="Heading3"/>
+      </w:pPr>
+      <w:r>
+        <w:t>Customer</w:t>
+      </w:r>
+    </w:p>
+    <w:p>
+      <w:r>
+        <w:drawing>
+          <wp:inline distT="0" distB="0" distL="0" distR="0" wp14:anchorId="58C96E5C" wp14:editId="727226C4">
+            <wp:extent cx="2971800" cy="2557772"/>
+            <wp:effectExtent l="0" t="0" r="0" b="0"/>
+            <wp:docPr id="964189853" name="Picture 1"/>
+            <wp:cNvGraphicFramePr>
+              <a:graphicFrameLocks xmlns:a="http://schemas.openxmlformats.org/drawingml/2006/main" noChangeAspect="1"/>
+            </wp:cNvGraphicFramePr>
+            <a:graphic xmlns:a="http://schemas.openxmlformats.org/drawingml/2006/main">
+              <a:graphicData uri="http://schemas.openxmlformats.org/drawingml/2006/picture">
+                <pic:pic xmlns:pic="http://schemas.openxmlformats.org/drawingml/2006/picture">
+                  <pic:nvPicPr>
+                    <pic:cNvPr id="964189853" name=""/>
+                    <pic:cNvPicPr/>
+                  </pic:nvPicPr>
+                  <pic:blipFill rotWithShape="1">
+                    <a:blip r:embed="rId18"/>
+                    <a:srcRect l="8463" t="9975" r="8718" b="9650"/>
+                    <a:stretch>
+                      <a:fillRect/>
+                    </a:stretch>
+                  </pic:blipFill>
+                  <pic:spPr bwMode="auto">
+                    <a:xfrm>
+                      <a:off x="0" y="0"/>
+                      <a:ext cx="2976201" cy="2561560"/>
+                    </a:xfrm>
+                    <a:prstGeom prst="rect">
+                      <a:avLst/>
+                    </a:prstGeom>
+                    <a:ln>
+                      <a:noFill/>
+                    </a:ln>
+                    <a:extLst>
+                      <a:ext uri="{53640926-AAD7-44D8-BBD7-CCE9431645EC}">
+                        <a14:shadowObscured xmlns:a14="http://schemas.microsoft.com/office/drawing/2010/main"/>
+                      </a:ext>
+                    </a:extLst>
+                  </pic:spPr>
+                </pic:pic>
+              </a:graphicData>
+            </a:graphic>
+          </wp:inline>
+        </w:drawing>
+      </w:r>
+    </w:p>
+    <w:p>
+      <w:r>
+        <w:t>The Customer class extends User and represents pharmacy clients who register, place orders, and manage their profile. It models the customer role and supports customer-related use cases in the system.</w:t>
+      </w:r>
+    </w:p>
+    <w:p>
+      <w:pPr>
+        <w:pStyle w:val="Heading3"/>
+      </w:pPr>
+      <w:r>
+        <w:lastRenderedPageBreak/>
+        <w:t>Medicine</w:t>
+      </w:r>
+    </w:p>
+    <w:p>
+      <w:r>
+        <w:drawing>
+          <wp:inline distT="0" distB="0" distL="0" distR="0" wp14:anchorId="17A512C2" wp14:editId="7AEE6A4C">
+            <wp:extent cx="4425950" cy="7708900"/>
+            <wp:effectExtent l="0" t="0" r="0" b="6350"/>
+            <wp:docPr id="1808248992" name="Picture 1"/>
+            <wp:cNvGraphicFramePr>
+              <a:graphicFrameLocks xmlns:a="http://schemas.openxmlformats.org/drawingml/2006/main" noChangeAspect="1"/>
+            </wp:cNvGraphicFramePr>
+            <a:graphic xmlns:a="http://schemas.openxmlformats.org/drawingml/2006/main">
+              <a:graphicData uri="http://schemas.openxmlformats.org/drawingml/2006/picture">
+                <pic:pic xmlns:pic="http://schemas.openxmlformats.org/drawingml/2006/picture">
+                  <pic:nvPicPr>
+                    <pic:cNvPr id="1808248992" name=""/>
+                    <pic:cNvPicPr/>
+                  </pic:nvPicPr>
+                  <pic:blipFill rotWithShape="1">
+                    <a:blip r:embed="rId19"/>
+                    <a:srcRect l="5612" t="3163" r="5484" b="3163"/>
+                    <a:stretch>
+                      <a:fillRect/>
+                    </a:stretch>
+                  </pic:blipFill>
+                  <pic:spPr bwMode="auto">
+                    <a:xfrm>
+                      <a:off x="0" y="0"/>
+                      <a:ext cx="4425950" cy="7708900"/>
+                    </a:xfrm>
+                    <a:prstGeom prst="rect">
+                      <a:avLst/>
+                    </a:prstGeom>
+                    <a:ln>
+                      <a:noFill/>
+                    </a:ln>
+                    <a:extLst>
+                      <a:ext uri="{53640926-AAD7-44D8-BBD7-CCE9431645EC}">
+                        <a14:shadowObscured xmlns:a14="http://schemas.microsoft.com/office/drawing/2010/main"/>
+                      </a:ext>
+                    </a:extLst>
+                  </pic:spPr>
+                </pic:pic>
+              </a:graphicData>
+            </a:graphic>
+          </wp:inline>
+        </w:drawing>
+      </w:r>
+    </w:p>
+    <w:p>
+      <w:r>
+        <w:lastRenderedPageBreak/>
+        <w:t>The Medicine class models products stored in the pharmacy inventory. It is used for stock management and supports business rules such as expiry checking, low stock detection, and promotional pricing.</w:t>
+      </w:r>
+    </w:p>
+    <w:p>
+      <w:pPr>
+        <w:pStyle w:val="Heading3"/>
+      </w:pPr>
+      <w:r>
+        <w:t>Order</w:t>
+      </w:r>
+    </w:p>
+    <w:p>
+      <w:r>
+        <w:drawing>
+          <wp:inline distT="0" distB="0" distL="0" distR="0" wp14:anchorId="1D3FC4D7" wp14:editId="161BCCCD">
+            <wp:extent cx="3355927" cy="2316480"/>
+            <wp:effectExtent l="0" t="0" r="0" b="7620"/>
+            <wp:docPr id="1947471307" name="Picture 1"/>
+            <wp:cNvGraphicFramePr>
+              <a:graphicFrameLocks xmlns:a="http://schemas.openxmlformats.org/drawingml/2006/main" noChangeAspect="1"/>
+            </wp:cNvGraphicFramePr>
+            <a:graphic xmlns:a="http://schemas.openxmlformats.org/drawingml/2006/main">
+              <a:graphicData uri="http://schemas.openxmlformats.org/drawingml/2006/picture">
+                <pic:pic xmlns:pic="http://schemas.openxmlformats.org/drawingml/2006/picture">
+                  <pic:nvPicPr>
+                    <pic:cNvPr id="1947471307" name=""/>
+                    <pic:cNvPicPr/>
+                  </pic:nvPicPr>
+                  <pic:blipFill rotWithShape="1">
+                    <a:blip r:embed="rId20"/>
+                    <a:srcRect l="6325" t="8803" r="6753" b="8816"/>
+                    <a:stretch>
+                      <a:fillRect/>
+                    </a:stretch>
+                  </pic:blipFill>
+                  <pic:spPr bwMode="auto">
+                    <a:xfrm>
+                      <a:off x="0" y="0"/>
+                      <a:ext cx="3361465" cy="2320303"/>
+                    </a:xfrm>
+                    <a:prstGeom prst="rect">
+                      <a:avLst/>
+                    </a:prstGeom>
+                    <a:ln>
+                      <a:noFill/>
+                    </a:ln>
+                    <a:extLst>
+                      <a:ext uri="{53640926-AAD7-44D8-BBD7-CCE9431645EC}">
+                        <a14:shadowObscured xmlns:a14="http://schemas.microsoft.com/office/drawing/2010/main"/>
+                      </a:ext>
+                    </a:extLst>
+                  </pic:spPr>
+                </pic:pic>
+              </a:graphicData>
+            </a:graphic>
+          </wp:inline>
+        </w:drawing>
+      </w:r>
+    </w:p>
+    <w:p>
+      <w:r>
+        <w:t>The Order class represents a complete customer purchase in the system. It stores transaction-level information and supports order tracking, status updates, and administrative reporting.</w:t>
+      </w:r>
+    </w:p>
+    <w:p>
+      <w:pPr>
+        <w:pStyle w:val="Heading3"/>
+      </w:pPr>
+      <w:r>
+        <w:t>OrderItem</w:t>
+      </w:r>
+    </w:p>
+    <w:p>
+      <w:r>
+        <w:drawing>
+          <wp:inline distT="0" distB="0" distL="0" distR="0" wp14:anchorId="5C263734" wp14:editId="2722C957">
+            <wp:extent cx="3789680" cy="2309970"/>
+            <wp:effectExtent l="0" t="0" r="1270" b="0"/>
+            <wp:docPr id="819232001" name="Picture 1"/>
+            <wp:cNvGraphicFramePr>
+              <a:graphicFrameLocks xmlns:a="http://schemas.openxmlformats.org/drawingml/2006/main" noChangeAspect="1"/>
+            </wp:cNvGraphicFramePr>
+            <a:graphic xmlns:a="http://schemas.openxmlformats.org/drawingml/2006/main">
+              <a:graphicData uri="http://schemas.openxmlformats.org/drawingml/2006/picture">
+                <pic:pic xmlns:pic="http://schemas.openxmlformats.org/drawingml/2006/picture">
+                  <pic:nvPicPr>
+                    <pic:cNvPr id="819232001" name=""/>
+                    <pic:cNvPicPr/>
+                  </pic:nvPicPr>
+                  <pic:blipFill rotWithShape="1">
+                    <a:blip r:embed="rId21"/>
+                    <a:srcRect l="6068" t="10180" r="6154" b="10164"/>
+                    <a:stretch>
+                      <a:fillRect/>
+                    </a:stretch>
+                  </pic:blipFill>
+                  <pic:spPr bwMode="auto">
+                    <a:xfrm>
+                      <a:off x="0" y="0"/>
+                      <a:ext cx="3792665" cy="2311789"/>
+                    </a:xfrm>
+                    <a:prstGeom prst="rect">
+                      <a:avLst/>
+                    </a:prstGeom>
+                    <a:ln>
+                      <a:noFill/>
+                    </a:ln>
+                    <a:extLst>
+                      <a:ext uri="{53640926-AAD7-44D8-BBD7-CCE9431645EC}">
+                        <a14:shadowObscured xmlns:a14="http://schemas.microsoft.com/office/drawing/2010/main"/>
+                      </a:ext>
+                    </a:extLst>
+                  </pic:spPr>
+                </pic:pic>
+              </a:graphicData>
+            </a:graphic>
+          </wp:inline>
+        </w:drawing>
+      </w:r>
+    </w:p>
+    <w:p>
+      <w:r>
+        <w:t>The OrderItem class represents a single medicine line within an order. It maintains the link between an order and its medicines and records quantity and pricing details at the time of purchase.</w:t>
+      </w:r>
+    </w:p>
+    <w:p>
+      <w:pPr>
+        <w:pStyle w:val="Heading3"/>
+      </w:pPr>
+      <w:r>
+        <w:lastRenderedPageBreak/>
+        <w:t>Prescription</w:t>
+      </w:r>
+    </w:p>
+    <w:p>
+      <w:r>
+        <w:drawing>
+          <wp:inline distT="0" distB="0" distL="0" distR="0" wp14:anchorId="31886324" wp14:editId="5CFE3112">
+            <wp:extent cx="2971800" cy="2220266"/>
+            <wp:effectExtent l="0" t="0" r="0" b="8890"/>
+            <wp:docPr id="1881785054" name="Picture 1"/>
+            <wp:cNvGraphicFramePr>
+              <a:graphicFrameLocks xmlns:a="http://schemas.openxmlformats.org/drawingml/2006/main" noChangeAspect="1"/>
+            </wp:cNvGraphicFramePr>
+            <a:graphic xmlns:a="http://schemas.openxmlformats.org/drawingml/2006/main">
+              <a:graphicData uri="http://schemas.openxmlformats.org/drawingml/2006/picture">
+                <pic:pic xmlns:pic="http://schemas.openxmlformats.org/drawingml/2006/picture">
+                  <pic:nvPicPr>
+                    <pic:cNvPr id="1881785054" name=""/>
+                    <pic:cNvPicPr/>
+                  </pic:nvPicPr>
+                  <pic:blipFill rotWithShape="1">
+                    <a:blip r:embed="rId22"/>
+                    <a:srcRect l="7877" t="10250" r="8873" b="10641"/>
+                    <a:stretch>
+                      <a:fillRect/>
+                    </a:stretch>
+                  </pic:blipFill>
+                  <pic:spPr bwMode="auto">
+                    <a:xfrm>
+                      <a:off x="0" y="0"/>
+                      <a:ext cx="2978139" cy="2225002"/>
+                    </a:xfrm>
+                    <a:prstGeom prst="rect">
+                      <a:avLst/>
+                    </a:prstGeom>
+                    <a:ln>
+                      <a:noFill/>
+                    </a:ln>
+                    <a:extLst>
+                      <a:ext uri="{53640926-AAD7-44D8-BBD7-CCE9431645EC}">
+                        <a14:shadowObscured xmlns:a14="http://schemas.microsoft.com/office/drawing/2010/main"/>
+                      </a:ext>
+                    </a:extLst>
+                  </pic:spPr>
+                </pic:pic>
+              </a:graphicData>
+            </a:graphic>
+          </wp:inline>
+        </w:drawing>
+      </w:r>
+    </w:p>
+    <w:p>
+      <w:r>
+        <w:t>The Prescription class handles prescription documents submitted by customers for restricted medicines. It supports future prescription verification features required for controlled medicine dispensing.</w:t>
       </w:r>
     </w:p>
     <w:p>

</xml_diff>

<commit_message>
Refactor SmartMed services and enhance report documentation
- Replaced repository classes with service classes (OrderService, CustomerService, MedicineService) to improve code organization and encapsulation of business logic.
- Updated AdminDashboardForm, ManageCustomersForm, ManageOrdersForm, and ReportsForm to utilize the new service classes, enhancing maintainability and readability.
- Added new features to the SmartMed Report.docx, including a Low Stock Alert System, Medicine Expiry Warning Dashboard, Prescription Verification System, Password Change Functionality, and Order Cancellation, to provide a comprehensive overview of system capabilities.
</commit_message>
<xml_diff>
--- a/Docs/Report/SmartMed Report.docx
+++ b/Docs/Report/SmartMed Report.docx
@@ -1492,7 +1492,13 @@
         <w:spacing w:line="360" w:lineRule="auto"/>
       </w:pPr>
       <w:r>
-        <w:t>Maintain medicine information by adding new medicines, updating existing records, removing discontinued medicines, and managing details such as category, dosage, price, stock quantity, supplier information, expiry dates, and prescription requirements.</w:t>
+        <w:t xml:space="preserve">Maintain medicine information by adding new medicines, updating existing records, removing discontinued medicines, and managing details such as </w:t>
+      </w:r>
+      <w:r>
+        <w:t xml:space="preserve">name, </w:t>
+      </w:r>
+      <w:r>
+        <w:t>category, dosage, price, stock quantity, supplier information, expiry dates, and prescription requirements.</w:t>
       </w:r>
     </w:p>
     <w:p>
@@ -1518,7 +1524,13 @@
         <w:spacing w:line="360" w:lineRule="auto"/>
       </w:pPr>
       <w:r>
-        <w:t xml:space="preserve"> Oversee customer orders by viewing all orders placed through the system, reviewing order details, and updating order statuses from Pending to Ready for Pickup or Delivered.</w:t>
+        <w:t xml:space="preserve"> Oversee customer orders by viewing all orders placed through the system</w:t>
+      </w:r>
+      <w:r>
+        <w:t xml:space="preserve"> </w:t>
+      </w:r>
+      <w:r>
+        <w:t>and updating order statuses from Pending to Ready for Pickup or Delivered.</w:t>
       </w:r>
     </w:p>
     <w:p>
@@ -1689,10 +1701,120 @@
     </w:p>
     <w:p>
       <w:pPr>
+        <w:pStyle w:val="Heading3"/>
+        <w:spacing w:line="360" w:lineRule="auto"/>
+      </w:pPr>
+      <w:r>
+        <w:t>Additional Features</w:t>
+      </w:r>
+    </w:p>
+    <w:p>
+      <w:pPr>
+        <w:pStyle w:val="ListParagraph"/>
+        <w:numPr>
+          <w:ilvl w:val="0"/>
+          <w:numId w:val="18"/>
+        </w:numPr>
+        <w:spacing w:line="360" w:lineRule="auto"/>
+        <w:jc w:val="lowKashida"/>
+      </w:pPr>
+      <w:r>
+        <w:t>Low Stock Alert System</w:t>
+      </w:r>
+      <w:r>
+        <w:t xml:space="preserve"> - </w:t>
+      </w:r>
+      <w:r>
+        <w:t>The system will automatically monitor medicine inventory levels and notify administrators when the stock quantity of a medicine falls below a predefined threshold. This helps prevent stock shortages and ensures the availability of essential medicines.</w:t>
+      </w:r>
+    </w:p>
+    <w:p>
+      <w:pPr>
+        <w:pStyle w:val="ListParagraph"/>
+        <w:numPr>
+          <w:ilvl w:val="0"/>
+          <w:numId w:val="18"/>
+        </w:numPr>
+        <w:spacing w:line="360" w:lineRule="auto"/>
+        <w:jc w:val="lowKashida"/>
+      </w:pPr>
+      <w:r>
+        <w:t>Medicine Expiry Warning Dashboard</w:t>
+      </w:r>
+      <w:r>
+        <w:t xml:space="preserve"> - </w:t>
+      </w:r>
+      <w:r>
+        <w:t>The system will identify medicines approaching their expiry dates and display warning notifications on the administrator dashboard. This assists in inventory management and reduces the risk of dispensing expired medicines.</w:t>
+      </w:r>
+    </w:p>
+    <w:p>
+      <w:pPr>
+        <w:pStyle w:val="ListParagraph"/>
+        <w:numPr>
+          <w:ilvl w:val="0"/>
+          <w:numId w:val="18"/>
+        </w:numPr>
+        <w:spacing w:line="360" w:lineRule="auto"/>
+        <w:jc w:val="lowKashida"/>
+      </w:pPr>
+      <w:r>
+        <w:t>Prescription Verification System</w:t>
+      </w:r>
+      <w:r>
+        <w:t xml:space="preserve"> - </w:t>
+      </w:r>
+      <w:r>
+        <w:t>The system will require customers to upload a valid prescription when ordering medicines marked as prescription-required. Orders containing prescription medicines cannot be processed unless the required prescription document has been uploaded and verified.</w:t>
+      </w:r>
+    </w:p>
+    <w:p>
+      <w:pPr>
+        <w:pStyle w:val="ListParagraph"/>
+        <w:numPr>
+          <w:ilvl w:val="0"/>
+          <w:numId w:val="18"/>
+        </w:numPr>
+        <w:spacing w:line="360" w:lineRule="auto"/>
+        <w:jc w:val="lowKashida"/>
+      </w:pPr>
+      <w:r>
+        <w:t>Password Change Functionality</w:t>
+      </w:r>
+      <w:r>
+        <w:t xml:space="preserve"> - </w:t>
+      </w:r>
+      <w:r>
+        <w:t>The system will allow both administrators and customers to securely change their account passwords after successful authentication, improving account security and user management.</w:t>
+      </w:r>
+    </w:p>
+    <w:p>
+      <w:pPr>
+        <w:pStyle w:val="ListParagraph"/>
+        <w:numPr>
+          <w:ilvl w:val="0"/>
+          <w:numId w:val="18"/>
+        </w:numPr>
+        <w:spacing w:line="360" w:lineRule="auto"/>
+        <w:jc w:val="lowKashida"/>
+      </w:pPr>
+      <w:r>
+        <w:t>Order Cancellation</w:t>
+      </w:r>
+      <w:r>
+        <w:t xml:space="preserve"> - </w:t>
+      </w:r>
+      <w:r>
+        <w:t>The system will allow customers to cancel orders that are still in the Pending status. Once an order has been processed or marked as Ready for Pickup, cancellation will no longer be permitted.</w:t>
+      </w:r>
+    </w:p>
+    <w:p>
+      <w:pPr>
         <w:pStyle w:val="Heading2"/>
         <w:spacing w:line="360" w:lineRule="auto"/>
       </w:pPr>
       <w:r>
+        <w:lastRenderedPageBreak/>
         <w:t>Non-Functional Requirements</w:t>
       </w:r>
     </w:p>
@@ -1820,7 +1942,6 @@
         <w:spacing w:line="360" w:lineRule="auto"/>
       </w:pPr>
       <w:r>
-        <w:lastRenderedPageBreak/>
         <w:t xml:space="preserve">Scalability </w:t>
       </w:r>
       <w:r>
@@ -1916,6 +2037,7 @@
         <w:spacing w:line="360" w:lineRule="auto"/>
       </w:pPr>
       <w:r>
+        <w:lastRenderedPageBreak/>
         <w:t>Software Requirements</w:t>
       </w:r>
     </w:p>
@@ -2545,6 +2667,9 @@
     </w:p>
     <w:p>
       <w:r>
+        <w:rPr>
+          <w:noProof/>
+        </w:rPr>
         <w:drawing>
           <wp:inline distT="0" distB="0" distL="0" distR="0" wp14:anchorId="0D0D4C96" wp14:editId="2ACFA72F">
             <wp:extent cx="3100705" cy="1878830"/>
@@ -2606,6 +2731,9 @@
     </w:p>
     <w:p>
       <w:r>
+        <w:rPr>
+          <w:noProof/>
+        </w:rPr>
         <w:drawing>
           <wp:inline distT="0" distB="0" distL="0" distR="0" wp14:anchorId="49B61C41" wp14:editId="61E03D20">
             <wp:extent cx="2235200" cy="1974850"/>
@@ -2668,6 +2796,9 @@
     </w:p>
     <w:p>
       <w:r>
+        <w:rPr>
+          <w:noProof/>
+        </w:rPr>
         <w:drawing>
           <wp:inline distT="0" distB="0" distL="0" distR="0" wp14:anchorId="58C96E5C" wp14:editId="727226C4">
             <wp:extent cx="2971800" cy="2557772"/>
@@ -2730,6 +2861,9 @@
     </w:p>
     <w:p>
       <w:r>
+        <w:rPr>
+          <w:noProof/>
+        </w:rPr>
         <w:drawing>
           <wp:inline distT="0" distB="0" distL="0" distR="0" wp14:anchorId="17A512C2" wp14:editId="7AEE6A4C">
             <wp:extent cx="4425950" cy="7708900"/>
@@ -2792,6 +2926,9 @@
     </w:p>
     <w:p>
       <w:r>
+        <w:rPr>
+          <w:noProof/>
+        </w:rPr>
         <w:drawing>
           <wp:inline distT="0" distB="0" distL="0" distR="0" wp14:anchorId="1D3FC4D7" wp14:editId="161BCCCD">
             <wp:extent cx="3355927" cy="2316480"/>
@@ -2853,6 +2990,9 @@
     </w:p>
     <w:p>
       <w:r>
+        <w:rPr>
+          <w:noProof/>
+        </w:rPr>
         <w:drawing>
           <wp:inline distT="0" distB="0" distL="0" distR="0" wp14:anchorId="5C263734" wp14:editId="2722C957">
             <wp:extent cx="3789680" cy="2309970"/>
@@ -2915,6 +3055,9 @@
     </w:p>
     <w:p>
       <w:r>
+        <w:rPr>
+          <w:noProof/>
+        </w:rPr>
         <w:drawing>
           <wp:inline distT="0" distB="0" distL="0" distR="0" wp14:anchorId="31886324" wp14:editId="5CFE3112">
             <wp:extent cx="2971800" cy="2220266"/>
@@ -3567,6 +3710,95 @@
     </w:lvl>
   </w:abstractNum>
   <w:abstractNum w:abstractNumId="12" w15:restartNumberingAfterBreak="0">
+    <w:nsid w:val="28766E03"/>
+    <w:multiLevelType w:val="hybridMultilevel"/>
+    <w:tmpl w:val="08DAFF7C"/>
+    <w:lvl w:ilvl="0" w:tplc="0409000F">
+      <w:start w:val="1"/>
+      <w:numFmt w:val="decimal"/>
+      <w:lvlText w:val="%1."/>
+      <w:lvlJc w:val="left"/>
+      <w:pPr>
+        <w:ind w:left="720" w:hanging="360"/>
+      </w:pPr>
+      <w:rPr>
+        <w:rFonts w:hint="default"/>
+      </w:rPr>
+    </w:lvl>
+    <w:lvl w:ilvl="1" w:tplc="04090019" w:tentative="1">
+      <w:start w:val="1"/>
+      <w:numFmt w:val="lowerLetter"/>
+      <w:lvlText w:val="%2."/>
+      <w:lvlJc w:val="left"/>
+      <w:pPr>
+        <w:ind w:left="1440" w:hanging="360"/>
+      </w:pPr>
+    </w:lvl>
+    <w:lvl w:ilvl="2" w:tplc="0409001B" w:tentative="1">
+      <w:start w:val="1"/>
+      <w:numFmt w:val="lowerRoman"/>
+      <w:lvlText w:val="%3."/>
+      <w:lvlJc w:val="right"/>
+      <w:pPr>
+        <w:ind w:left="2160" w:hanging="180"/>
+      </w:pPr>
+    </w:lvl>
+    <w:lvl w:ilvl="3" w:tplc="0409000F" w:tentative="1">
+      <w:start w:val="1"/>
+      <w:numFmt w:val="decimal"/>
+      <w:lvlText w:val="%4."/>
+      <w:lvlJc w:val="left"/>
+      <w:pPr>
+        <w:ind w:left="2880" w:hanging="360"/>
+      </w:pPr>
+    </w:lvl>
+    <w:lvl w:ilvl="4" w:tplc="04090019" w:tentative="1">
+      <w:start w:val="1"/>
+      <w:numFmt w:val="lowerLetter"/>
+      <w:lvlText w:val="%5."/>
+      <w:lvlJc w:val="left"/>
+      <w:pPr>
+        <w:ind w:left="3600" w:hanging="360"/>
+      </w:pPr>
+    </w:lvl>
+    <w:lvl w:ilvl="5" w:tplc="0409001B" w:tentative="1">
+      <w:start w:val="1"/>
+      <w:numFmt w:val="lowerRoman"/>
+      <w:lvlText w:val="%6."/>
+      <w:lvlJc w:val="right"/>
+      <w:pPr>
+        <w:ind w:left="4320" w:hanging="180"/>
+      </w:pPr>
+    </w:lvl>
+    <w:lvl w:ilvl="6" w:tplc="0409000F" w:tentative="1">
+      <w:start w:val="1"/>
+      <w:numFmt w:val="decimal"/>
+      <w:lvlText w:val="%7."/>
+      <w:lvlJc w:val="left"/>
+      <w:pPr>
+        <w:ind w:left="5040" w:hanging="360"/>
+      </w:pPr>
+    </w:lvl>
+    <w:lvl w:ilvl="7" w:tplc="04090019" w:tentative="1">
+      <w:start w:val="1"/>
+      <w:numFmt w:val="lowerLetter"/>
+      <w:lvlText w:val="%8."/>
+      <w:lvlJc w:val="left"/>
+      <w:pPr>
+        <w:ind w:left="5760" w:hanging="360"/>
+      </w:pPr>
+    </w:lvl>
+    <w:lvl w:ilvl="8" w:tplc="0409001B" w:tentative="1">
+      <w:start w:val="1"/>
+      <w:numFmt w:val="lowerRoman"/>
+      <w:lvlText w:val="%9."/>
+      <w:lvlJc w:val="right"/>
+      <w:pPr>
+        <w:ind w:left="6480" w:hanging="180"/>
+      </w:pPr>
+    </w:lvl>
+  </w:abstractNum>
+  <w:abstractNum w:abstractNumId="13" w15:restartNumberingAfterBreak="0">
     <w:nsid w:val="2B976DFC"/>
     <w:multiLevelType w:val="hybridMultilevel"/>
     <w:tmpl w:val="66B809CE"/>
@@ -3679,7 +3911,7 @@
       </w:rPr>
     </w:lvl>
   </w:abstractNum>
-  <w:abstractNum w:abstractNumId="13" w15:restartNumberingAfterBreak="0">
+  <w:abstractNum w:abstractNumId="14" w15:restartNumberingAfterBreak="0">
     <w:nsid w:val="2FD4207E"/>
     <w:multiLevelType w:val="hybridMultilevel"/>
     <w:tmpl w:val="966AF0DC"/>
@@ -3792,7 +4024,7 @@
       </w:rPr>
     </w:lvl>
   </w:abstractNum>
-  <w:abstractNum w:abstractNumId="14" w15:restartNumberingAfterBreak="0">
+  <w:abstractNum w:abstractNumId="15" w15:restartNumberingAfterBreak="0">
     <w:nsid w:val="30932349"/>
     <w:multiLevelType w:val="hybridMultilevel"/>
     <w:tmpl w:val="A8181AEC"/>
@@ -3905,7 +4137,7 @@
       </w:rPr>
     </w:lvl>
   </w:abstractNum>
-  <w:abstractNum w:abstractNumId="15" w15:restartNumberingAfterBreak="0">
+  <w:abstractNum w:abstractNumId="16" w15:restartNumberingAfterBreak="0">
     <w:nsid w:val="5F464D31"/>
     <w:multiLevelType w:val="hybridMultilevel"/>
     <w:tmpl w:val="2EC21C5A"/>
@@ -4018,7 +4250,7 @@
       </w:rPr>
     </w:lvl>
   </w:abstractNum>
-  <w:abstractNum w:abstractNumId="16" w15:restartNumberingAfterBreak="0">
+  <w:abstractNum w:abstractNumId="17" w15:restartNumberingAfterBreak="0">
     <w:nsid w:val="720F67F9"/>
     <w:multiLevelType w:val="hybridMultilevel"/>
     <w:tmpl w:val="2778772A"/>
@@ -4165,22 +4397,25 @@
     <w:abstractNumId w:val="10"/>
   </w:num>
   <w:num w:numId="12" w16cid:durableId="1451971671">
-    <w:abstractNumId w:val="15"/>
+    <w:abstractNumId w:val="16"/>
   </w:num>
   <w:num w:numId="13" w16cid:durableId="679086494">
-    <w:abstractNumId w:val="13"/>
+    <w:abstractNumId w:val="14"/>
   </w:num>
   <w:num w:numId="14" w16cid:durableId="44184568">
-    <w:abstractNumId w:val="16"/>
+    <w:abstractNumId w:val="17"/>
   </w:num>
   <w:num w:numId="15" w16cid:durableId="164131351">
-    <w:abstractNumId w:val="12"/>
+    <w:abstractNumId w:val="13"/>
   </w:num>
   <w:num w:numId="16" w16cid:durableId="1368875909">
     <w:abstractNumId w:val="11"/>
   </w:num>
   <w:num w:numId="17" w16cid:durableId="1780880576">
-    <w:abstractNumId w:val="14"/>
+    <w:abstractNumId w:val="15"/>
+  </w:num>
+  <w:num w:numId="18" w16cid:durableId="1309243943">
+    <w:abstractNumId w:val="12"/>
   </w:num>
 </w:numbering>
 </file>
@@ -4790,6 +5025,7 @@
   <w:style w:type="character" w:default="1" w:styleId="DefaultParagraphFont">
     <w:name w:val="Default Paragraph Font"/>
     <w:uiPriority w:val="1"/>
+    <w:semiHidden/>
     <w:unhideWhenUsed/>
   </w:style>
   <w:style w:type="table" w:default="1" w:styleId="TableNormal">
@@ -15571,6 +15807,21 @@
     <w:rPr>
       <w:color w:val="0000FF" w:themeColor="hyperlink"/>
       <w:u w:val="single"/>
+    </w:rPr>
+  </w:style>
+  <w:style w:type="paragraph" w:styleId="NormalWeb">
+    <w:name w:val="Normal (Web)"/>
+    <w:basedOn w:val="Normal"/>
+    <w:uiPriority w:val="99"/>
+    <w:unhideWhenUsed/>
+    <w:rsid w:val="00D639DE"/>
+    <w:pPr>
+      <w:spacing w:before="100" w:beforeAutospacing="1" w:after="100" w:afterAutospacing="1" w:line="240" w:lineRule="auto"/>
+    </w:pPr>
+    <w:rPr>
+      <w:rFonts w:ascii="Times New Roman" w:eastAsia="Times New Roman" w:hAnsi="Times New Roman" w:cs="Times New Roman"/>
+      <w:color w:val="auto"/>
+      <w:szCs w:val="24"/>
     </w:rPr>
   </w:style>
 </w:styles>

</xml_diff>

<commit_message>
Refactor stock validation logic in ManageMedicinesForm and MedicineService
- Reverted to using a validation service for stock quantity to ensure non-negative values.
- Updated error messages to specify that stock quantity must be greater than or equal to 0.
- Restored default stock value to 0 in ManageMedicinesForm during form resets for improved user experience.
</commit_message>
<xml_diff>
--- a/Docs/Report/SmartMed Report.docx
+++ b/Docs/Report/SmartMed Report.docx
@@ -1719,13 +1719,7 @@
         <w:jc w:val="lowKashida"/>
       </w:pPr>
       <w:r>
-        <w:t>Low Stock Alert System</w:t>
-      </w:r>
-      <w:r>
-        <w:t xml:space="preserve"> - </w:t>
-      </w:r>
-      <w:r>
-        <w:t>The system will automatically monitor medicine inventory levels and notify administrators when the stock quantity of a medicine falls below a predefined threshold. This helps prevent stock shortages and ensures the availability of essential medicines.</w:t>
+        <w:t>Low Stock Alert System - The system will automatically monitor medicine inventory levels and notify administrators when the stock quantity of a medicine falls below a predefined threshold. This helps prevent stock shortages and ensures the availability of essential medicines.</w:t>
       </w:r>
     </w:p>
     <w:p>
@@ -1739,13 +1733,7 @@
         <w:jc w:val="lowKashida"/>
       </w:pPr>
       <w:r>
-        <w:t>Medicine Expiry Warning Dashboard</w:t>
-      </w:r>
-      <w:r>
-        <w:t xml:space="preserve"> - </w:t>
-      </w:r>
-      <w:r>
-        <w:t>The system will identify medicines approaching their expiry dates and display warning notifications on the administrator dashboard. This assists in inventory management and reduces the risk of dispensing expired medicines.</w:t>
+        <w:t>Medicine Expiry Warning Dashboard - The system will identify medicines approaching their expiry dates and display warning notifications on the administrator dashboard. This assists in inventory management and reduces the risk of dispensing expired medicines.</w:t>
       </w:r>
     </w:p>
     <w:p>
@@ -1759,13 +1747,7 @@
         <w:jc w:val="lowKashida"/>
       </w:pPr>
       <w:r>
-        <w:t>Prescription Verification System</w:t>
-      </w:r>
-      <w:r>
-        <w:t xml:space="preserve"> - </w:t>
-      </w:r>
-      <w:r>
-        <w:t>The system will require customers to upload a valid prescription when ordering medicines marked as prescription-required. Orders containing prescription medicines cannot be processed unless the required prescription document has been uploaded and verified.</w:t>
+        <w:t>Prescription Verification System - The system will require customers to upload a valid prescription when ordering medicines marked as prescription-required. Orders containing prescription medicines cannot be processed unless the required prescription document has been uploaded and verified.</w:t>
       </w:r>
     </w:p>
     <w:p>
@@ -1779,13 +1761,7 @@
         <w:jc w:val="lowKashida"/>
       </w:pPr>
       <w:r>
-        <w:t>Password Change Functionality</w:t>
-      </w:r>
-      <w:r>
-        <w:t xml:space="preserve"> - </w:t>
-      </w:r>
-      <w:r>
-        <w:t>The system will allow both administrators and customers to securely change their account passwords after successful authentication, improving account security and user management.</w:t>
+        <w:t>Password Change Functionality - The system will allow both administrators and customers to securely change their account passwords after successful authentication, improving account security and user management.</w:t>
       </w:r>
     </w:p>
     <w:p>
@@ -1799,13 +1775,7 @@
         <w:jc w:val="lowKashida"/>
       </w:pPr>
       <w:r>
-        <w:t>Order Cancellation</w:t>
-      </w:r>
-      <w:r>
-        <w:t xml:space="preserve"> - </w:t>
-      </w:r>
-      <w:r>
-        <w:t>The system will allow customers to cancel orders that are still in the Pending status. Once an order has been processed or marked as Ready for Pickup, cancellation will no longer be permitted.</w:t>
+        <w:t>Order Cancellation - The system will allow customers to cancel orders that are still in the Pending status. Once an order has been processed or marked as Ready for Pickup, cancellation will no longer be permitted.</w:t>
       </w:r>
     </w:p>
     <w:p>
@@ -2347,59 +2317,6 @@
       <w:pPr>
         <w:spacing w:line="360" w:lineRule="auto"/>
       </w:pPr>
-      <w:r>
-        <w:rPr>
-          <w:noProof/>
-        </w:rPr>
-        <w:drawing>
-          <wp:inline distT="0" distB="0" distL="0" distR="0" wp14:anchorId="4FDABAD7" wp14:editId="080059B7">
-            <wp:extent cx="5939155" cy="4481830"/>
-            <wp:effectExtent l="0" t="0" r="4445" b="0"/>
-            <wp:docPr id="869234931" name="Picture 3"/>
-            <wp:cNvGraphicFramePr>
-              <a:graphicFrameLocks xmlns:a="http://schemas.openxmlformats.org/drawingml/2006/main" noChangeAspect="1"/>
-            </wp:cNvGraphicFramePr>
-            <a:graphic xmlns:a="http://schemas.openxmlformats.org/drawingml/2006/main">
-              <a:graphicData uri="http://schemas.openxmlformats.org/drawingml/2006/picture">
-                <pic:pic xmlns:pic="http://schemas.openxmlformats.org/drawingml/2006/picture">
-                  <pic:nvPicPr>
-                    <pic:cNvPr id="0" name="Picture 2"/>
-                    <pic:cNvPicPr>
-                      <a:picLocks noChangeAspect="1" noChangeArrowheads="1"/>
-                    </pic:cNvPicPr>
-                  </pic:nvPicPr>
-                  <pic:blipFill>
-                    <a:blip r:embed="rId12">
-                      <a:extLst>
-                        <a:ext uri="{28A0092B-C50C-407E-A947-70E740481C1C}">
-                          <a14:useLocalDpi xmlns:a14="http://schemas.microsoft.com/office/drawing/2010/main" val="0"/>
-                        </a:ext>
-                      </a:extLst>
-                    </a:blip>
-                    <a:srcRect/>
-                    <a:stretch>
-                      <a:fillRect/>
-                    </a:stretch>
-                  </pic:blipFill>
-                  <pic:spPr bwMode="auto">
-                    <a:xfrm>
-                      <a:off x="0" y="0"/>
-                      <a:ext cx="5939155" cy="4481830"/>
-                    </a:xfrm>
-                    <a:prstGeom prst="rect">
-                      <a:avLst/>
-                    </a:prstGeom>
-                    <a:noFill/>
-                    <a:ln>
-                      <a:noFill/>
-                    </a:ln>
-                  </pic:spPr>
-                </pic:pic>
-              </a:graphicData>
-            </a:graphic>
-          </wp:inline>
-        </w:drawing>
-      </w:r>
     </w:p>
     <w:p>
       <w:pPr>
@@ -2415,7 +2332,6 @@
         <w:spacing w:line="360" w:lineRule="auto"/>
       </w:pPr>
       <w:r>
-        <w:lastRenderedPageBreak/>
         <w:t>Class Diagram</w:t>
       </w:r>
     </w:p>
@@ -2445,7 +2361,7 @@
                     </pic:cNvPicPr>
                   </pic:nvPicPr>
                   <pic:blipFill>
-                    <a:blip r:embed="rId13">
+                    <a:blip r:embed="rId12">
                       <a:extLst>
                         <a:ext uri="{28A0092B-C50C-407E-A947-70E740481C1C}">
                           <a14:useLocalDpi xmlns:a14="http://schemas.microsoft.com/office/drawing/2010/main" val="0"/>
@@ -2545,7 +2461,7 @@
                     </pic:cNvPicPr>
                   </pic:nvPicPr>
                   <pic:blipFill>
-                    <a:blip r:embed="rId14">
+                    <a:blip r:embed="rId13">
                       <a:extLst>
                         <a:ext uri="{28A0092B-C50C-407E-A947-70E740481C1C}">
                           <a14:useLocalDpi xmlns:a14="http://schemas.microsoft.com/office/drawing/2010/main" val="0"/>
@@ -2598,7 +2514,7 @@
                     </pic:cNvPicPr>
                   </pic:nvPicPr>
                   <pic:blipFill>
-                    <a:blip r:embed="rId15">
+                    <a:blip r:embed="rId14">
                       <a:extLst>
                         <a:ext uri="{28A0092B-C50C-407E-A947-70E740481C1C}">
                           <a14:useLocalDpi xmlns:a14="http://schemas.microsoft.com/office/drawing/2010/main" val="0"/>
@@ -2686,7 +2602,7 @@
                     <pic:cNvPicPr/>
                   </pic:nvPicPr>
                   <pic:blipFill rotWithShape="1">
-                    <a:blip r:embed="rId16"/>
+                    <a:blip r:embed="rId15"/>
                     <a:srcRect l="8479" t="12755" r="8475" b="13408"/>
                     <a:stretch>
                       <a:fillRect/>
@@ -2750,7 +2666,7 @@
                     <pic:cNvPicPr/>
                   </pic:nvPicPr>
                   <pic:blipFill rotWithShape="1">
-                    <a:blip r:embed="rId17"/>
+                    <a:blip r:embed="rId16"/>
                     <a:srcRect l="8929" t="10036" r="8363" b="9910"/>
                     <a:stretch>
                       <a:fillRect/>
@@ -2815,7 +2731,7 @@
                     <pic:cNvPicPr/>
                   </pic:nvPicPr>
                   <pic:blipFill rotWithShape="1">
-                    <a:blip r:embed="rId18"/>
+                    <a:blip r:embed="rId17"/>
                     <a:srcRect l="8463" t="9975" r="8718" b="9650"/>
                     <a:stretch>
                       <a:fillRect/>
@@ -2855,64 +2771,12 @@
         <w:pStyle w:val="Heading3"/>
       </w:pPr>
       <w:r>
-        <w:lastRenderedPageBreak/>
         <w:t>Medicine</w:t>
       </w:r>
     </w:p>
+    <w:p/>
     <w:p>
       <w:r>
-        <w:rPr>
-          <w:noProof/>
-        </w:rPr>
-        <w:drawing>
-          <wp:inline distT="0" distB="0" distL="0" distR="0" wp14:anchorId="17A512C2" wp14:editId="7AEE6A4C">
-            <wp:extent cx="4425950" cy="7708900"/>
-            <wp:effectExtent l="0" t="0" r="0" b="6350"/>
-            <wp:docPr id="1808248992" name="Picture 1"/>
-            <wp:cNvGraphicFramePr>
-              <a:graphicFrameLocks xmlns:a="http://schemas.openxmlformats.org/drawingml/2006/main" noChangeAspect="1"/>
-            </wp:cNvGraphicFramePr>
-            <a:graphic xmlns:a="http://schemas.openxmlformats.org/drawingml/2006/main">
-              <a:graphicData uri="http://schemas.openxmlformats.org/drawingml/2006/picture">
-                <pic:pic xmlns:pic="http://schemas.openxmlformats.org/drawingml/2006/picture">
-                  <pic:nvPicPr>
-                    <pic:cNvPr id="1808248992" name=""/>
-                    <pic:cNvPicPr/>
-                  </pic:nvPicPr>
-                  <pic:blipFill rotWithShape="1">
-                    <a:blip r:embed="rId19"/>
-                    <a:srcRect l="5612" t="3163" r="5484" b="3163"/>
-                    <a:stretch>
-                      <a:fillRect/>
-                    </a:stretch>
-                  </pic:blipFill>
-                  <pic:spPr bwMode="auto">
-                    <a:xfrm>
-                      <a:off x="0" y="0"/>
-                      <a:ext cx="4425950" cy="7708900"/>
-                    </a:xfrm>
-                    <a:prstGeom prst="rect">
-                      <a:avLst/>
-                    </a:prstGeom>
-                    <a:ln>
-                      <a:noFill/>
-                    </a:ln>
-                    <a:extLst>
-                      <a:ext uri="{53640926-AAD7-44D8-BBD7-CCE9431645EC}">
-                        <a14:shadowObscured xmlns:a14="http://schemas.microsoft.com/office/drawing/2010/main"/>
-                      </a:ext>
-                    </a:extLst>
-                  </pic:spPr>
-                </pic:pic>
-              </a:graphicData>
-            </a:graphic>
-          </wp:inline>
-        </w:drawing>
-      </w:r>
-    </w:p>
-    <w:p>
-      <w:r>
-        <w:lastRenderedPageBreak/>
         <w:t>The Medicine class models products stored in the pharmacy inventory. It is used for stock management and supports business rules such as expiry checking, low stock detection, and promotional pricing.</w:t>
       </w:r>
     </w:p>
@@ -2945,7 +2809,7 @@
                     <pic:cNvPicPr/>
                   </pic:nvPicPr>
                   <pic:blipFill rotWithShape="1">
-                    <a:blip r:embed="rId20"/>
+                    <a:blip r:embed="rId18"/>
                     <a:srcRect l="6325" t="8803" r="6753" b="8816"/>
                     <a:stretch>
                       <a:fillRect/>
@@ -2977,6 +2841,7 @@
     </w:p>
     <w:p>
       <w:r>
+        <w:lastRenderedPageBreak/>
         <w:t>The Order class represents a complete customer purchase in the system. It stores transaction-level information and supports order tracking, status updates, and administrative reporting.</w:t>
       </w:r>
     </w:p>
@@ -3009,7 +2874,7 @@
                     <pic:cNvPicPr/>
                   </pic:nvPicPr>
                   <pic:blipFill rotWithShape="1">
-                    <a:blip r:embed="rId21"/>
+                    <a:blip r:embed="rId19"/>
                     <a:srcRect l="6068" t="10180" r="6154" b="10164"/>
                     <a:stretch>
                       <a:fillRect/>
@@ -3049,7 +2914,6 @@
         <w:pStyle w:val="Heading3"/>
       </w:pPr>
       <w:r>
-        <w:lastRenderedPageBreak/>
         <w:t>Prescription</w:t>
       </w:r>
     </w:p>
@@ -3074,7 +2938,7 @@
                     <pic:cNvPicPr/>
                   </pic:nvPicPr>
                   <pic:blipFill rotWithShape="1">
-                    <a:blip r:embed="rId22"/>
+                    <a:blip r:embed="rId20"/>
                     <a:srcRect l="7877" t="10250" r="8873" b="10641"/>
                     <a:stretch>
                       <a:fillRect/>
@@ -3115,6 +2979,7 @@
         <w:spacing w:line="360" w:lineRule="auto"/>
       </w:pPr>
       <w:r>
+        <w:lastRenderedPageBreak/>
         <w:t>Implementation</w:t>
       </w:r>
     </w:p>

</xml_diff>

<commit_message>
Update agent configurations to enable background processing
- Modified agent definitions for business logic, documentation, architecture, SQL repository, and WinForms UI to set is_background to true.
- Streamlined agent descriptions for clarity and consistency across the SmartMed project.
- Ensured all agents inherit the updated model structure for improved task management and delegation.
</commit_message>
<xml_diff>
--- a/Docs/Report/SmartMed Report.docx
+++ b/Docs/Report/SmartMed Report.docx
@@ -200,9 +200,24 @@
         <w:rPr>
           <w:color w:val="17365D" w:themeColor="text2" w:themeShade="BF"/>
         </w:rPr>
-        <w:t xml:space="preserve">Module Leader : </w:t>
+        <w:t xml:space="preserve">Module </w:t>
+      </w:r>
+      <w:proofErr w:type="gramStart"/>
+      <w:r>
+        <w:rPr>
+          <w:color w:val="17365D" w:themeColor="text2" w:themeShade="BF"/>
+        </w:rPr>
+        <w:t>Leader :</w:t>
+      </w:r>
+      <w:proofErr w:type="gramEnd"/>
+      <w:r>
+        <w:rPr>
+          <w:color w:val="17365D" w:themeColor="text2" w:themeShade="BF"/>
+        </w:rPr>
+        <w:t xml:space="preserve"> </w:t>
       </w:r>
       <w:proofErr w:type="spellStart"/>
+      <w:proofErr w:type="gramStart"/>
       <w:r>
         <w:rPr>
           <w:rFonts w:cstheme="majorBidi"/>
@@ -215,6 +230,7 @@
         <w:t>Ms.Shifani</w:t>
       </w:r>
       <w:proofErr w:type="spellEnd"/>
+      <w:proofErr w:type="gramEnd"/>
       <w:r>
         <w:rPr>
           <w:rFonts w:cstheme="majorBidi"/>
@@ -239,11 +255,19 @@
           <w:szCs w:val="24"/>
         </w:rPr>
       </w:pPr>
+      <w:proofErr w:type="gramStart"/>
       <w:r>
         <w:rPr>
           <w:color w:val="17365D" w:themeColor="text2" w:themeShade="BF"/>
         </w:rPr>
-        <w:t>Student : M.N Sahla Baanu – E301118 [</w:t>
+        <w:t>Student :</w:t>
+      </w:r>
+      <w:proofErr w:type="gramEnd"/>
+      <w:r>
+        <w:rPr>
+          <w:color w:val="17365D" w:themeColor="text2" w:themeShade="BF"/>
+        </w:rPr>
+        <w:t xml:space="preserve"> M.N Sahla Baanu – E301118 [</w:t>
       </w:r>
       <w:r>
         <w:rPr>
@@ -525,6 +549,7 @@
         </w:rPr>
         <w:t xml:space="preserve"> the </w:t>
       </w:r>
+      <w:proofErr w:type="gramStart"/>
       <w:r>
         <w:rPr>
           <w:iCs/>
@@ -542,6 +567,7 @@
         </w:rPr>
         <w:t>th</w:t>
       </w:r>
+      <w:proofErr w:type="gramEnd"/>
       <w:r>
         <w:rPr>
           <w:iCs/>
@@ -585,6 +611,7 @@
         <w:t xml:space="preserve"> </w:t>
       </w:r>
       <w:proofErr w:type="spellStart"/>
+      <w:proofErr w:type="gramStart"/>
       <w:r>
         <w:rPr>
           <w:rFonts w:cstheme="majorBidi"/>
@@ -596,6 +623,7 @@
         <w:t>Ms.Shifani</w:t>
       </w:r>
       <w:proofErr w:type="spellEnd"/>
+      <w:proofErr w:type="gramEnd"/>
       <w:r>
         <w:rPr>
           <w:rFonts w:cstheme="majorBidi"/>
@@ -703,7 +731,23 @@
           <w:rFonts w:cstheme="majorBidi"/>
           <w:szCs w:val="24"/>
         </w:rPr>
-        <w:t>(signature:)</w:t>
+        <w:t>(</w:t>
+      </w:r>
+      <w:proofErr w:type="gramStart"/>
+      <w:r>
+        <w:rPr>
+          <w:rFonts w:cstheme="majorBidi"/>
+          <w:szCs w:val="24"/>
+        </w:rPr>
+        <w:t>signature</w:t>
+      </w:r>
+      <w:proofErr w:type="gramEnd"/>
+      <w:r>
+        <w:rPr>
+          <w:rFonts w:cstheme="majorBidi"/>
+          <w:szCs w:val="24"/>
+        </w:rPr>
+        <w:t>:)</w:t>
       </w:r>
       <w:r>
         <w:rPr>
@@ -721,14 +765,25 @@
         </w:rPr>
         <w:tab/>
       </w:r>
+      <w:proofErr w:type="gramStart"/>
       <w:r>
         <w:rPr>
           <w:rFonts w:cstheme="majorBidi"/>
           <w:szCs w:val="24"/>
           <w:u w:val="single"/>
         </w:rPr>
-        <w:t xml:space="preserve">M.N Sahla Baanu </w:t>
-      </w:r>
+        <w:t>M.N</w:t>
+      </w:r>
+      <w:proofErr w:type="gramEnd"/>
+      <w:r>
+        <w:rPr>
+          <w:rFonts w:cstheme="majorBidi"/>
+          <w:szCs w:val="24"/>
+          <w:u w:val="single"/>
+        </w:rPr>
+        <w:t xml:space="preserve"> Sahla Baanu </w:t>
+      </w:r>
+      <w:proofErr w:type="gramStart"/>
       <w:r>
         <w:rPr>
           <w:rFonts w:cstheme="majorBidi"/>
@@ -746,12 +801,21 @@
         </w:rPr>
         <w:tab/>
       </w:r>
+      <w:proofErr w:type="gramEnd"/>
       <w:r>
         <w:rPr>
           <w:rFonts w:cstheme="majorBidi"/>
           <w:szCs w:val="24"/>
         </w:rPr>
-        <w:t xml:space="preserve">Date: </w:t>
+        <w:t>Date</w:t>
+      </w:r>
+      <w:proofErr w:type="gramStart"/>
+      <w:r>
+        <w:rPr>
+          <w:rFonts w:cstheme="majorBidi"/>
+          <w:szCs w:val="24"/>
+        </w:rPr>
+        <w:t xml:space="preserve">: </w:t>
       </w:r>
       <w:r>
         <w:rPr>
@@ -783,7 +847,16 @@
           <w:szCs w:val="24"/>
           <w:u w:val="single"/>
         </w:rPr>
-        <w:t>30/06/2026</w:t>
+        <w:t>30</w:t>
+      </w:r>
+      <w:proofErr w:type="gramEnd"/>
+      <w:r>
+        <w:rPr>
+          <w:rFonts w:cstheme="majorBidi"/>
+          <w:szCs w:val="24"/>
+          <w:u w:val="single"/>
+        </w:rPr>
+        <w:t>/06/2026</w:t>
       </w:r>
       <w:r>
         <w:rPr>
@@ -1370,7 +1443,21 @@
         <w:rPr>
           <w:rFonts w:ascii="Times New Roman" w:hAnsi="Times New Roman"/>
         </w:rPr>
-        <w:t>The application is intended to help a small pharmacy handle routine work through one Windows desktop program instead of depending on paper records or scattered files. Two user types are supported: an admin who manages the pharmacy operation, and a customer who signs in to use the customer-facing side of the system. Both roles enter through the same login screen, but each user sees only the features relevant to that role.</w:t>
+        <w:t xml:space="preserve">The application is intended to help a small pharmacy </w:t>
+      </w:r>
+      <w:proofErr w:type="gramStart"/>
+      <w:r>
+        <w:rPr>
+          <w:rFonts w:ascii="Times New Roman" w:hAnsi="Times New Roman"/>
+        </w:rPr>
+        <w:t>handle</w:t>
+      </w:r>
+      <w:proofErr w:type="gramEnd"/>
+      <w:r>
+        <w:rPr>
+          <w:rFonts w:ascii="Times New Roman" w:hAnsi="Times New Roman"/>
+        </w:rPr>
+        <w:t xml:space="preserve"> routine work through one Windows desktop program instead of depending on paper records or scattered files. Two user types are supported: an admin who manages the pharmacy operation, and a customer who signs in to use the customer-facing side of the system. Both roles enter through the same login screen, but each user sees only the features relevant to that role.</w:t>
       </w:r>
     </w:p>
     <w:p>
@@ -1409,7 +1496,21 @@
         <w:rPr>
           <w:rFonts w:ascii="Times New Roman" w:hAnsi="Times New Roman"/>
         </w:rPr>
-        <w:t xml:space="preserve">The overall aim was to apply object-oriented programming in a practical desktop application that a pharmacy could realistically use. Key goals included reliable login for both roles, keeping stock and order information accurate, and giving the admin useful dashboard and report information without manual calculations. Another priority was to keep the code readable and well </w:t>
+        <w:t xml:space="preserve">The overall aim was to apply object-oriented programming in a practical desktop application that a pharmacy could realistically use. Key goals included reliable login for both roles, keeping stock and order information </w:t>
+      </w:r>
+      <w:proofErr w:type="gramStart"/>
+      <w:r>
+        <w:rPr>
+          <w:rFonts w:ascii="Times New Roman" w:hAnsi="Times New Roman"/>
+        </w:rPr>
+        <w:t>accurate</w:t>
+      </w:r>
+      <w:proofErr w:type="gramEnd"/>
+      <w:r>
+        <w:rPr>
+          <w:rFonts w:ascii="Times New Roman" w:hAnsi="Times New Roman"/>
+        </w:rPr>
+        <w:t xml:space="preserve">, and giving the admin useful dashboard and report information without manual calculations. Another priority was to keep the code readable and well </w:t>
       </w:r>
       <w:proofErr w:type="spellStart"/>
       <w:r>
@@ -1582,7 +1683,15 @@
         <w:spacing w:line="360" w:lineRule="auto"/>
       </w:pPr>
       <w:r>
-        <w:t>Track medicine expiry dates and receive notifications for medicines approaching expiry in order to ensure inventory safety and compliance.</w:t>
+        <w:t xml:space="preserve">Track medicine expiry dates and receive notifications for medicines approaching expiry </w:t>
+      </w:r>
+      <w:proofErr w:type="gramStart"/>
+      <w:r>
+        <w:t>in order to</w:t>
+      </w:r>
+      <w:proofErr w:type="gramEnd"/>
+      <w:r>
+        <w:t xml:space="preserve"> ensure inventory safety and compliance.</w:t>
       </w:r>
     </w:p>
     <w:p>
@@ -1617,7 +1726,23 @@
         <w:spacing w:line="360" w:lineRule="auto"/>
       </w:pPr>
       <w:r>
-        <w:t>Search and browse available medicines by name, category, or price range and view detailed medicine information before purchasing.</w:t>
+        <w:t xml:space="preserve">Search and browse available medicines by name, category, or price range and view detailed </w:t>
+      </w:r>
+      <w:proofErr w:type="gramStart"/>
+      <w:r>
+        <w:t>medicine</w:t>
+      </w:r>
+      <w:proofErr w:type="gramEnd"/>
+      <w:r>
+        <w:t xml:space="preserve"> information before </w:t>
+      </w:r>
+      <w:proofErr w:type="gramStart"/>
+      <w:r>
+        <w:t>purchasing</w:t>
+      </w:r>
+      <w:proofErr w:type="gramEnd"/>
+      <w:r>
+        <w:t>.</w:t>
       </w:r>
     </w:p>
     <w:p>
@@ -1644,7 +1769,15 @@
       </w:pPr>
       <w:r>
         <w:lastRenderedPageBreak/>
-        <w:t>Monitor previously placed orders and track their current status throughout the order processing lifecycle.</w:t>
+        <w:t xml:space="preserve">Monitor previously placed orders and track their </w:t>
+      </w:r>
+      <w:proofErr w:type="gramStart"/>
+      <w:r>
+        <w:t>current status</w:t>
+      </w:r>
+      <w:proofErr w:type="gramEnd"/>
+      <w:r>
+        <w:t xml:space="preserve"> throughout the order processing lifecycle.</w:t>
       </w:r>
     </w:p>
     <w:p>
@@ -1670,7 +1803,15 @@
         <w:spacing w:line="360" w:lineRule="auto"/>
       </w:pPr>
       <w:r>
-        <w:t>Upload prescription documents when purchasing medicines that require prescription verification.</w:t>
+        <w:t xml:space="preserve">Upload prescription documents when </w:t>
+      </w:r>
+      <w:proofErr w:type="gramStart"/>
+      <w:r>
+        <w:t>purchasing</w:t>
+      </w:r>
+      <w:proofErr w:type="gramEnd"/>
+      <w:r>
+        <w:t xml:space="preserve"> medicines that require prescription verification.</w:t>
       </w:r>
     </w:p>
     <w:p>
@@ -1719,7 +1860,15 @@
         <w:jc w:val="lowKashida"/>
       </w:pPr>
       <w:r>
-        <w:t>Low Stock Alert System - The system will automatically monitor medicine inventory levels and notify administrators when the stock quantity of a medicine falls below a predefined threshold. This helps prevent stock shortages and ensures the availability of essential medicines.</w:t>
+        <w:t xml:space="preserve">Low Stock Alert System - The system will automatically </w:t>
+      </w:r>
+      <w:proofErr w:type="gramStart"/>
+      <w:r>
+        <w:t>monitor</w:t>
+      </w:r>
+      <w:proofErr w:type="gramEnd"/>
+      <w:r>
+        <w:t xml:space="preserve"> medicine inventory levels and notify administrators when the stock quantity of a medicine falls below a predefined threshold. This helps prevent stock shortages and ensures the availability of essential medicines.</w:t>
       </w:r>
     </w:p>
     <w:p>
@@ -1733,7 +1882,15 @@
         <w:jc w:val="lowKashida"/>
       </w:pPr>
       <w:r>
-        <w:t>Medicine Expiry Warning Dashboard - The system will identify medicines approaching their expiry dates and display warning notifications on the administrator dashboard. This assists in inventory management and reduces the risk of dispensing expired medicines.</w:t>
+        <w:t xml:space="preserve">Medicine Expiry Warning Dashboard - The system will </w:t>
+      </w:r>
+      <w:proofErr w:type="gramStart"/>
+      <w:r>
+        <w:t>identify</w:t>
+      </w:r>
+      <w:proofErr w:type="gramEnd"/>
+      <w:r>
+        <w:t xml:space="preserve"> medicines approaching their expiry dates and display warning notifications on the administrator dashboard. This assists in inventory management and reduces the risk of dispensing expired medicines.</w:t>
       </w:r>
     </w:p>
     <w:p>
@@ -1747,7 +1904,15 @@
         <w:jc w:val="lowKashida"/>
       </w:pPr>
       <w:r>
-        <w:t>Prescription Verification System - The system will require customers to upload a valid prescription when ordering medicines marked as prescription-required. Orders containing prescription medicines cannot be processed unless the required prescription document has been uploaded and verified.</w:t>
+        <w:t xml:space="preserve">Prescription Verification System - The system will require customers to upload a valid prescription when ordering medicines marked as prescription-required. Orders </w:t>
+      </w:r>
+      <w:proofErr w:type="gramStart"/>
+      <w:r>
+        <w:t>containing</w:t>
+      </w:r>
+      <w:proofErr w:type="gramEnd"/>
+      <w:r>
+        <w:t xml:space="preserve"> prescription medicines cannot be processed unless the required prescription document has been uploaded and verified.</w:t>
       </w:r>
     </w:p>
     <w:p>
@@ -1775,7 +1940,15 @@
         <w:jc w:val="lowKashida"/>
       </w:pPr>
       <w:r>
-        <w:t>Order Cancellation - The system will allow customers to cancel orders that are still in the Pending status. Once an order has been processed or marked as Ready for Pickup, cancellation will no longer be permitted.</w:t>
+        <w:t xml:space="preserve">Order Cancellation - The system will allow customers to cancel orders that are still in the Pending status. Once an order has been processed or marked as Ready for Pickup, cancellation will no longer be </w:t>
+      </w:r>
+      <w:proofErr w:type="gramStart"/>
+      <w:r>
+        <w:t>permitted</w:t>
+      </w:r>
+      <w:proofErr w:type="gramEnd"/>
+      <w:r>
+        <w:t>.</w:t>
       </w:r>
     </w:p>
     <w:p>
@@ -1804,7 +1977,15 @@
         <w:t>-</w:t>
       </w:r>
       <w:r>
-        <w:t xml:space="preserve"> The system shall provide an intuitive and user-friendly interface with role-based navigation, allowing administrators and customers to easily access their respective functionalities through clearly organized forms and menus.</w:t>
+        <w:t xml:space="preserve"> The system </w:t>
+      </w:r>
+      <w:proofErr w:type="gramStart"/>
+      <w:r>
+        <w:t>shall</w:t>
+      </w:r>
+      <w:proofErr w:type="gramEnd"/>
+      <w:r>
+        <w:t xml:space="preserve"> provide an intuitive and user-friendly interface with role-based navigation, allowing administrators and customers to easily access their respective functionalities through clearly organized forms and menus.</w:t>
       </w:r>
     </w:p>
     <w:p>
@@ -1823,7 +2004,23 @@
         <w:t>-</w:t>
       </w:r>
       <w:r>
-        <w:t xml:space="preserve"> The system shall validate user inputs before processing and use parameterized SQL queries to ensure accurate data handling and prevent database-related errors.</w:t>
+        <w:t xml:space="preserve"> The system shall </w:t>
+      </w:r>
+      <w:proofErr w:type="gramStart"/>
+      <w:r>
+        <w:t>validate</w:t>
+      </w:r>
+      <w:proofErr w:type="gramEnd"/>
+      <w:r>
+        <w:t xml:space="preserve"> user inputs before processing and use parameterized SQL queries to ensure </w:t>
+      </w:r>
+      <w:proofErr w:type="gramStart"/>
+      <w:r>
+        <w:t>accurate</w:t>
+      </w:r>
+      <w:proofErr w:type="gramEnd"/>
+      <w:r>
+        <w:t xml:space="preserve"> data handling and prevent database-related errors.</w:t>
       </w:r>
     </w:p>
     <w:p>
@@ -1861,7 +2058,23 @@
         <w:t>-</w:t>
       </w:r>
       <w:r>
-        <w:t xml:space="preserve"> The system shall provide responsive operation for medicine searches, order processing, and report generation, with search and filtering functionality optimized for typical pharmacy inventory sizes.</w:t>
+        <w:t xml:space="preserve"> The system shall provide responsive operation for </w:t>
+      </w:r>
+      <w:proofErr w:type="gramStart"/>
+      <w:r>
+        <w:t>medicine searches</w:t>
+      </w:r>
+      <w:proofErr w:type="gramEnd"/>
+      <w:r>
+        <w:t xml:space="preserve">, order processing, and report generation, with search and filtering functionality </w:t>
+      </w:r>
+      <w:proofErr w:type="gramStart"/>
+      <w:r>
+        <w:t>optimized</w:t>
+      </w:r>
+      <w:proofErr w:type="gramEnd"/>
+      <w:r>
+        <w:t xml:space="preserve"> for typical pharmacy inventory sizes.</w:t>
       </w:r>
     </w:p>
     <w:p>
@@ -1880,7 +2093,15 @@
         <w:t>-</w:t>
       </w:r>
       <w:r>
-        <w:t xml:space="preserve"> The system shall authenticate users through secure login mechanisms, restrict access based on user roles, and maintain session information for authenticated users.</w:t>
+        <w:t xml:space="preserve"> The system shall authenticate users through secure login mechanisms, restrict access based on user roles, and </w:t>
+      </w:r>
+      <w:proofErr w:type="gramStart"/>
+      <w:r>
+        <w:t>maintain</w:t>
+      </w:r>
+      <w:proofErr w:type="gramEnd"/>
+      <w:r>
+        <w:t xml:space="preserve"> session information for authenticated users.</w:t>
       </w:r>
     </w:p>
     <w:p>
@@ -1918,7 +2139,15 @@
         <w:t>-</w:t>
       </w:r>
       <w:r>
-        <w:t xml:space="preserve"> The system shall support future enhancements such as additional user roles, advanced reporting features, and expanded inventory management without major architectural changes.</w:t>
+        <w:t xml:space="preserve"> The system shall support future enhancements such as </w:t>
+      </w:r>
+      <w:proofErr w:type="gramStart"/>
+      <w:r>
+        <w:t>additional</w:t>
+      </w:r>
+      <w:proofErr w:type="gramEnd"/>
+      <w:r>
+        <w:t xml:space="preserve"> user roles, advanced reporting features, and expanded inventory management without major architectural changes.</w:t>
       </w:r>
     </w:p>
     <w:p>
@@ -1937,7 +2166,23 @@
         <w:t>-</w:t>
       </w:r>
       <w:r>
-        <w:t xml:space="preserve"> The system shall maintain consistent and accurate data through validation rules, database constraints, and controlled update operations.</w:t>
+        <w:t xml:space="preserve"> The system shall </w:t>
+      </w:r>
+      <w:proofErr w:type="gramStart"/>
+      <w:r>
+        <w:t>maintain</w:t>
+      </w:r>
+      <w:proofErr w:type="gramEnd"/>
+      <w:r>
+        <w:t xml:space="preserve"> consistent and </w:t>
+      </w:r>
+      <w:proofErr w:type="gramStart"/>
+      <w:r>
+        <w:t>accurate</w:t>
+      </w:r>
+      <w:proofErr w:type="gramEnd"/>
+      <w:r>
+        <w:t xml:space="preserve"> data through validation rules, database constraints, and controlled update operations.</w:t>
       </w:r>
     </w:p>
     <w:p>
@@ -2296,12 +2541,25 @@
       <w:pPr>
         <w:spacing w:line="360" w:lineRule="auto"/>
       </w:pPr>
-      <w:r>
-        <w:t xml:space="preserve">The use case model captures what each actor is allowed to do in the system from an external viewpoint, without going into screen layout or code structure. It was useful during requirements analysis to confirm that both admin and customer journeys were covered and to highlight </w:t>
+      <w:proofErr w:type="gramStart"/>
+      <w:r>
+        <w:t>The use</w:t>
+      </w:r>
+      <w:proofErr w:type="gramEnd"/>
+      <w:r>
+        <w:t xml:space="preserve"> case model captures what each actor is allowed to do in the system from an external viewpoint, without going into screen layout or code structure. It was useful during requirements analysis to confirm that both admin and customer journeys were covered and to highlight </w:t>
       </w:r>
       <w:r>
         <w:lastRenderedPageBreak/>
-        <w:t>relationships such as searching before placing an order. The diagram acts as a checklist against which implemented forms and services can be reviewed.</w:t>
+        <w:t xml:space="preserve">relationships such as </w:t>
+      </w:r>
+      <w:proofErr w:type="gramStart"/>
+      <w:r>
+        <w:t>searching</w:t>
+      </w:r>
+      <w:proofErr w:type="gramEnd"/>
+      <w:r>
+        <w:t xml:space="preserve"> before placing an order. The diagram acts as a checklist against which implemented forms and services can be reviewed.</w:t>
       </w:r>
     </w:p>
     <w:p>
@@ -2317,13 +2575,61 @@
       <w:pPr>
         <w:spacing w:line="360" w:lineRule="auto"/>
       </w:pPr>
+      <w:r>
+        <w:rPr>
+          <w:noProof/>
+        </w:rPr>
+        <w:drawing>
+          <wp:inline distT="0" distB="0" distL="0" distR="0" wp14:anchorId="3C0D4A5D" wp14:editId="49FDAB2C">
+            <wp:extent cx="5943600" cy="4427855"/>
+            <wp:effectExtent l="0" t="0" r="0" b="0"/>
+            <wp:docPr id="1641290360" name="Picture 2"/>
+            <wp:cNvGraphicFramePr>
+              <a:graphicFrameLocks xmlns:a="http://schemas.openxmlformats.org/drawingml/2006/main" noChangeAspect="1"/>
+            </wp:cNvGraphicFramePr>
+            <a:graphic xmlns:a="http://schemas.openxmlformats.org/drawingml/2006/main">
+              <a:graphicData uri="http://schemas.openxmlformats.org/drawingml/2006/picture">
+                <pic:pic xmlns:pic="http://schemas.openxmlformats.org/drawingml/2006/picture">
+                  <pic:nvPicPr>
+                    <pic:cNvPr id="1641290360" name="Picture 1641290360"/>
+                    <pic:cNvPicPr/>
+                  </pic:nvPicPr>
+                  <pic:blipFill>
+                    <a:blip r:embed="rId12"/>
+                    <a:stretch>
+                      <a:fillRect/>
+                    </a:stretch>
+                  </pic:blipFill>
+                  <pic:spPr>
+                    <a:xfrm>
+                      <a:off x="0" y="0"/>
+                      <a:ext cx="5943600" cy="4427855"/>
+                    </a:xfrm>
+                    <a:prstGeom prst="rect">
+                      <a:avLst/>
+                    </a:prstGeom>
+                  </pic:spPr>
+                </pic:pic>
+              </a:graphicData>
+            </a:graphic>
+          </wp:inline>
+        </w:drawing>
+      </w:r>
     </w:p>
     <w:p>
       <w:pPr>
         <w:spacing w:line="360" w:lineRule="auto"/>
       </w:pPr>
       <w:r>
-        <w:t>An entity–relationship model was drawn to decide how pharmacy data should be stored and linked before writing the SQL script. It clarifies which records depend on others so that foreign keys and integrity rules in the database are consistent with real business rules. This reduced the risk of designing tables that could not support reporting or order history later.</w:t>
+        <w:t xml:space="preserve">An entity–relationship model was drawn to decide how pharmacy data should be stored and linked before writing the SQL script. It clarifies which records depend on others so that foreign keys and integrity rules in the database are consistent with </w:t>
+      </w:r>
+      <w:proofErr w:type="gramStart"/>
+      <w:r>
+        <w:t>real business</w:t>
+      </w:r>
+      <w:proofErr w:type="gramEnd"/>
+      <w:r>
+        <w:t xml:space="preserve"> rules. This reduced the risk of designing tables that could not support reporting or order history later.</w:t>
       </w:r>
     </w:p>
     <w:p>
@@ -2332,6 +2638,7 @@
         <w:spacing w:line="360" w:lineRule="auto"/>
       </w:pPr>
       <w:r>
+        <w:lastRenderedPageBreak/>
         <w:t>Class Diagram</w:t>
       </w:r>
     </w:p>
@@ -2361,7 +2668,7 @@
                     </pic:cNvPicPr>
                   </pic:nvPicPr>
                   <pic:blipFill>
-                    <a:blip r:embed="rId12">
+                    <a:blip r:embed="rId13">
                       <a:extLst>
                         <a:ext uri="{28A0092B-C50C-407E-A947-70E740481C1C}">
                           <a14:useLocalDpi xmlns:a14="http://schemas.microsoft.com/office/drawing/2010/main" val="0"/>
@@ -2461,7 +2768,7 @@
                     </pic:cNvPicPr>
                   </pic:nvPicPr>
                   <pic:blipFill>
-                    <a:blip r:embed="rId13">
+                    <a:blip r:embed="rId14">
                       <a:extLst>
                         <a:ext uri="{28A0092B-C50C-407E-A947-70E740481C1C}">
                           <a14:useLocalDpi xmlns:a14="http://schemas.microsoft.com/office/drawing/2010/main" val="0"/>
@@ -2514,7 +2821,7 @@
                     </pic:cNvPicPr>
                   </pic:nvPicPr>
                   <pic:blipFill>
-                    <a:blip r:embed="rId14">
+                    <a:blip r:embed="rId15">
                       <a:extLst>
                         <a:ext uri="{28A0092B-C50C-407E-A947-70E740481C1C}">
                           <a14:useLocalDpi xmlns:a14="http://schemas.microsoft.com/office/drawing/2010/main" val="0"/>
@@ -2552,7 +2859,15 @@
       </w:pPr>
       <w:r>
         <w:lastRenderedPageBreak/>
-        <w:t>Sequence diagrams were included to show the order of interactions between the user interface, application services, repositories, and the database for important scenarios such as registration, order handling, and reporting. They are especially helpful where some forms call a service layer and others talk to repositories directly, because the message flow can be compared to the actual implementation. Together, the three sequences illustrate typical paths through the system at runtime.</w:t>
+        <w:t xml:space="preserve">Sequence diagrams were included to show the order of interactions between the user interface, application services, repositories, and the database for important scenarios such as registration, order handling, and reporting. They are especially helpful where </w:t>
+      </w:r>
+      <w:proofErr w:type="gramStart"/>
+      <w:r>
+        <w:t>some</w:t>
+      </w:r>
+      <w:proofErr w:type="gramEnd"/>
+      <w:r>
+        <w:t xml:space="preserve"> forms call a service layer and others talk to repositories directly, because the message flow can be compared to the actual implementation. Together, the three sequences illustrate typical paths through the system at runtime.</w:t>
       </w:r>
     </w:p>
     <w:p>
@@ -2602,7 +2917,7 @@
                     <pic:cNvPicPr/>
                   </pic:nvPicPr>
                   <pic:blipFill rotWithShape="1">
-                    <a:blip r:embed="rId15"/>
+                    <a:blip r:embed="rId16"/>
                     <a:srcRect l="8479" t="12755" r="8475" b="13408"/>
                     <a:stretch>
                       <a:fillRect/>
@@ -2666,7 +2981,7 @@
                     <pic:cNvPicPr/>
                   </pic:nvPicPr>
                   <pic:blipFill rotWithShape="1">
-                    <a:blip r:embed="rId16"/>
+                    <a:blip r:embed="rId17"/>
                     <a:srcRect l="8929" t="10036" r="8363" b="9910"/>
                     <a:stretch>
                       <a:fillRect/>
@@ -2699,7 +3014,23 @@
     <w:p>
       <w:r>
         <w:lastRenderedPageBreak/>
-        <w:t>The Admin class extends User and represents pharmacy staff who manage system operations. It supports administrative tasks such as inventory control, customer management, order processing, and report generation.</w:t>
+        <w:t>The </w:t>
+      </w:r>
+      <w:proofErr w:type="gramStart"/>
+      <w:r>
+        <w:t>Admin</w:t>
+      </w:r>
+      <w:proofErr w:type="gramEnd"/>
+      <w:r>
+        <w:t xml:space="preserve"> class extends User and </w:t>
+      </w:r>
+      <w:proofErr w:type="gramStart"/>
+      <w:r>
+        <w:t>represents</w:t>
+      </w:r>
+      <w:proofErr w:type="gramEnd"/>
+      <w:r>
+        <w:t xml:space="preserve"> pharmacy staff who manage system operations. It supports administrative tasks such as inventory control, customer management, order processing, and report generation.</w:t>
       </w:r>
     </w:p>
     <w:p>
@@ -2731,7 +3062,7 @@
                     <pic:cNvPicPr/>
                   </pic:nvPicPr>
                   <pic:blipFill rotWithShape="1">
-                    <a:blip r:embed="rId17"/>
+                    <a:blip r:embed="rId18"/>
                     <a:srcRect l="8463" t="9975" r="8718" b="9650"/>
                     <a:stretch>
                       <a:fillRect/>
@@ -2763,7 +3094,15 @@
     </w:p>
     <w:p>
       <w:r>
-        <w:t>The Customer class extends User and represents pharmacy clients who register, place orders, and manage their profile. It models the customer role and supports customer-related use cases in the system.</w:t>
+        <w:t xml:space="preserve">The Customer class extends User and </w:t>
+      </w:r>
+      <w:proofErr w:type="gramStart"/>
+      <w:r>
+        <w:t>represents</w:t>
+      </w:r>
+      <w:proofErr w:type="gramEnd"/>
+      <w:r>
+        <w:t xml:space="preserve"> pharmacy clients who register, place orders, and manage their profile. It models the customer role and supports customer-related use cases in the system.</w:t>
       </w:r>
     </w:p>
     <w:p>
@@ -2809,7 +3148,7 @@
                     <pic:cNvPicPr/>
                   </pic:nvPicPr>
                   <pic:blipFill rotWithShape="1">
-                    <a:blip r:embed="rId18"/>
+                    <a:blip r:embed="rId19"/>
                     <a:srcRect l="6325" t="8803" r="6753" b="8816"/>
                     <a:stretch>
                       <a:fillRect/>
@@ -2842,7 +3181,15 @@
     <w:p>
       <w:r>
         <w:lastRenderedPageBreak/>
-        <w:t>The Order class represents a complete customer purchase in the system. It stores transaction-level information and supports order tracking, status updates, and administrative reporting.</w:t>
+        <w:t xml:space="preserve">The Order class </w:t>
+      </w:r>
+      <w:proofErr w:type="gramStart"/>
+      <w:r>
+        <w:t>represents</w:t>
+      </w:r>
+      <w:proofErr w:type="gramEnd"/>
+      <w:r>
+        <w:t xml:space="preserve"> a complete customer purchase in the system. It stores transaction-level information and supports order tracking, status updates, and administrative reporting.</w:t>
       </w:r>
     </w:p>
     <w:p>
@@ -2874,7 +3221,7 @@
                     <pic:cNvPicPr/>
                   </pic:nvPicPr>
                   <pic:blipFill rotWithShape="1">
-                    <a:blip r:embed="rId19"/>
+                    <a:blip r:embed="rId20"/>
                     <a:srcRect l="6068" t="10180" r="6154" b="10164"/>
                     <a:stretch>
                       <a:fillRect/>
@@ -2906,7 +3253,23 @@
     </w:p>
     <w:p>
       <w:r>
-        <w:t>The OrderItem class represents a single medicine line within an order. It maintains the link between an order and its medicines and records quantity and pricing details at the time of purchase.</w:t>
+        <w:t xml:space="preserve">The OrderItem class </w:t>
+      </w:r>
+      <w:proofErr w:type="gramStart"/>
+      <w:r>
+        <w:t>represents</w:t>
+      </w:r>
+      <w:proofErr w:type="gramEnd"/>
+      <w:r>
+        <w:t xml:space="preserve"> a single medicine line within an order. It </w:t>
+      </w:r>
+      <w:proofErr w:type="gramStart"/>
+      <w:r>
+        <w:t>maintains</w:t>
+      </w:r>
+      <w:proofErr w:type="gramEnd"/>
+      <w:r>
+        <w:t xml:space="preserve"> the link between an order and its medicines and records quantity and pricing details at the time of purchase.</w:t>
       </w:r>
     </w:p>
     <w:p>
@@ -2938,7 +3301,7 @@
                     <pic:cNvPicPr/>
                   </pic:nvPicPr>
                   <pic:blipFill rotWithShape="1">
-                    <a:blip r:embed="rId20"/>
+                    <a:blip r:embed="rId21"/>
                     <a:srcRect l="7877" t="10250" r="8873" b="10641"/>
                     <a:stretch>
                       <a:fillRect/>
@@ -2970,7 +3333,31 @@
     </w:p>
     <w:p>
       <w:r>
-        <w:t>The Prescription class handles prescription documents submitted by customers for restricted medicines. It supports future prescription verification features required for controlled medicine dispensing.</w:t>
+        <w:t xml:space="preserve">The Prescription class </w:t>
+      </w:r>
+      <w:proofErr w:type="gramStart"/>
+      <w:r>
+        <w:t>handles</w:t>
+      </w:r>
+      <w:proofErr w:type="gramEnd"/>
+      <w:r>
+        <w:t xml:space="preserve"> prescription documents </w:t>
+      </w:r>
+      <w:proofErr w:type="gramStart"/>
+      <w:r>
+        <w:t>submitted</w:t>
+      </w:r>
+      <w:proofErr w:type="gramEnd"/>
+      <w:r>
+        <w:t xml:space="preserve"> by customers for restricted medicines. It supports future prescription verification features </w:t>
+      </w:r>
+      <w:proofErr w:type="gramStart"/>
+      <w:r>
+        <w:t>required</w:t>
+      </w:r>
+      <w:proofErr w:type="gramEnd"/>
+      <w:r>
+        <w:t xml:space="preserve"> for controlled medicine dispensing.</w:t>
       </w:r>
     </w:p>
     <w:p>

</xml_diff>